<commit_message>
Update notatki do wzorców architektonicznych
</commit_message>
<xml_diff>
--- a/Doc/Przykładowe rozwiązania architektoniczne na customowym silniku gry.docx
+++ b/Doc/Przykładowe rozwiązania architektoniczne na customowym silniku gry.docx
@@ -5,8 +5,13 @@
     <w:sdt>
       <w:sdtPr>
         <w:rPr>
+          <w:rFonts w:asciiTheme="minorHAnsi" w:eastAsiaTheme="minorHAnsi" w:hAnsiTheme="minorHAnsi" w:cstheme="minorBidi"/>
+          <w:color w:val="auto"/>
+          <w:kern w:val="2"/>
           <w:sz w:val="24"/>
           <w:szCs w:val="24"/>
+          <w:lang w:eastAsia="en-US"/>
+          <w14:ligatures w14:val="standardContextual"/>
         </w:rPr>
         <w:id w:val="1194346024"/>
         <w:docPartObj>
@@ -16,20 +21,15 @@
       </w:sdtPr>
       <w:sdtEndPr>
         <w:rPr>
-          <w:rFonts w:asciiTheme="minorHAnsi" w:eastAsiaTheme="minorHAnsi" w:hAnsiTheme="minorHAnsi" w:cstheme="minorBidi"/>
-          <w:b/>
-          <w:bCs/>
-          <w:color w:val="auto"/>
-          <w:kern w:val="2"/>
-          <w:lang w:eastAsia="en-US"/>
-          <w14:ligatures w14:val="standardContextual"/>
+          <w:b/>
+          <w:bCs/>
         </w:rPr>
       </w:sdtEndPr>
       <w:sdtContent>
         <w:p>
           <w:pPr>
             <w:pStyle w:val="Nagwekspisutreci"/>
-            <w:spacing w:line="360" w:lineRule="auto"/>
+            <w:spacing w:line="240" w:lineRule="auto"/>
             <w:jc w:val="center"/>
             <w:rPr>
               <w:rStyle w:val="TytuZnak"/>
@@ -45,6 +45,7 @@
         <w:p>
           <w:pPr>
             <w:pStyle w:val="Spistreci1"/>
+            <w:spacing w:line="240" w:lineRule="auto"/>
             <w:rPr>
               <w:rFonts w:eastAsiaTheme="minorEastAsia"/>
               <w:b w:val="0"/>
@@ -75,7 +76,7 @@
             </w:rPr>
             <w:fldChar w:fldCharType="separate"/>
           </w:r>
-          <w:hyperlink w:anchor="_Toc235568937" w:history="1">
+          <w:hyperlink w:anchor="_Toc235829271" w:history="1">
             <w:r>
               <w:rPr>
                 <w:rStyle w:val="Hipercze"/>
@@ -98,7 +99,7 @@
               <w:rPr>
                 <w:webHidden/>
               </w:rPr>
-              <w:instrText xml:space="preserve"> PAGEREF _Toc235568937 \h </w:instrText>
+              <w:instrText xml:space="preserve"> PAGEREF _Toc235829271 \h </w:instrText>
             </w:r>
             <w:r>
               <w:rPr>
@@ -115,7 +116,7 @@
               <w:rPr>
                 <w:webHidden/>
               </w:rPr>
-              <w:t>2</w:t>
+              <w:t>3</w:t>
             </w:r>
             <w:r>
               <w:rPr>
@@ -131,13 +132,14 @@
             <w:tabs>
               <w:tab w:val="right" w:leader="dot" w:pos="9062"/>
             </w:tabs>
+            <w:spacing w:line="240" w:lineRule="auto"/>
             <w:rPr>
               <w:rFonts w:eastAsiaTheme="minorEastAsia"/>
               <w:noProof/>
               <w:lang w:eastAsia="pl-PL"/>
             </w:rPr>
           </w:pPr>
-          <w:hyperlink w:anchor="_Toc235568938" w:history="1">
+          <w:hyperlink w:anchor="_Toc235829272" w:history="1">
             <w:r>
               <w:rPr>
                 <w:rStyle w:val="Hipercze"/>
@@ -164,7 +166,7 @@
                 <w:noProof/>
                 <w:webHidden/>
               </w:rPr>
-              <w:instrText xml:space="preserve"> PAGEREF _Toc235568938 \h </w:instrText>
+              <w:instrText xml:space="preserve"> PAGEREF _Toc235829272 \h </w:instrText>
             </w:r>
             <w:r>
               <w:rPr>
@@ -184,7 +186,7 @@
                 <w:noProof/>
                 <w:webHidden/>
               </w:rPr>
-              <w:t>2</w:t>
+              <w:t>3</w:t>
             </w:r>
             <w:r>
               <w:rPr>
@@ -201,13 +203,14 @@
             <w:tabs>
               <w:tab w:val="right" w:leader="dot" w:pos="9062"/>
             </w:tabs>
+            <w:spacing w:line="240" w:lineRule="auto"/>
             <w:rPr>
               <w:rFonts w:eastAsiaTheme="minorEastAsia"/>
               <w:noProof/>
               <w:lang w:eastAsia="pl-PL"/>
             </w:rPr>
           </w:pPr>
-          <w:hyperlink w:anchor="_Toc235568939" w:history="1">
+          <w:hyperlink w:anchor="_Toc235829273" w:history="1">
             <w:r>
               <w:rPr>
                 <w:rStyle w:val="Hipercze"/>
@@ -234,7 +237,7 @@
                 <w:noProof/>
                 <w:webHidden/>
               </w:rPr>
-              <w:instrText xml:space="preserve"> PAGEREF _Toc235568939 \h </w:instrText>
+              <w:instrText xml:space="preserve"> PAGEREF _Toc235829273 \h </w:instrText>
             </w:r>
             <w:r>
               <w:rPr>
@@ -254,7 +257,7 @@
                 <w:noProof/>
                 <w:webHidden/>
               </w:rPr>
-              <w:t>2</w:t>
+              <w:t>3</w:t>
             </w:r>
             <w:r>
               <w:rPr>
@@ -271,13 +274,14 @@
             <w:tabs>
               <w:tab w:val="right" w:leader="dot" w:pos="9062"/>
             </w:tabs>
+            <w:spacing w:line="240" w:lineRule="auto"/>
             <w:rPr>
               <w:rFonts w:eastAsiaTheme="minorEastAsia"/>
               <w:noProof/>
               <w:lang w:eastAsia="pl-PL"/>
             </w:rPr>
           </w:pPr>
-          <w:hyperlink w:anchor="_Toc235568940" w:history="1">
+          <w:hyperlink w:anchor="_Toc235829274" w:history="1">
             <w:r>
               <w:rPr>
                 <w:rStyle w:val="Hipercze"/>
@@ -304,7 +308,7 @@
                 <w:noProof/>
                 <w:webHidden/>
               </w:rPr>
-              <w:instrText xml:space="preserve"> PAGEREF _Toc235568940 \h </w:instrText>
+              <w:instrText xml:space="preserve"> PAGEREF _Toc235829274 \h </w:instrText>
             </w:r>
             <w:r>
               <w:rPr>
@@ -324,7 +328,7 @@
                 <w:noProof/>
                 <w:webHidden/>
               </w:rPr>
-              <w:t>3</w:t>
+              <w:t>4</w:t>
             </w:r>
             <w:r>
               <w:rPr>
@@ -341,13 +345,14 @@
             <w:tabs>
               <w:tab w:val="right" w:leader="dot" w:pos="9062"/>
             </w:tabs>
+            <w:spacing w:line="240" w:lineRule="auto"/>
             <w:rPr>
               <w:rFonts w:eastAsiaTheme="minorEastAsia"/>
               <w:noProof/>
               <w:lang w:eastAsia="pl-PL"/>
             </w:rPr>
           </w:pPr>
-          <w:hyperlink w:anchor="_Toc235568941" w:history="1">
+          <w:hyperlink w:anchor="_Toc235829275" w:history="1">
             <w:r>
               <w:rPr>
                 <w:rStyle w:val="Hipercze"/>
@@ -374,7 +379,7 @@
                 <w:noProof/>
                 <w:webHidden/>
               </w:rPr>
-              <w:instrText xml:space="preserve"> PAGEREF _Toc235568941 \h </w:instrText>
+              <w:instrText xml:space="preserve"> PAGEREF _Toc235829275 \h </w:instrText>
             </w:r>
             <w:r>
               <w:rPr>
@@ -394,7 +399,7 @@
                 <w:noProof/>
                 <w:webHidden/>
               </w:rPr>
-              <w:t>3</w:t>
+              <w:t>4</w:t>
             </w:r>
             <w:r>
               <w:rPr>
@@ -408,6 +413,7 @@
         <w:p>
           <w:pPr>
             <w:pStyle w:val="Spistreci1"/>
+            <w:spacing w:line="240" w:lineRule="auto"/>
             <w:rPr>
               <w:rFonts w:eastAsiaTheme="minorEastAsia"/>
               <w:b w:val="0"/>
@@ -417,7 +423,7 @@
               <w:lang w:eastAsia="pl-PL"/>
             </w:rPr>
           </w:pPr>
-          <w:hyperlink w:anchor="_Toc235568942" w:history="1">
+          <w:hyperlink w:anchor="_Toc235829276" w:history="1">
             <w:r>
               <w:rPr>
                 <w:rStyle w:val="Hipercze"/>
@@ -440,7 +446,7 @@
               <w:rPr>
                 <w:webHidden/>
               </w:rPr>
-              <w:instrText xml:space="preserve"> PAGEREF _Toc235568942 \h </w:instrText>
+              <w:instrText xml:space="preserve"> PAGEREF _Toc235829276 \h </w:instrText>
             </w:r>
             <w:r>
               <w:rPr>
@@ -457,7 +463,7 @@
               <w:rPr>
                 <w:webHidden/>
               </w:rPr>
-              <w:t>4</w:t>
+              <w:t>5</w:t>
             </w:r>
             <w:r>
               <w:rPr>
@@ -473,19 +479,20 @@
             <w:tabs>
               <w:tab w:val="right" w:leader="dot" w:pos="9062"/>
             </w:tabs>
+            <w:spacing w:line="240" w:lineRule="auto"/>
             <w:rPr>
               <w:rFonts w:eastAsiaTheme="minorEastAsia"/>
               <w:noProof/>
               <w:lang w:eastAsia="pl-PL"/>
             </w:rPr>
           </w:pPr>
-          <w:hyperlink w:anchor="_Toc235568943" w:history="1">
+          <w:hyperlink w:anchor="_Toc235829277" w:history="1">
             <w:r>
               <w:rPr>
                 <w:rStyle w:val="Hipercze"/>
                 <w:noProof/>
               </w:rPr>
-              <w:t>Rdzeń silnika i renderowania (OpenGL + WGL)</w:t>
+              <w:t>Rdzeń silnika i renderowanie (OpenGL + WGL)</w:t>
             </w:r>
             <w:r>
               <w:rPr>
@@ -506,7 +513,7 @@
                 <w:noProof/>
                 <w:webHidden/>
               </w:rPr>
-              <w:instrText xml:space="preserve"> PAGEREF _Toc235568943 \h </w:instrText>
+              <w:instrText xml:space="preserve"> PAGEREF _Toc235829277 \h </w:instrText>
             </w:r>
             <w:r>
               <w:rPr>
@@ -526,7 +533,7 @@
                 <w:noProof/>
                 <w:webHidden/>
               </w:rPr>
-              <w:t>4</w:t>
+              <w:t>5</w:t>
             </w:r>
             <w:r>
               <w:rPr>
@@ -543,13 +550,14 @@
             <w:tabs>
               <w:tab w:val="right" w:leader="dot" w:pos="9062"/>
             </w:tabs>
+            <w:spacing w:line="240" w:lineRule="auto"/>
             <w:rPr>
               <w:rFonts w:eastAsiaTheme="minorEastAsia"/>
               <w:noProof/>
               <w:lang w:eastAsia="pl-PL"/>
             </w:rPr>
           </w:pPr>
-          <w:hyperlink w:anchor="_Toc235568944" w:history="1">
+          <w:hyperlink w:anchor="_Toc235829278" w:history="1">
             <w:r>
               <w:rPr>
                 <w:rStyle w:val="Hipercze"/>
@@ -576,7 +584,7 @@
                 <w:noProof/>
                 <w:webHidden/>
               </w:rPr>
-              <w:instrText xml:space="preserve"> PAGEREF _Toc235568944 \h </w:instrText>
+              <w:instrText xml:space="preserve"> PAGEREF _Toc235829278 \h </w:instrText>
             </w:r>
             <w:r>
               <w:rPr>
@@ -596,7 +604,7 @@
                 <w:noProof/>
                 <w:webHidden/>
               </w:rPr>
-              <w:t>4</w:t>
+              <w:t>5</w:t>
             </w:r>
             <w:r>
               <w:rPr>
@@ -613,13 +621,14 @@
             <w:tabs>
               <w:tab w:val="right" w:leader="dot" w:pos="9062"/>
             </w:tabs>
+            <w:spacing w:line="240" w:lineRule="auto"/>
             <w:rPr>
               <w:rFonts w:eastAsiaTheme="minorEastAsia"/>
               <w:noProof/>
               <w:lang w:eastAsia="pl-PL"/>
             </w:rPr>
           </w:pPr>
-          <w:hyperlink w:anchor="_Toc235568945" w:history="1">
+          <w:hyperlink w:anchor="_Toc235829279" w:history="1">
             <w:r>
               <w:rPr>
                 <w:rStyle w:val="Hipercze"/>
@@ -667,7 +676,7 @@
                 <w:noProof/>
                 <w:webHidden/>
               </w:rPr>
-              <w:instrText xml:space="preserve"> PAGEREF _Toc235568945 \h </w:instrText>
+              <w:instrText xml:space="preserve"> PAGEREF _Toc235829279 \h </w:instrText>
             </w:r>
             <w:r>
               <w:rPr>
@@ -687,7 +696,7 @@
                 <w:noProof/>
                 <w:webHidden/>
               </w:rPr>
-              <w:t>5</w:t>
+              <w:t>6</w:t>
             </w:r>
             <w:r>
               <w:rPr>
@@ -704,13 +713,14 @@
             <w:tabs>
               <w:tab w:val="right" w:leader="dot" w:pos="9062"/>
             </w:tabs>
+            <w:spacing w:line="240" w:lineRule="auto"/>
             <w:rPr>
               <w:rFonts w:eastAsiaTheme="minorEastAsia"/>
               <w:noProof/>
               <w:lang w:eastAsia="pl-PL"/>
             </w:rPr>
           </w:pPr>
-          <w:hyperlink w:anchor="_Toc235568946" w:history="1">
+          <w:hyperlink w:anchor="_Toc235829280" w:history="1">
             <w:r>
               <w:rPr>
                 <w:rStyle w:val="Hipercze"/>
@@ -737,7 +747,7 @@
                 <w:noProof/>
                 <w:webHidden/>
               </w:rPr>
-              <w:instrText xml:space="preserve"> PAGEREF _Toc235568946 \h </w:instrText>
+              <w:instrText xml:space="preserve"> PAGEREF _Toc235829280 \h </w:instrText>
             </w:r>
             <w:r>
               <w:rPr>
@@ -757,7 +767,7 @@
                 <w:noProof/>
                 <w:webHidden/>
               </w:rPr>
-              <w:t>5</w:t>
+              <w:t>6</w:t>
             </w:r>
             <w:r>
               <w:rPr>
@@ -771,6 +781,7 @@
         <w:p>
           <w:pPr>
             <w:pStyle w:val="Spistreci1"/>
+            <w:spacing w:line="240" w:lineRule="auto"/>
             <w:rPr>
               <w:rFonts w:eastAsiaTheme="minorEastAsia"/>
               <w:b w:val="0"/>
@@ -780,7 +791,7 @@
               <w:lang w:eastAsia="pl-PL"/>
             </w:rPr>
           </w:pPr>
-          <w:hyperlink w:anchor="_Toc235568947" w:history="1">
+          <w:hyperlink w:anchor="_Toc235829281" w:history="1">
             <w:r>
               <w:rPr>
                 <w:rStyle w:val="Hipercze"/>
@@ -803,7 +814,7 @@
               <w:rPr>
                 <w:webHidden/>
               </w:rPr>
-              <w:instrText xml:space="preserve"> PAGEREF _Toc235568947 \h </w:instrText>
+              <w:instrText xml:space="preserve"> PAGEREF _Toc235829281 \h </w:instrText>
             </w:r>
             <w:r>
               <w:rPr>
@@ -820,7 +831,7 @@
               <w:rPr>
                 <w:webHidden/>
               </w:rPr>
-              <w:t>5</w:t>
+              <w:t>6</w:t>
             </w:r>
             <w:r>
               <w:rPr>
@@ -836,13 +847,14 @@
             <w:tabs>
               <w:tab w:val="right" w:leader="dot" w:pos="9062"/>
             </w:tabs>
+            <w:spacing w:line="240" w:lineRule="auto"/>
             <w:rPr>
               <w:rFonts w:eastAsiaTheme="minorEastAsia"/>
               <w:noProof/>
               <w:lang w:eastAsia="pl-PL"/>
             </w:rPr>
           </w:pPr>
-          <w:hyperlink w:anchor="_Toc235568948" w:history="1">
+          <w:hyperlink w:anchor="_Toc235829282" w:history="1">
             <w:r>
               <w:rPr>
                 <w:rStyle w:val="Hipercze"/>
@@ -869,7 +881,7 @@
                 <w:noProof/>
                 <w:webHidden/>
               </w:rPr>
-              <w:instrText xml:space="preserve"> PAGEREF _Toc235568948 \h </w:instrText>
+              <w:instrText xml:space="preserve"> PAGEREF _Toc235829282 \h </w:instrText>
             </w:r>
             <w:r>
               <w:rPr>
@@ -889,7 +901,7 @@
                 <w:noProof/>
                 <w:webHidden/>
               </w:rPr>
-              <w:t>5</w:t>
+              <w:t>6</w:t>
             </w:r>
             <w:r>
               <w:rPr>
@@ -906,13 +918,14 @@
             <w:tabs>
               <w:tab w:val="right" w:leader="dot" w:pos="9062"/>
             </w:tabs>
+            <w:spacing w:line="240" w:lineRule="auto"/>
             <w:rPr>
               <w:rFonts w:eastAsiaTheme="minorEastAsia"/>
               <w:noProof/>
               <w:lang w:eastAsia="pl-PL"/>
             </w:rPr>
           </w:pPr>
-          <w:hyperlink w:anchor="_Toc235568949" w:history="1">
+          <w:hyperlink w:anchor="_Toc235829283" w:history="1">
             <w:r>
               <w:rPr>
                 <w:rStyle w:val="Hipercze"/>
@@ -939,7 +952,7 @@
                 <w:noProof/>
                 <w:webHidden/>
               </w:rPr>
-              <w:instrText xml:space="preserve"> PAGEREF _Toc235568949 \h </w:instrText>
+              <w:instrText xml:space="preserve"> PAGEREF _Toc235829283 \h </w:instrText>
             </w:r>
             <w:r>
               <w:rPr>
@@ -959,7 +972,7 @@
                 <w:noProof/>
                 <w:webHidden/>
               </w:rPr>
-              <w:t>6</w:t>
+              <w:t>7</w:t>
             </w:r>
             <w:r>
               <w:rPr>
@@ -976,13 +989,14 @@
             <w:tabs>
               <w:tab w:val="right" w:leader="dot" w:pos="9062"/>
             </w:tabs>
+            <w:spacing w:line="240" w:lineRule="auto"/>
             <w:rPr>
               <w:rFonts w:eastAsiaTheme="minorEastAsia"/>
               <w:noProof/>
               <w:lang w:eastAsia="pl-PL"/>
             </w:rPr>
           </w:pPr>
-          <w:hyperlink w:anchor="_Toc235568950" w:history="1">
+          <w:hyperlink w:anchor="_Toc235829284" w:history="1">
             <w:r>
               <w:rPr>
                 <w:rStyle w:val="Hipercze"/>
@@ -1009,7 +1023,7 @@
                 <w:noProof/>
                 <w:webHidden/>
               </w:rPr>
-              <w:instrText xml:space="preserve"> PAGEREF _Toc235568950 \h </w:instrText>
+              <w:instrText xml:space="preserve"> PAGEREF _Toc235829284 \h </w:instrText>
             </w:r>
             <w:r>
               <w:rPr>
@@ -1029,7 +1043,7 @@
                 <w:noProof/>
                 <w:webHidden/>
               </w:rPr>
-              <w:t>7</w:t>
+              <w:t>8</w:t>
             </w:r>
             <w:r>
               <w:rPr>
@@ -1046,13 +1060,14 @@
             <w:tabs>
               <w:tab w:val="right" w:leader="dot" w:pos="9062"/>
             </w:tabs>
+            <w:spacing w:line="240" w:lineRule="auto"/>
             <w:rPr>
               <w:rFonts w:eastAsiaTheme="minorEastAsia"/>
               <w:noProof/>
               <w:lang w:eastAsia="pl-PL"/>
             </w:rPr>
           </w:pPr>
-          <w:hyperlink w:anchor="_Toc235568951" w:history="1">
+          <w:hyperlink w:anchor="_Toc235829285" w:history="1">
             <w:r>
               <w:rPr>
                 <w:rStyle w:val="Hipercze"/>
@@ -1080,7 +1095,7 @@
                 <w:noProof/>
                 <w:webHidden/>
               </w:rPr>
-              <w:instrText xml:space="preserve"> PAGEREF _Toc235568951 \h </w:instrText>
+              <w:instrText xml:space="preserve"> PAGEREF _Toc235829285 \h </w:instrText>
             </w:r>
             <w:r>
               <w:rPr>
@@ -1100,7 +1115,7 @@
                 <w:noProof/>
                 <w:webHidden/>
               </w:rPr>
-              <w:t>8</w:t>
+              <w:t>9</w:t>
             </w:r>
             <w:r>
               <w:rPr>
@@ -1117,13 +1132,14 @@
             <w:tabs>
               <w:tab w:val="right" w:leader="dot" w:pos="9062"/>
             </w:tabs>
+            <w:spacing w:line="240" w:lineRule="auto"/>
             <w:rPr>
               <w:rFonts w:eastAsiaTheme="minorEastAsia"/>
               <w:noProof/>
               <w:lang w:eastAsia="pl-PL"/>
             </w:rPr>
           </w:pPr>
-          <w:hyperlink w:anchor="_Toc235568952" w:history="1">
+          <w:hyperlink w:anchor="_Toc235829286" w:history="1">
             <w:r>
               <w:rPr>
                 <w:rStyle w:val="Hipercze"/>
@@ -1150,7 +1166,7 @@
                 <w:noProof/>
                 <w:webHidden/>
               </w:rPr>
-              <w:instrText xml:space="preserve"> PAGEREF _Toc235568952 \h </w:instrText>
+              <w:instrText xml:space="preserve"> PAGEREF _Toc235829286 \h </w:instrText>
             </w:r>
             <w:r>
               <w:rPr>
@@ -1170,7 +1186,7 @@
                 <w:noProof/>
                 <w:webHidden/>
               </w:rPr>
-              <w:t>9</w:t>
+              <w:t>10</w:t>
             </w:r>
             <w:r>
               <w:rPr>
@@ -1187,13 +1203,14 @@
             <w:tabs>
               <w:tab w:val="right" w:leader="dot" w:pos="9062"/>
             </w:tabs>
+            <w:spacing w:line="240" w:lineRule="auto"/>
             <w:rPr>
               <w:rFonts w:eastAsiaTheme="minorEastAsia"/>
               <w:noProof/>
               <w:lang w:eastAsia="pl-PL"/>
             </w:rPr>
           </w:pPr>
-          <w:hyperlink w:anchor="_Toc235568953" w:history="1">
+          <w:hyperlink w:anchor="_Toc235829287" w:history="1">
             <w:r>
               <w:rPr>
                 <w:rStyle w:val="Hipercze"/>
@@ -1220,7 +1237,7 @@
                 <w:noProof/>
                 <w:webHidden/>
               </w:rPr>
-              <w:instrText xml:space="preserve"> PAGEREF _Toc235568953 \h </w:instrText>
+              <w:instrText xml:space="preserve"> PAGEREF _Toc235829287 \h </w:instrText>
             </w:r>
             <w:r>
               <w:rPr>
@@ -1240,7 +1257,7 @@
                 <w:noProof/>
                 <w:webHidden/>
               </w:rPr>
-              <w:t>11</w:t>
+              <w:t>12</w:t>
             </w:r>
             <w:r>
               <w:rPr>
@@ -1257,13 +1274,14 @@
             <w:tabs>
               <w:tab w:val="right" w:leader="dot" w:pos="9062"/>
             </w:tabs>
+            <w:spacing w:line="240" w:lineRule="auto"/>
             <w:rPr>
               <w:rFonts w:eastAsiaTheme="minorEastAsia"/>
               <w:noProof/>
               <w:lang w:eastAsia="pl-PL"/>
             </w:rPr>
           </w:pPr>
-          <w:hyperlink w:anchor="_Toc235568954" w:history="1">
+          <w:hyperlink w:anchor="_Toc235829288" w:history="1">
             <w:r>
               <w:rPr>
                 <w:rStyle w:val="Hipercze"/>
@@ -1290,7 +1308,7 @@
                 <w:noProof/>
                 <w:webHidden/>
               </w:rPr>
-              <w:instrText xml:space="preserve"> PAGEREF _Toc235568954 \h </w:instrText>
+              <w:instrText xml:space="preserve"> PAGEREF _Toc235829288 \h </w:instrText>
             </w:r>
             <w:r>
               <w:rPr>
@@ -1310,7 +1328,7 @@
                 <w:noProof/>
                 <w:webHidden/>
               </w:rPr>
-              <w:t>13</w:t>
+              <w:t>14</w:t>
             </w:r>
             <w:r>
               <w:rPr>
@@ -1327,13 +1345,14 @@
             <w:tabs>
               <w:tab w:val="right" w:leader="dot" w:pos="9062"/>
             </w:tabs>
+            <w:spacing w:line="240" w:lineRule="auto"/>
             <w:rPr>
               <w:rFonts w:eastAsiaTheme="minorEastAsia"/>
               <w:noProof/>
               <w:lang w:eastAsia="pl-PL"/>
             </w:rPr>
           </w:pPr>
-          <w:hyperlink w:anchor="_Toc235568955" w:history="1">
+          <w:hyperlink w:anchor="_Toc235829289" w:history="1">
             <w:r>
               <w:rPr>
                 <w:rStyle w:val="Hipercze"/>
@@ -1360,7 +1379,7 @@
                 <w:noProof/>
                 <w:webHidden/>
               </w:rPr>
-              <w:instrText xml:space="preserve"> PAGEREF _Toc235568955 \h </w:instrText>
+              <w:instrText xml:space="preserve"> PAGEREF _Toc235829289 \h </w:instrText>
             </w:r>
             <w:r>
               <w:rPr>
@@ -1380,7 +1399,7 @@
                 <w:noProof/>
                 <w:webHidden/>
               </w:rPr>
-              <w:t>15</w:t>
+              <w:t>16</w:t>
             </w:r>
             <w:r>
               <w:rPr>
@@ -1393,7 +1412,645 @@
         </w:p>
         <w:p>
           <w:pPr>
-            <w:spacing w:line="360" w:lineRule="auto"/>
+            <w:pStyle w:val="Spistreci1"/>
+            <w:spacing w:line="240" w:lineRule="auto"/>
+            <w:rPr>
+              <w:rFonts w:eastAsiaTheme="minorEastAsia"/>
+              <w:b w:val="0"/>
+              <w:bCs w:val="0"/>
+              <w:sz w:val="24"/>
+              <w:szCs w:val="24"/>
+              <w:lang w:eastAsia="pl-PL"/>
+            </w:rPr>
+          </w:pPr>
+          <w:hyperlink w:anchor="_Toc235829290" w:history="1">
+            <w:r>
+              <w:rPr>
+                <w:rStyle w:val="Hipercze"/>
+              </w:rPr>
+              <w:t>Wzorce do implementacji wybrane przeze mnie</w:t>
+            </w:r>
+            <w:r>
+              <w:rPr>
+                <w:webHidden/>
+              </w:rPr>
+              <w:tab/>
+            </w:r>
+            <w:r>
+              <w:rPr>
+                <w:webHidden/>
+              </w:rPr>
+              <w:fldChar w:fldCharType="begin"/>
+            </w:r>
+            <w:r>
+              <w:rPr>
+                <w:webHidden/>
+              </w:rPr>
+              <w:instrText xml:space="preserve"> PAGEREF _Toc235829290 \h </w:instrText>
+            </w:r>
+            <w:r>
+              <w:rPr>
+                <w:webHidden/>
+              </w:rPr>
+            </w:r>
+            <w:r>
+              <w:rPr>
+                <w:webHidden/>
+              </w:rPr>
+              <w:fldChar w:fldCharType="separate"/>
+            </w:r>
+            <w:r>
+              <w:rPr>
+                <w:webHidden/>
+              </w:rPr>
+              <w:t>18</w:t>
+            </w:r>
+            <w:r>
+              <w:rPr>
+                <w:webHidden/>
+              </w:rPr>
+              <w:fldChar w:fldCharType="end"/>
+            </w:r>
+          </w:hyperlink>
+        </w:p>
+        <w:p>
+          <w:pPr>
+            <w:pStyle w:val="Spistreci2"/>
+            <w:tabs>
+              <w:tab w:val="right" w:leader="dot" w:pos="9062"/>
+            </w:tabs>
+            <w:spacing w:line="240" w:lineRule="auto"/>
+            <w:rPr>
+              <w:rFonts w:eastAsiaTheme="minorEastAsia"/>
+              <w:noProof/>
+              <w:lang w:eastAsia="pl-PL"/>
+            </w:rPr>
+          </w:pPr>
+          <w:hyperlink w:anchor="_Toc235829291" w:history="1">
+            <w:r>
+              <w:rPr>
+                <w:rStyle w:val="Hipercze"/>
+                <w:b/>
+                <w:bCs/>
+                <w:noProof/>
+              </w:rPr>
+              <w:t>Dlaczego akurat wybór padł na te wzorce architektoniczne?</w:t>
+            </w:r>
+            <w:r>
+              <w:rPr>
+                <w:noProof/>
+                <w:webHidden/>
+              </w:rPr>
+              <w:tab/>
+            </w:r>
+            <w:r>
+              <w:rPr>
+                <w:noProof/>
+                <w:webHidden/>
+              </w:rPr>
+              <w:fldChar w:fldCharType="begin"/>
+            </w:r>
+            <w:r>
+              <w:rPr>
+                <w:noProof/>
+                <w:webHidden/>
+              </w:rPr>
+              <w:instrText xml:space="preserve"> PAGEREF _Toc235829291 \h </w:instrText>
+            </w:r>
+            <w:r>
+              <w:rPr>
+                <w:noProof/>
+                <w:webHidden/>
+              </w:rPr>
+            </w:r>
+            <w:r>
+              <w:rPr>
+                <w:noProof/>
+                <w:webHidden/>
+              </w:rPr>
+              <w:fldChar w:fldCharType="separate"/>
+            </w:r>
+            <w:r>
+              <w:rPr>
+                <w:noProof/>
+                <w:webHidden/>
+              </w:rPr>
+              <w:t>18</w:t>
+            </w:r>
+            <w:r>
+              <w:rPr>
+                <w:noProof/>
+                <w:webHidden/>
+              </w:rPr>
+              <w:fldChar w:fldCharType="end"/>
+            </w:r>
+          </w:hyperlink>
+        </w:p>
+        <w:p>
+          <w:pPr>
+            <w:pStyle w:val="Spistreci3"/>
+            <w:tabs>
+              <w:tab w:val="right" w:leader="dot" w:pos="9062"/>
+            </w:tabs>
+            <w:spacing w:line="240" w:lineRule="auto"/>
+            <w:rPr>
+              <w:rFonts w:eastAsiaTheme="minorEastAsia"/>
+              <w:noProof/>
+              <w:lang w:eastAsia="pl-PL"/>
+            </w:rPr>
+          </w:pPr>
+          <w:hyperlink w:anchor="_Toc235829292" w:history="1">
+            <w:r>
+              <w:rPr>
+                <w:rStyle w:val="Hipercze"/>
+                <w:noProof/>
+              </w:rPr>
+              <w:t>1. Wzorzec Pętli Gry (Game Loop)</w:t>
+            </w:r>
+            <w:r>
+              <w:rPr>
+                <w:noProof/>
+                <w:webHidden/>
+              </w:rPr>
+              <w:tab/>
+            </w:r>
+            <w:r>
+              <w:rPr>
+                <w:noProof/>
+                <w:webHidden/>
+              </w:rPr>
+              <w:fldChar w:fldCharType="begin"/>
+            </w:r>
+            <w:r>
+              <w:rPr>
+                <w:noProof/>
+                <w:webHidden/>
+              </w:rPr>
+              <w:instrText xml:space="preserve"> PAGEREF _Toc235829292 \h </w:instrText>
+            </w:r>
+            <w:r>
+              <w:rPr>
+                <w:noProof/>
+                <w:webHidden/>
+              </w:rPr>
+            </w:r>
+            <w:r>
+              <w:rPr>
+                <w:noProof/>
+                <w:webHidden/>
+              </w:rPr>
+              <w:fldChar w:fldCharType="separate"/>
+            </w:r>
+            <w:r>
+              <w:rPr>
+                <w:noProof/>
+                <w:webHidden/>
+              </w:rPr>
+              <w:t>18</w:t>
+            </w:r>
+            <w:r>
+              <w:rPr>
+                <w:noProof/>
+                <w:webHidden/>
+              </w:rPr>
+              <w:fldChar w:fldCharType="end"/>
+            </w:r>
+          </w:hyperlink>
+        </w:p>
+        <w:p>
+          <w:pPr>
+            <w:pStyle w:val="Spistreci3"/>
+            <w:tabs>
+              <w:tab w:val="right" w:leader="dot" w:pos="9062"/>
+            </w:tabs>
+            <w:spacing w:line="240" w:lineRule="auto"/>
+            <w:rPr>
+              <w:rFonts w:eastAsiaTheme="minorEastAsia"/>
+              <w:noProof/>
+              <w:lang w:eastAsia="pl-PL"/>
+            </w:rPr>
+          </w:pPr>
+          <w:hyperlink w:anchor="_Toc235829293" w:history="1">
+            <w:r>
+              <w:rPr>
+                <w:rStyle w:val="Hipercze"/>
+                <w:noProof/>
+              </w:rPr>
+              <w:t>2. Wzorzec Pyłku (Flyweight) + Wzorzec Odmiany: Pula Obiektów (Object Pool)</w:t>
+            </w:r>
+            <w:r>
+              <w:rPr>
+                <w:noProof/>
+                <w:webHidden/>
+              </w:rPr>
+              <w:tab/>
+            </w:r>
+            <w:r>
+              <w:rPr>
+                <w:noProof/>
+                <w:webHidden/>
+              </w:rPr>
+              <w:fldChar w:fldCharType="begin"/>
+            </w:r>
+            <w:r>
+              <w:rPr>
+                <w:noProof/>
+                <w:webHidden/>
+              </w:rPr>
+              <w:instrText xml:space="preserve"> PAGEREF _Toc235829293 \h </w:instrText>
+            </w:r>
+            <w:r>
+              <w:rPr>
+                <w:noProof/>
+                <w:webHidden/>
+              </w:rPr>
+            </w:r>
+            <w:r>
+              <w:rPr>
+                <w:noProof/>
+                <w:webHidden/>
+              </w:rPr>
+              <w:fldChar w:fldCharType="separate"/>
+            </w:r>
+            <w:r>
+              <w:rPr>
+                <w:noProof/>
+                <w:webHidden/>
+              </w:rPr>
+              <w:t>18</w:t>
+            </w:r>
+            <w:r>
+              <w:rPr>
+                <w:noProof/>
+                <w:webHidden/>
+              </w:rPr>
+              <w:fldChar w:fldCharType="end"/>
+            </w:r>
+          </w:hyperlink>
+        </w:p>
+        <w:p>
+          <w:pPr>
+            <w:pStyle w:val="Spistreci3"/>
+            <w:tabs>
+              <w:tab w:val="right" w:leader="dot" w:pos="9062"/>
+            </w:tabs>
+            <w:spacing w:line="240" w:lineRule="auto"/>
+            <w:rPr>
+              <w:rFonts w:eastAsiaTheme="minorEastAsia"/>
+              <w:noProof/>
+              <w:lang w:eastAsia="pl-PL"/>
+            </w:rPr>
+          </w:pPr>
+          <w:hyperlink w:anchor="_Toc235829294" w:history="1">
+            <w:r>
+              <w:rPr>
+                <w:rStyle w:val="Hipercze"/>
+                <w:noProof/>
+                <w:lang w:val="en-GB"/>
+              </w:rPr>
+              <w:t>3. Wzorzec ECS (Entity Component System)</w:t>
+            </w:r>
+            <w:r>
+              <w:rPr>
+                <w:noProof/>
+                <w:webHidden/>
+              </w:rPr>
+              <w:tab/>
+            </w:r>
+            <w:r>
+              <w:rPr>
+                <w:noProof/>
+                <w:webHidden/>
+              </w:rPr>
+              <w:fldChar w:fldCharType="begin"/>
+            </w:r>
+            <w:r>
+              <w:rPr>
+                <w:noProof/>
+                <w:webHidden/>
+              </w:rPr>
+              <w:instrText xml:space="preserve"> PAGEREF _Toc235829294 \h </w:instrText>
+            </w:r>
+            <w:r>
+              <w:rPr>
+                <w:noProof/>
+                <w:webHidden/>
+              </w:rPr>
+            </w:r>
+            <w:r>
+              <w:rPr>
+                <w:noProof/>
+                <w:webHidden/>
+              </w:rPr>
+              <w:fldChar w:fldCharType="separate"/>
+            </w:r>
+            <w:r>
+              <w:rPr>
+                <w:noProof/>
+                <w:webHidden/>
+              </w:rPr>
+              <w:t>19</w:t>
+            </w:r>
+            <w:r>
+              <w:rPr>
+                <w:noProof/>
+                <w:webHidden/>
+              </w:rPr>
+              <w:fldChar w:fldCharType="end"/>
+            </w:r>
+          </w:hyperlink>
+        </w:p>
+        <w:p>
+          <w:pPr>
+            <w:pStyle w:val="Spistreci3"/>
+            <w:tabs>
+              <w:tab w:val="right" w:leader="dot" w:pos="9062"/>
+            </w:tabs>
+            <w:spacing w:line="240" w:lineRule="auto"/>
+            <w:rPr>
+              <w:rFonts w:eastAsiaTheme="minorEastAsia"/>
+              <w:noProof/>
+              <w:lang w:eastAsia="pl-PL"/>
+            </w:rPr>
+          </w:pPr>
+          <w:hyperlink w:anchor="_Toc235829295" w:history="1">
+            <w:r>
+              <w:rPr>
+                <w:rStyle w:val="Hipercze"/>
+                <w:noProof/>
+              </w:rPr>
+              <w:t>4. Projektowanie Sterowane Danymi (Data-Driven Design)</w:t>
+            </w:r>
+            <w:r>
+              <w:rPr>
+                <w:noProof/>
+                <w:webHidden/>
+              </w:rPr>
+              <w:tab/>
+            </w:r>
+            <w:r>
+              <w:rPr>
+                <w:noProof/>
+                <w:webHidden/>
+              </w:rPr>
+              <w:fldChar w:fldCharType="begin"/>
+            </w:r>
+            <w:r>
+              <w:rPr>
+                <w:noProof/>
+                <w:webHidden/>
+              </w:rPr>
+              <w:instrText xml:space="preserve"> PAGEREF _Toc235829295 \h </w:instrText>
+            </w:r>
+            <w:r>
+              <w:rPr>
+                <w:noProof/>
+                <w:webHidden/>
+              </w:rPr>
+            </w:r>
+            <w:r>
+              <w:rPr>
+                <w:noProof/>
+                <w:webHidden/>
+              </w:rPr>
+              <w:fldChar w:fldCharType="separate"/>
+            </w:r>
+            <w:r>
+              <w:rPr>
+                <w:noProof/>
+                <w:webHidden/>
+              </w:rPr>
+              <w:t>19</w:t>
+            </w:r>
+            <w:r>
+              <w:rPr>
+                <w:noProof/>
+                <w:webHidden/>
+              </w:rPr>
+              <w:fldChar w:fldCharType="end"/>
+            </w:r>
+          </w:hyperlink>
+        </w:p>
+        <w:p>
+          <w:pPr>
+            <w:pStyle w:val="Spistreci3"/>
+            <w:tabs>
+              <w:tab w:val="right" w:leader="dot" w:pos="9062"/>
+            </w:tabs>
+            <w:spacing w:line="240" w:lineRule="auto"/>
+            <w:rPr>
+              <w:rFonts w:eastAsiaTheme="minorEastAsia"/>
+              <w:noProof/>
+              <w:lang w:eastAsia="pl-PL"/>
+            </w:rPr>
+          </w:pPr>
+          <w:hyperlink w:anchor="_Toc235829296" w:history="1">
+            <w:r>
+              <w:rPr>
+                <w:rStyle w:val="Hipercze"/>
+                <w:noProof/>
+                <w:lang w:val="en-GB"/>
+              </w:rPr>
+              <w:t>5. Wzorzec Polecenia (Soft Command Buffer)</w:t>
+            </w:r>
+            <w:r>
+              <w:rPr>
+                <w:noProof/>
+                <w:webHidden/>
+              </w:rPr>
+              <w:tab/>
+            </w:r>
+            <w:r>
+              <w:rPr>
+                <w:noProof/>
+                <w:webHidden/>
+              </w:rPr>
+              <w:fldChar w:fldCharType="begin"/>
+            </w:r>
+            <w:r>
+              <w:rPr>
+                <w:noProof/>
+                <w:webHidden/>
+              </w:rPr>
+              <w:instrText xml:space="preserve"> PAGEREF _Toc235829296 \h </w:instrText>
+            </w:r>
+            <w:r>
+              <w:rPr>
+                <w:noProof/>
+                <w:webHidden/>
+              </w:rPr>
+            </w:r>
+            <w:r>
+              <w:rPr>
+                <w:noProof/>
+                <w:webHidden/>
+              </w:rPr>
+              <w:fldChar w:fldCharType="separate"/>
+            </w:r>
+            <w:r>
+              <w:rPr>
+                <w:noProof/>
+                <w:webHidden/>
+              </w:rPr>
+              <w:t>20</w:t>
+            </w:r>
+            <w:r>
+              <w:rPr>
+                <w:noProof/>
+                <w:webHidden/>
+              </w:rPr>
+              <w:fldChar w:fldCharType="end"/>
+            </w:r>
+          </w:hyperlink>
+        </w:p>
+        <w:p>
+          <w:pPr>
+            <w:pStyle w:val="Spistreci3"/>
+            <w:tabs>
+              <w:tab w:val="right" w:leader="dot" w:pos="9062"/>
+            </w:tabs>
+            <w:spacing w:line="240" w:lineRule="auto"/>
+            <w:rPr>
+              <w:rFonts w:eastAsiaTheme="minorEastAsia"/>
+              <w:noProof/>
+              <w:lang w:eastAsia="pl-PL"/>
+            </w:rPr>
+          </w:pPr>
+          <w:hyperlink w:anchor="_Toc235829297" w:history="1">
+            <w:r>
+              <w:rPr>
+                <w:rStyle w:val="Hipercze"/>
+                <w:noProof/>
+              </w:rPr>
+              <w:t>6. Wzorzec Obserwatora (Event Queue)</w:t>
+            </w:r>
+            <w:r>
+              <w:rPr>
+                <w:noProof/>
+                <w:webHidden/>
+              </w:rPr>
+              <w:tab/>
+            </w:r>
+            <w:r>
+              <w:rPr>
+                <w:noProof/>
+                <w:webHidden/>
+              </w:rPr>
+              <w:fldChar w:fldCharType="begin"/>
+            </w:r>
+            <w:r>
+              <w:rPr>
+                <w:noProof/>
+                <w:webHidden/>
+              </w:rPr>
+              <w:instrText xml:space="preserve"> PAGEREF _Toc235829297 \h </w:instrText>
+            </w:r>
+            <w:r>
+              <w:rPr>
+                <w:noProof/>
+                <w:webHidden/>
+              </w:rPr>
+            </w:r>
+            <w:r>
+              <w:rPr>
+                <w:noProof/>
+                <w:webHidden/>
+              </w:rPr>
+              <w:fldChar w:fldCharType="separate"/>
+            </w:r>
+            <w:r>
+              <w:rPr>
+                <w:noProof/>
+                <w:webHidden/>
+              </w:rPr>
+              <w:t>20</w:t>
+            </w:r>
+            <w:r>
+              <w:rPr>
+                <w:noProof/>
+                <w:webHidden/>
+              </w:rPr>
+              <w:fldChar w:fldCharType="end"/>
+            </w:r>
+          </w:hyperlink>
+        </w:p>
+        <w:p>
+          <w:pPr>
+            <w:pStyle w:val="Spistreci3"/>
+            <w:tabs>
+              <w:tab w:val="right" w:leader="dot" w:pos="9062"/>
+            </w:tabs>
+            <w:spacing w:line="240" w:lineRule="auto"/>
+            <w:rPr>
+              <w:rFonts w:eastAsiaTheme="minorEastAsia"/>
+              <w:noProof/>
+              <w:lang w:eastAsia="pl-PL"/>
+            </w:rPr>
+          </w:pPr>
+          <w:hyperlink w:anchor="_Toc235829298" w:history="1">
+            <w:r>
+              <w:rPr>
+                <w:rStyle w:val="Hipercze"/>
+                <w:noProof/>
+              </w:rPr>
+              <w:t>7. Wzorzec Maszyny Stanów (Finite State Machine)</w:t>
+            </w:r>
+            <w:r>
+              <w:rPr>
+                <w:noProof/>
+                <w:webHidden/>
+              </w:rPr>
+              <w:tab/>
+            </w:r>
+            <w:r>
+              <w:rPr>
+                <w:noProof/>
+                <w:webHidden/>
+              </w:rPr>
+              <w:fldChar w:fldCharType="begin"/>
+            </w:r>
+            <w:r>
+              <w:rPr>
+                <w:noProof/>
+                <w:webHidden/>
+              </w:rPr>
+              <w:instrText xml:space="preserve"> PAGEREF _Toc235829298 \h </w:instrText>
+            </w:r>
+            <w:r>
+              <w:rPr>
+                <w:noProof/>
+                <w:webHidden/>
+              </w:rPr>
+            </w:r>
+            <w:r>
+              <w:rPr>
+                <w:noProof/>
+                <w:webHidden/>
+              </w:rPr>
+              <w:fldChar w:fldCharType="separate"/>
+            </w:r>
+            <w:r>
+              <w:rPr>
+                <w:noProof/>
+                <w:webHidden/>
+              </w:rPr>
+              <w:t>20</w:t>
+            </w:r>
+            <w:r>
+              <w:rPr>
+                <w:noProof/>
+                <w:webHidden/>
+              </w:rPr>
+              <w:fldChar w:fldCharType="end"/>
+            </w:r>
+          </w:hyperlink>
+        </w:p>
+        <w:p>
+          <w:pPr>
+            <w:tabs>
+              <w:tab w:val="left" w:pos="1265"/>
+            </w:tabs>
+            <w:spacing w:line="240" w:lineRule="auto"/>
           </w:pPr>
           <w:r>
             <w:rPr>
@@ -1402,6 +2059,13 @@
             </w:rPr>
             <w:fldChar w:fldCharType="end"/>
           </w:r>
+          <w:r>
+            <w:rPr>
+              <w:b/>
+              <w:bCs/>
+            </w:rPr>
+            <w:tab/>
+          </w:r>
         </w:p>
       </w:sdtContent>
     </w:sdt>
@@ -1419,7 +2083,7 @@
           <w:bCs/>
         </w:rPr>
       </w:pPr>
-      <w:bookmarkStart w:id="0" w:name="_Toc235568937"/>
+      <w:bookmarkStart w:id="0" w:name="_Toc235829271"/>
       <w:r>
         <w:rPr>
           <w:b/>
@@ -1495,7 +2159,7 @@
       <w:pPr>
         <w:pStyle w:val="Nagwek2"/>
       </w:pPr>
-      <w:bookmarkStart w:id="1" w:name="_Toc235568938"/>
+      <w:bookmarkStart w:id="1" w:name="_Toc235829272"/>
       <w:r>
         <w:t>Architektura Silnika i Gry (Zarządzanie Danymi)</w:t>
       </w:r>
@@ -1611,7 +2275,7 @@
       <w:pPr>
         <w:pStyle w:val="Nagwek2"/>
       </w:pPr>
-      <w:bookmarkStart w:id="2" w:name="_Toc235568939"/>
+      <w:bookmarkStart w:id="2" w:name="_Toc235829273"/>
       <w:r>
         <w:t>Renderowanie i Grafika 3D</w:t>
       </w:r>
@@ -1740,7 +2404,7 @@
       <w:pPr>
         <w:pStyle w:val="Nagwek2"/>
       </w:pPr>
-      <w:bookmarkStart w:id="3" w:name="_Toc235568940"/>
+      <w:bookmarkStart w:id="3" w:name="_Toc235829274"/>
       <w:r>
         <w:t>Logika Rozgrywki (Mechaniki Diablo)</w:t>
       </w:r>
@@ -1789,15 +2453,7 @@
         <w:t>Wzorzec fabryki – Factory Pattern:</w:t>
       </w:r>
       <w:r>
-        <w:t xml:space="preserve"> niezbędny do generowania </w:t>
-      </w:r>
-      <w:proofErr w:type="spellStart"/>
-      <w:r>
-        <w:t>lootu</w:t>
-      </w:r>
-      <w:proofErr w:type="spellEnd"/>
-      <w:r>
-        <w:t xml:space="preserve"> i potworów. Fabryka przyjmuje poziom trudności lub poziom lochu i na tej podstawie „składa” losowego przeciwnika lub przedmiot z odpowiednimi modyfikatorami.</w:t>
+        <w:t xml:space="preserve"> niezbędny do generowania lootu i potworów. Fabryka przyjmuje poziom trudności lub poziom lochu i na tej podstawie „składa” losowego przeciwnika lub przedmiot z odpowiednimi modyfikatorami.</w:t>
       </w:r>
     </w:p>
     <w:p>
@@ -1820,15 +2476,7 @@
         <w:t xml:space="preserve">: </w:t>
       </w:r>
       <w:r>
-        <w:t xml:space="preserve">Odseparuje logikę silnika od balansu gry. Statystki przedmiotów, drzewka umiejętności i parametry potworów powinny być ładowane z zewnętrznych plików (np. JSON, XML, </w:t>
-      </w:r>
-      <w:proofErr w:type="spellStart"/>
-      <w:r>
-        <w:t>Lua</w:t>
-      </w:r>
-      <w:proofErr w:type="spellEnd"/>
-      <w:r>
-        <w:t>) bez konieczności rekomp</w:t>
+        <w:t>Odseparuje logikę silnika od balansu gry. Statystki przedmiotów, drzewka umiejętności i parametry potworów powinny być ładowane z zewnętrznych plików (np. JSON, XML, Lua) bez konieczności rekomp</w:t>
       </w:r>
       <w:r>
         <w:t>ilacji kodu silnika.</w:t>
@@ -1839,7 +2487,7 @@
       <w:pPr>
         <w:pStyle w:val="Nagwek2"/>
       </w:pPr>
-      <w:bookmarkStart w:id="4" w:name="_Toc235568941"/>
+      <w:bookmarkStart w:id="4" w:name="_Toc235829275"/>
       <w:r>
         <w:t>Optymalizacja i Systemy Wspierające</w:t>
       </w:r>
@@ -1918,7 +2566,7 @@
           <w:bCs/>
         </w:rPr>
       </w:pPr>
-      <w:bookmarkStart w:id="5" w:name="_Toc235568942"/>
+      <w:bookmarkStart w:id="5" w:name="_Toc235829276"/>
       <w:r>
         <w:rPr>
           <w:b/>
@@ -1982,9 +2630,15 @@
       <w:pPr>
         <w:pStyle w:val="Nagwek2"/>
       </w:pPr>
-      <w:bookmarkStart w:id="6" w:name="_Toc235568943"/>
-      <w:r>
-        <w:t>Rdzeń silnika i renderowania (OpenGL + WGL)</w:t>
+      <w:bookmarkStart w:id="6" w:name="_Toc235829277"/>
+      <w:r>
+        <w:t>Rdzeń silnika i renderowani</w:t>
+      </w:r>
+      <w:r>
+        <w:t>e</w:t>
+      </w:r>
+      <w:r>
+        <w:t xml:space="preserve"> (OpenGL + WGL)</w:t>
       </w:r>
       <w:bookmarkEnd w:id="6"/>
     </w:p>
@@ -2098,7 +2752,7 @@
       <w:pPr>
         <w:pStyle w:val="Nagwek2"/>
       </w:pPr>
-      <w:bookmarkStart w:id="7" w:name="_Toc235568944"/>
+      <w:bookmarkStart w:id="7" w:name="_Toc235829278"/>
       <w:r>
         <w:t>Architektura danych i gry</w:t>
       </w:r>
@@ -2183,7 +2837,7 @@
       <w:pPr>
         <w:pStyle w:val="Nagwek2"/>
       </w:pPr>
-      <w:bookmarkStart w:id="8" w:name="_Toc235568945"/>
+      <w:bookmarkStart w:id="8" w:name="_Toc235829279"/>
       <w:r>
         <w:t xml:space="preserve">Komunikacja wielowątkowa (WinForms </w:t>
       </w:r>
@@ -2284,7 +2938,7 @@
       <w:pPr>
         <w:pStyle w:val="Nagwek2"/>
       </w:pPr>
-      <w:bookmarkStart w:id="9" w:name="_Toc235568946"/>
+      <w:bookmarkStart w:id="9" w:name="_Toc235829280"/>
       <w:r>
         <w:t>Logika i sztuczna inteligencja</w:t>
       </w:r>
@@ -2352,7 +3006,7 @@
           <w:bCs/>
         </w:rPr>
       </w:pPr>
-      <w:bookmarkStart w:id="10" w:name="_Toc235568947"/>
+      <w:bookmarkStart w:id="10" w:name="_Toc235829281"/>
       <w:r>
         <w:rPr>
           <w:b/>
@@ -2366,7 +3020,7 @@
       <w:pPr>
         <w:pStyle w:val="Nagwek2"/>
       </w:pPr>
-      <w:bookmarkStart w:id="11" w:name="_Toc235568948"/>
+      <w:bookmarkStart w:id="11" w:name="_Toc235829282"/>
       <w:r>
         <w:t>1. Wzorzec Pętli Gry (Game Loop)</w:t>
       </w:r>
@@ -2467,7 +3121,13 @@
         <w:t xml:space="preserve"> jest standardem używanym w branżach. Rozdziela się w nim czas fizyki/logiki od czasu wyświetlania grafiki. Mamy tutaj do czynienia z idealną powtarzalnością sieciową i fizyczną, niezależnie od tego czy gra wyciąga 30 FPS, czy 300 FPS. Potwór zawsze wykona atak dokładnie w takim samym czasie. </w:t>
       </w:r>
       <w:r>
-        <w:t>Wówczas kalkulacje hitboksów, czarów i kolizji z przeciwnikami będą zawsze precyzyjne.</w:t>
+        <w:t>Wówczas kalkulacje hitbo</w:t>
+      </w:r>
+      <w:r>
+        <w:t>x</w:t>
+      </w:r>
+      <w:r>
+        <w:t>ów, czarów i kolizji z przeciwnikami będą zawsze precyzyjne.</w:t>
       </w:r>
       <w:r>
         <w:t xml:space="preserve"> Płynność obrazu dzięki interpolacji, poprzez przekazanie zmiennej do systemu renderującego, nasz shader lub system renderujący wie, że ma narysować gracza dokładnie w drodze między punktem A i B. Daje to płynność ruchu kamery izometrycznej.</w:t>
@@ -2478,7 +3138,7 @@
       <w:pPr>
         <w:pStyle w:val="Nagwek2"/>
       </w:pPr>
-      <w:bookmarkStart w:id="12" w:name="_Toc235568949"/>
+      <w:bookmarkStart w:id="12" w:name="_Toc235829283"/>
       <w:r>
         <w:t>2. Wzorzec Pyłku (Flyweight)</w:t>
       </w:r>
@@ -2546,6 +3206,9 @@
     </w:p>
     <w:p>
       <w:r>
+        <w:rPr>
+          <w:noProof/>
+        </w:rPr>
         <w:drawing>
           <wp:inline distT="0" distB="0" distL="0" distR="0" wp14:anchorId="296C9A32" wp14:editId="0700549F">
             <wp:extent cx="5760720" cy="2192020"/>
@@ -2588,7 +3251,7 @@
       <w:pPr>
         <w:pStyle w:val="Nagwek2"/>
       </w:pPr>
-      <w:bookmarkStart w:id="13" w:name="_Toc235568950"/>
+      <w:bookmarkStart w:id="13" w:name="_Toc235829284"/>
       <w:r>
         <w:t xml:space="preserve">3. </w:t>
       </w:r>
@@ -2700,7 +3363,7 @@
           <w:lang w:val="en-GB"/>
         </w:rPr>
       </w:pPr>
-      <w:bookmarkStart w:id="14" w:name="_Toc235568951"/>
+      <w:bookmarkStart w:id="14" w:name="_Toc235829285"/>
       <w:r>
         <w:rPr>
           <w:lang w:val="en-GB"/>
@@ -3092,7 +3755,7 @@
       <w:pPr>
         <w:pStyle w:val="Nagwek2"/>
       </w:pPr>
-      <w:bookmarkStart w:id="15" w:name="_Toc235568952"/>
+      <w:bookmarkStart w:id="15" w:name="_Toc235829286"/>
       <w:r>
         <w:t>5. Projektowanie sterowane danymi (Data-Driven Design)</w:t>
       </w:r>
@@ -3136,7 +3799,13 @@
         <w:t>Wyobraź sobie, że chcesz dodać do gry słynny miecz</w:t>
       </w:r>
       <w:r>
-        <w:t xml:space="preserve"> „SunlighBlade”:</w:t>
+        <w:t xml:space="preserve"> „Sunligh</w:t>
+      </w:r>
+      <w:r>
+        <w:t>t</w:t>
+      </w:r>
+      <w:r>
+        <w:t>Blade”:</w:t>
       </w:r>
     </w:p>
     <w:p>
@@ -3158,7 +3827,13 @@
         <w:t xml:space="preserve"> Tworzysz klasę </w:t>
       </w:r>
       <w:r>
-        <w:t>SunlighBlade</w:t>
+        <w:t>Sunligh</w:t>
+      </w:r>
+      <w:r>
+        <w:t>t</w:t>
+      </w:r>
+      <w:r>
+        <w:t>Blade</w:t>
       </w:r>
       <w:r>
         <w:t xml:space="preserve"> : Weapon, gdzie w konstruktorze wpisujesz BaseDamage = 50; MinLevel = 60;.</w:t>
@@ -3321,16 +3996,7 @@
           <w:lang w:val="en-GB" w:eastAsia="pl-PL"/>
           <w14:ligatures w14:val="none"/>
         </w:rPr>
-        <w:t xml:space="preserve">  "id": "</w:t>
-      </w:r>
-      <w:r>
-        <w:rPr>
-          <w:rFonts w:ascii="Courier New" w:eastAsia="Times New Roman" w:hAnsi="Courier New" w:cs="Courier New"/>
-          <w:kern w:val="0"/>
-          <w:lang w:val="en-GB" w:eastAsia="pl-PL"/>
-          <w14:ligatures w14:val="none"/>
-        </w:rPr>
-        <w:t>Sunlightb</w:t>
+        <w:t xml:space="preserve">  "id": "Sunlightb</w:t>
       </w:r>
       <w:r>
         <w:rPr>
@@ -3863,7 +4529,7 @@
       <w:pPr>
         <w:pStyle w:val="Nagwek2"/>
       </w:pPr>
-      <w:bookmarkStart w:id="16" w:name="_Toc235568953"/>
+      <w:bookmarkStart w:id="16" w:name="_Toc235829287"/>
       <w:r>
         <w:t>6. Wzorzec polecenia (Command Buffer)</w:t>
       </w:r>
@@ -3882,7 +4548,18 @@
     </w:p>
     <w:p>
       <w:pPr>
-        <w:jc w:val="both"/>
+        <w:jc w:val="center"/>
+        <w:rPr>
+          <w:b/>
+          <w:bCs/>
+          <w:sz w:val="32"/>
+          <w:szCs w:val="32"/>
+        </w:rPr>
+      </w:pPr>
+    </w:p>
+    <w:p>
+      <w:pPr>
+        <w:jc w:val="center"/>
         <w:rPr>
           <w:b/>
           <w:bCs/>
@@ -3984,6 +4661,7 @@
           <w:rFonts w:ascii="Courier New" w:hAnsi="Courier New" w:cs="Courier New"/>
           <w:lang w:val="en-GB"/>
         </w:rPr>
+        <w:lastRenderedPageBreak/>
         <w:t>struct</w:t>
       </w:r>
       <w:r>
@@ -4048,7 +4726,6 @@
           <w:rFonts w:ascii="Courier New" w:hAnsi="Courier New" w:cs="Courier New"/>
           <w:lang w:val="en-GB"/>
         </w:rPr>
-        <w:lastRenderedPageBreak/>
         <w:t>public</w:t>
       </w:r>
       <w:r>
@@ -4082,13 +4759,6 @@
           <w:lang w:val="en-GB"/>
         </w:rPr>
         <w:br/>
-      </w:r>
-      <w:r>
-        <w:rPr>
-          <w:rStyle w:val="undefined"/>
-          <w:rFonts w:ascii="Courier New" w:hAnsi="Courier New" w:cs="Courier New"/>
-          <w:lang w:val="en-GB"/>
-        </w:rPr>
         <w:t>}</w:t>
       </w:r>
     </w:p>
@@ -4419,6 +5089,7 @@
           <w:rFonts w:ascii="Courier New" w:hAnsi="Courier New" w:cs="Courier New"/>
           <w:lang w:val="en-GB"/>
         </w:rPr>
+        <w:lastRenderedPageBreak/>
         <w:t>public</w:t>
       </w:r>
       <w:r>
@@ -4452,6 +5123,7 @@
           <w:lang w:val="en-GB"/>
         </w:rPr>
         <w:br/>
+        <w:t xml:space="preserve">SpawnMonster, </w:t>
       </w:r>
       <w:r>
         <w:rPr>
@@ -4459,7 +5131,8 @@
           <w:rFonts w:ascii="Courier New" w:hAnsi="Courier New" w:cs="Courier New"/>
           <w:lang w:val="en-GB"/>
         </w:rPr>
-        <w:t xml:space="preserve">SpawnMonster, </w:t>
+        <w:br/>
+        <w:t xml:space="preserve">DestroyEntity, </w:t>
       </w:r>
       <w:r>
         <w:rPr>
@@ -4468,6 +5141,7 @@
           <w:lang w:val="en-GB"/>
         </w:rPr>
         <w:br/>
+        <w:t xml:space="preserve">GiveDamage, </w:t>
       </w:r>
       <w:r>
         <w:rPr>
@@ -4475,8 +5149,8 @@
           <w:rFonts w:ascii="Courier New" w:hAnsi="Courier New" w:cs="Courier New"/>
           <w:lang w:val="en-GB"/>
         </w:rPr>
-        <w:lastRenderedPageBreak/>
-        <w:t xml:space="preserve">DestroyEntity, </w:t>
+        <w:br/>
+        <w:t xml:space="preserve">PlaySound </w:t>
       </w:r>
       <w:r>
         <w:rPr>
@@ -4485,6 +5159,7 @@
           <w:lang w:val="en-GB"/>
         </w:rPr>
         <w:br/>
+        <w:t xml:space="preserve">} </w:t>
       </w:r>
       <w:r>
         <w:rPr>
@@ -4492,7 +5167,7 @@
           <w:rFonts w:ascii="Courier New" w:hAnsi="Courier New" w:cs="Courier New"/>
           <w:lang w:val="en-GB"/>
         </w:rPr>
-        <w:t xml:space="preserve">GiveDamage, </w:t>
+        <w:br/>
       </w:r>
       <w:r>
         <w:rPr>
@@ -4504,11 +5179,27 @@
       </w:r>
       <w:r>
         <w:rPr>
+          <w:rStyle w:val="mexsqb"/>
+          <w:rFonts w:ascii="Courier New" w:hAnsi="Courier New" w:cs="Courier New"/>
+          <w:lang w:val="en-GB"/>
+        </w:rPr>
+        <w:t>public</w:t>
+      </w:r>
+      <w:r>
+        <w:rPr>
           <w:rStyle w:val="undefined"/>
           <w:rFonts w:ascii="Courier New" w:hAnsi="Courier New" w:cs="Courier New"/>
           <w:lang w:val="en-GB"/>
         </w:rPr>
-        <w:t xml:space="preserve">PlaySound </w:t>
+        <w:t xml:space="preserve"> </w:t>
+      </w:r>
+      <w:r>
+        <w:rPr>
+          <w:rStyle w:val="mexsqb"/>
+          <w:rFonts w:ascii="Courier New" w:hAnsi="Courier New" w:cs="Courier New"/>
+          <w:lang w:val="en-GB"/>
+        </w:rPr>
+        <w:t>struct</w:t>
       </w:r>
       <w:r>
         <w:rPr>
@@ -4516,7 +5207,7 @@
           <w:rFonts w:ascii="Courier New" w:hAnsi="Courier New" w:cs="Courier New"/>
           <w:lang w:val="en-GB"/>
         </w:rPr>
-        <w:br/>
+        <w:t xml:space="preserve"> GameCommand { </w:t>
       </w:r>
       <w:r>
         <w:rPr>
@@ -4524,7 +5215,15 @@
           <w:rFonts w:ascii="Courier New" w:hAnsi="Courier New" w:cs="Courier New"/>
           <w:lang w:val="en-GB"/>
         </w:rPr>
-        <w:t xml:space="preserve">} </w:t>
+        <w:br/>
+      </w:r>
+      <w:r>
+        <w:rPr>
+          <w:rStyle w:val="mexsqb"/>
+          <w:rFonts w:ascii="Courier New" w:hAnsi="Courier New" w:cs="Courier New"/>
+          <w:lang w:val="en-GB"/>
+        </w:rPr>
+        <w:t>public</w:t>
       </w:r>
       <w:r>
         <w:rPr>
@@ -4532,7 +5231,7 @@
           <w:rFonts w:ascii="Courier New" w:hAnsi="Courier New" w:cs="Courier New"/>
           <w:lang w:val="en-GB"/>
         </w:rPr>
-        <w:br/>
+        <w:t xml:space="preserve"> CommandType Type; </w:t>
       </w:r>
       <w:r>
         <w:rPr>
@@ -4564,7 +5263,7 @@
           <w:rFonts w:ascii="Courier New" w:hAnsi="Courier New" w:cs="Courier New"/>
           <w:lang w:val="en-GB"/>
         </w:rPr>
-        <w:t>struct</w:t>
+        <w:t>int</w:t>
       </w:r>
       <w:r>
         <w:rPr>
@@ -4572,7 +5271,7 @@
           <w:rFonts w:ascii="Courier New" w:hAnsi="Courier New" w:cs="Courier New"/>
           <w:lang w:val="en-GB"/>
         </w:rPr>
-        <w:t xml:space="preserve"> GameCommand { </w:t>
+        <w:t xml:space="preserve"> EntityId; </w:t>
       </w:r>
       <w:r>
         <w:rPr>
@@ -4596,7 +5295,15 @@
           <w:rFonts w:ascii="Courier New" w:hAnsi="Courier New" w:cs="Courier New"/>
           <w:lang w:val="en-GB"/>
         </w:rPr>
-        <w:t xml:space="preserve"> CommandType Type; </w:t>
+        <w:t xml:space="preserve"> </w:t>
+      </w:r>
+      <w:r>
+        <w:rPr>
+          <w:rStyle w:val="mexsqb"/>
+          <w:rFonts w:ascii="Courier New" w:hAnsi="Courier New" w:cs="Courier New"/>
+          <w:lang w:val="en-GB"/>
+        </w:rPr>
+        <w:t>float</w:t>
       </w:r>
       <w:r>
         <w:rPr>
@@ -4604,6 +5311,14 @@
           <w:rFonts w:ascii="Courier New" w:hAnsi="Courier New" w:cs="Courier New"/>
           <w:lang w:val="en-GB"/>
         </w:rPr>
+        <w:t xml:space="preserve"> ParamX; </w:t>
+      </w:r>
+      <w:r>
+        <w:rPr>
+          <w:rStyle w:val="undefined"/>
+          <w:rFonts w:ascii="Courier New" w:hAnsi="Courier New" w:cs="Courier New"/>
+          <w:lang w:val="en-GB"/>
+        </w:rPr>
         <w:br/>
       </w:r>
       <w:r>
@@ -4628,7 +5343,7 @@
           <w:rFonts w:ascii="Courier New" w:hAnsi="Courier New" w:cs="Courier New"/>
           <w:lang w:val="en-GB"/>
         </w:rPr>
-        <w:t>int</w:t>
+        <w:t>float</w:t>
       </w:r>
       <w:r>
         <w:rPr>
@@ -4636,7 +5351,7 @@
           <w:rFonts w:ascii="Courier New" w:hAnsi="Courier New" w:cs="Courier New"/>
           <w:lang w:val="en-GB"/>
         </w:rPr>
-        <w:t xml:space="preserve"> EntityId; </w:t>
+        <w:t xml:space="preserve"> ParamY; </w:t>
       </w:r>
       <w:r>
         <w:rPr>
@@ -4668,7 +5383,7 @@
           <w:rFonts w:ascii="Courier New" w:hAnsi="Courier New" w:cs="Courier New"/>
           <w:lang w:val="en-GB"/>
         </w:rPr>
-        <w:t>float</w:t>
+        <w:t>int</w:t>
       </w:r>
       <w:r>
         <w:rPr>
@@ -4676,7 +5391,7 @@
           <w:rFonts w:ascii="Courier New" w:hAnsi="Courier New" w:cs="Courier New"/>
           <w:lang w:val="en-GB"/>
         </w:rPr>
-        <w:t xml:space="preserve"> ParamX; </w:t>
+        <w:t xml:space="preserve"> TargetId; </w:t>
       </w:r>
       <w:r>
         <w:rPr>
@@ -4685,93 +5400,6 @@
           <w:lang w:val="en-GB"/>
         </w:rPr>
         <w:br/>
-      </w:r>
-      <w:r>
-        <w:rPr>
-          <w:rStyle w:val="mexsqb"/>
-          <w:rFonts w:ascii="Courier New" w:hAnsi="Courier New" w:cs="Courier New"/>
-          <w:lang w:val="en-GB"/>
-        </w:rPr>
-        <w:t>public</w:t>
-      </w:r>
-      <w:r>
-        <w:rPr>
-          <w:rStyle w:val="undefined"/>
-          <w:rFonts w:ascii="Courier New" w:hAnsi="Courier New" w:cs="Courier New"/>
-          <w:lang w:val="en-GB"/>
-        </w:rPr>
-        <w:t xml:space="preserve"> </w:t>
-      </w:r>
-      <w:r>
-        <w:rPr>
-          <w:rStyle w:val="mexsqb"/>
-          <w:rFonts w:ascii="Courier New" w:hAnsi="Courier New" w:cs="Courier New"/>
-          <w:lang w:val="en-GB"/>
-        </w:rPr>
-        <w:t>float</w:t>
-      </w:r>
-      <w:r>
-        <w:rPr>
-          <w:rStyle w:val="undefined"/>
-          <w:rFonts w:ascii="Courier New" w:hAnsi="Courier New" w:cs="Courier New"/>
-          <w:lang w:val="en-GB"/>
-        </w:rPr>
-        <w:t xml:space="preserve"> ParamY; </w:t>
-      </w:r>
-      <w:r>
-        <w:rPr>
-          <w:rStyle w:val="undefined"/>
-          <w:rFonts w:ascii="Courier New" w:hAnsi="Courier New" w:cs="Courier New"/>
-          <w:lang w:val="en-GB"/>
-        </w:rPr>
-        <w:br/>
-      </w:r>
-      <w:r>
-        <w:rPr>
-          <w:rStyle w:val="mexsqb"/>
-          <w:rFonts w:ascii="Courier New" w:hAnsi="Courier New" w:cs="Courier New"/>
-          <w:lang w:val="en-GB"/>
-        </w:rPr>
-        <w:t>public</w:t>
-      </w:r>
-      <w:r>
-        <w:rPr>
-          <w:rStyle w:val="undefined"/>
-          <w:rFonts w:ascii="Courier New" w:hAnsi="Courier New" w:cs="Courier New"/>
-          <w:lang w:val="en-GB"/>
-        </w:rPr>
-        <w:t xml:space="preserve"> </w:t>
-      </w:r>
-      <w:r>
-        <w:rPr>
-          <w:rStyle w:val="mexsqb"/>
-          <w:rFonts w:ascii="Courier New" w:hAnsi="Courier New" w:cs="Courier New"/>
-          <w:lang w:val="en-GB"/>
-        </w:rPr>
-        <w:t>int</w:t>
-      </w:r>
-      <w:r>
-        <w:rPr>
-          <w:rStyle w:val="undefined"/>
-          <w:rFonts w:ascii="Courier New" w:hAnsi="Courier New" w:cs="Courier New"/>
-          <w:lang w:val="en-GB"/>
-        </w:rPr>
-        <w:t xml:space="preserve"> TargetId; </w:t>
-      </w:r>
-      <w:r>
-        <w:rPr>
-          <w:rStyle w:val="undefined"/>
-          <w:rFonts w:ascii="Courier New" w:hAnsi="Courier New" w:cs="Courier New"/>
-          <w:lang w:val="en-GB"/>
-        </w:rPr>
-        <w:br/>
-      </w:r>
-      <w:r>
-        <w:rPr>
-          <w:rStyle w:val="undefined"/>
-          <w:rFonts w:ascii="Courier New" w:hAnsi="Courier New" w:cs="Courier New"/>
-          <w:lang w:val="en-GB"/>
-        </w:rPr>
         <w:t>}</w:t>
       </w:r>
     </w:p>
@@ -4907,7 +5535,7 @@
       <w:pPr>
         <w:pStyle w:val="Nagwek2"/>
       </w:pPr>
-      <w:bookmarkStart w:id="17" w:name="_Toc235568954"/>
+      <w:bookmarkStart w:id="17" w:name="_Toc235829288"/>
       <w:r>
         <w:t>7. Wzorzec Obserwatora (Observer)</w:t>
       </w:r>
@@ -4939,6 +5567,7 @@
           <w:sz w:val="32"/>
           <w:szCs w:val="32"/>
         </w:rPr>
+        <w:lastRenderedPageBreak/>
         <w:t>Różnica między klasycznym Obserwatorem a Kolejką Zdarzeń (Event Queue)</w:t>
       </w:r>
     </w:p>
@@ -4947,7 +5576,6 @@
         <w:jc w:val="both"/>
       </w:pPr>
       <w:r>
-        <w:lastRenderedPageBreak/>
         <w:t>W tradycyjnym oprogramowaniu</w:t>
       </w:r>
       <w:r>
@@ -4977,6 +5605,9 @@
     </w:p>
     <w:p>
       <w:r>
+        <w:rPr>
+          <w:noProof/>
+        </w:rPr>
         <w:drawing>
           <wp:inline distT="0" distB="0" distL="0" distR="0" wp14:anchorId="0478F171" wp14:editId="58A77174">
             <wp:extent cx="5760720" cy="2507615"/>
@@ -5246,6 +5877,7 @@
           <w:rStyle w:val="mexsqb"/>
           <w:rFonts w:ascii="Courier New" w:hAnsi="Courier New" w:cs="Courier New"/>
         </w:rPr>
+        <w:lastRenderedPageBreak/>
         <w:t>public</w:t>
       </w:r>
       <w:r>
@@ -5261,12 +5893,6 @@
           <w:rFonts w:ascii="Courier New" w:hAnsi="Courier New" w:cs="Courier New"/>
         </w:rPr>
         <w:br/>
-      </w:r>
-      <w:r>
-        <w:rPr>
-          <w:rStyle w:val="undefined"/>
-          <w:rFonts w:ascii="Courier New" w:hAnsi="Courier New" w:cs="Courier New"/>
-        </w:rPr>
         <w:t>}</w:t>
       </w:r>
     </w:p>
@@ -5295,7 +5921,6 @@
           <w:sz w:val="32"/>
           <w:szCs w:val="32"/>
         </w:rPr>
-        <w:lastRenderedPageBreak/>
         <w:t>Gdzie tkwi największa zaleta dla pary WinForms + WGL?</w:t>
       </w:r>
     </w:p>
@@ -5399,7 +6024,7 @@
       <w:pPr>
         <w:pStyle w:val="Nagwek2"/>
       </w:pPr>
-      <w:bookmarkStart w:id="18" w:name="_Toc235568955"/>
+      <w:bookmarkStart w:id="18" w:name="_Toc235829289"/>
       <w:r>
         <w:t>8. Maszyna Stanów (FSM)</w:t>
       </w:r>
@@ -5466,6 +6091,9 @@
         <w:jc w:val="center"/>
       </w:pPr>
       <w:r>
+        <w:rPr>
+          <w:noProof/>
+        </w:rPr>
         <w:lastRenderedPageBreak/>
         <w:drawing>
           <wp:inline distT="0" distB="0" distL="0" distR="0" wp14:anchorId="1C02FF64" wp14:editId="3A0C5FD8">
@@ -5764,6 +6392,798 @@
         <w:t>Gdy gracz jest w stanie Casting (rzuca potężne zaklęcie z długą animacją), system walki nie pozwoli mu natychmiast uciec, dopóki stan rzucania czaru się nie zakończy (chyba że animację przerwie ogłuszenie, co wymusi przejście do stanu Stunned).</w:t>
       </w:r>
     </w:p>
+    <w:p>
+      <w:pPr>
+        <w:pStyle w:val="Nagwek1"/>
+        <w:jc w:val="center"/>
+        <w:rPr>
+          <w:b/>
+          <w:bCs/>
+        </w:rPr>
+      </w:pPr>
+      <w:bookmarkStart w:id="19" w:name="_Toc235829290"/>
+      <w:r>
+        <w:rPr>
+          <w:b/>
+          <w:bCs/>
+        </w:rPr>
+        <w:lastRenderedPageBreak/>
+        <w:t>Wzorce do implementacji wybrane przeze mnie</w:t>
+      </w:r>
+      <w:bookmarkEnd w:id="19"/>
+    </w:p>
+    <w:p>
+      <w:pPr>
+        <w:jc w:val="both"/>
+        <w:rPr>
+          <w:b/>
+          <w:bCs/>
+        </w:rPr>
+      </w:pPr>
+      <w:r>
+        <w:rPr>
+          <w:b/>
+          <w:bCs/>
+        </w:rPr>
+        <w:t>Wybrane przeze mnie wzorce do implementacji po zapoznaniu się z nimi:</w:t>
+      </w:r>
+    </w:p>
+    <w:p>
+      <w:pPr>
+        <w:pStyle w:val="Akapitzlist"/>
+        <w:numPr>
+          <w:ilvl w:val="0"/>
+          <w:numId w:val="27"/>
+        </w:numPr>
+        <w:jc w:val="both"/>
+      </w:pPr>
+      <w:r>
+        <w:t>Wzorzec Pętli Gry (Game Loop)</w:t>
+      </w:r>
+    </w:p>
+    <w:p>
+      <w:pPr>
+        <w:pStyle w:val="Akapitzlist"/>
+        <w:numPr>
+          <w:ilvl w:val="0"/>
+          <w:numId w:val="27"/>
+        </w:numPr>
+        <w:jc w:val="both"/>
+      </w:pPr>
+      <w:r>
+        <w:t>Wzorzec Pyłku (Flyweight)</w:t>
+      </w:r>
+    </w:p>
+    <w:p>
+      <w:pPr>
+        <w:pStyle w:val="Akapitzlist"/>
+        <w:numPr>
+          <w:ilvl w:val="0"/>
+          <w:numId w:val="27"/>
+        </w:numPr>
+        <w:jc w:val="both"/>
+      </w:pPr>
+      <w:r>
+        <w:t>Wzorzec Odmiany: Pula Obiektów (Object Pool)</w:t>
+      </w:r>
+    </w:p>
+    <w:p>
+      <w:pPr>
+        <w:pStyle w:val="Akapitzlist"/>
+        <w:numPr>
+          <w:ilvl w:val="0"/>
+          <w:numId w:val="27"/>
+        </w:numPr>
+        <w:jc w:val="both"/>
+        <w:rPr>
+          <w:lang w:val="en-GB"/>
+        </w:rPr>
+      </w:pPr>
+      <w:r>
+        <w:rPr>
+          <w:lang w:val="en-GB"/>
+        </w:rPr>
+        <w:t>Wzorzec ECS (Entity Component System)</w:t>
+      </w:r>
+    </w:p>
+    <w:p>
+      <w:pPr>
+        <w:pStyle w:val="Akapitzlist"/>
+        <w:numPr>
+          <w:ilvl w:val="0"/>
+          <w:numId w:val="27"/>
+        </w:numPr>
+        <w:jc w:val="both"/>
+      </w:pPr>
+      <w:r>
+        <w:t>Projektowanie sterowane danymi (Data-Driven D</w:t>
+      </w:r>
+      <w:r>
+        <w:t>esign)</w:t>
+      </w:r>
+    </w:p>
+    <w:p>
+      <w:pPr>
+        <w:pStyle w:val="Akapitzlist"/>
+        <w:numPr>
+          <w:ilvl w:val="0"/>
+          <w:numId w:val="27"/>
+        </w:numPr>
+        <w:jc w:val="both"/>
+        <w:rPr>
+          <w:lang w:val="en-GB"/>
+        </w:rPr>
+      </w:pPr>
+      <w:r>
+        <w:rPr>
+          <w:lang w:val="en-GB"/>
+        </w:rPr>
+        <w:t>Wzorzec Polecenia (Soft Command Buffer)</w:t>
+      </w:r>
+    </w:p>
+    <w:p>
+      <w:pPr>
+        <w:pStyle w:val="Akapitzlist"/>
+        <w:numPr>
+          <w:ilvl w:val="0"/>
+          <w:numId w:val="27"/>
+        </w:numPr>
+        <w:jc w:val="both"/>
+        <w:rPr>
+          <w:lang w:val="en-GB"/>
+        </w:rPr>
+      </w:pPr>
+      <w:r>
+        <w:rPr>
+          <w:lang w:val="en-GB"/>
+        </w:rPr>
+        <w:t>Wzorzec Obserwatora (Event Queue)</w:t>
+      </w:r>
+    </w:p>
+    <w:p>
+      <w:pPr>
+        <w:pStyle w:val="Akapitzlist"/>
+        <w:numPr>
+          <w:ilvl w:val="0"/>
+          <w:numId w:val="27"/>
+        </w:numPr>
+        <w:jc w:val="both"/>
+      </w:pPr>
+      <w:r>
+        <w:t>Wzorzec Maszyna Stanów (Finite</w:t>
+      </w:r>
+      <w:r>
+        <w:t xml:space="preserve"> State Machine)</w:t>
+      </w:r>
+    </w:p>
+    <w:p/>
+    <w:p>
+      <w:pPr>
+        <w:pStyle w:val="Nagwek2"/>
+        <w:rPr>
+          <w:b/>
+          <w:bCs/>
+        </w:rPr>
+      </w:pPr>
+      <w:bookmarkStart w:id="20" w:name="_Toc235829291"/>
+      <w:r>
+        <w:rPr>
+          <w:b/>
+          <w:bCs/>
+        </w:rPr>
+        <w:t>Dlaczego akurat wybór padł na te wzorce architektoniczne?</w:t>
+      </w:r>
+      <w:bookmarkEnd w:id="20"/>
+    </w:p>
+    <w:p>
+      <w:pPr>
+        <w:pStyle w:val="Nagwek3"/>
+      </w:pPr>
+      <w:bookmarkStart w:id="21" w:name="_Toc235829292"/>
+      <w:r>
+        <w:t xml:space="preserve">1. </w:t>
+      </w:r>
+      <w:r>
+        <w:t>Wzorzec Pętli Gry</w:t>
+      </w:r>
+      <w:r>
+        <w:t xml:space="preserve"> (Game Loop)</w:t>
+      </w:r>
+      <w:bookmarkEnd w:id="21"/>
+    </w:p>
+    <w:p>
+      <w:pPr>
+        <w:jc w:val="both"/>
+      </w:pPr>
+      <w:r>
+        <w:rPr>
+          <w:b/>
+          <w:bCs/>
+        </w:rPr>
+        <w:t>Wzorzec Pętli Gry</w:t>
+      </w:r>
+      <w:r>
+        <w:t xml:space="preserve"> jest aktualnie sercem każdego silnika 3D, gdzie taka pętla gry działa nieprzerwanie w nieskończonej pętli, dopóki gra nie zostanie wyłączona. W tym przypadku kod nie musi pasywnie czekać aż użytkownik kliknie cokolwiek. Najlepszym rozwiązaniem do tego wzorca jest podejście </w:t>
+      </w:r>
+      <w:r>
+        <w:rPr>
+          <w:b/>
+          <w:bCs/>
+        </w:rPr>
+        <w:t>Stały krok logiki, zmienny krok renderowania (Fixed Update, Variable Render)</w:t>
+      </w:r>
+      <w:r>
+        <w:t>. Standard ten jest używany powszechnie, gdzie rozdzielany jest czas fizyki/logiki od czasu wyświetlania grafiki.</w:t>
+      </w:r>
+      <w:r>
+        <w:t xml:space="preserve"> Powoli to zachować płynność obrazu dzięki interpolacji, poprzez przekazanie zmiennej do systemu renderującego. Przyda nam się to w kontekście płynności ruchu kamery izometrycznej w samej grze.</w:t>
+      </w:r>
+    </w:p>
+    <w:p/>
+    <w:p>
+      <w:pPr>
+        <w:pStyle w:val="Nagwek3"/>
+      </w:pPr>
+      <w:bookmarkStart w:id="22" w:name="_Toc235829293"/>
+      <w:r>
+        <w:t>2. Wzorzec Pyłku (Flyweight) + Wzorzec Odmiany: Pula Obiektów (Object Pool)</w:t>
+      </w:r>
+      <w:bookmarkEnd w:id="22"/>
+    </w:p>
+    <w:p>
+      <w:pPr>
+        <w:jc w:val="both"/>
+      </w:pPr>
+      <w:r>
+        <w:rPr>
+          <w:b/>
+          <w:bCs/>
+        </w:rPr>
+        <w:t>Wzorzec Pyłku</w:t>
+      </w:r>
+      <w:r>
+        <w:t xml:space="preserve"> jest strukturalnym wzorce, którego głównym celem jest drastyczna oszczędność pamięci RAM i VRAM. Następuje tutaj współdzielenie jak największej ilości danych między wieloma podobnymi obiektami, zamiast trzymania kopii w każdym obiekcie z osobna. Z uwagi na to, że w grach typu Diablo, gdzie na ekranie mogą walczyć dziesiątki tych samych wrogów, a na ziemi może leżeć mnóstwo przedmiotów, to tego wzorca silnik mógłby doprowadzić do przepełnienia pamięci karty graficznej.</w:t>
+      </w:r>
+    </w:p>
+    <w:p>
+      <w:pPr>
+        <w:jc w:val="both"/>
+      </w:pPr>
+      <w:r>
+        <w:rPr>
+          <w:b/>
+          <w:bCs/>
+        </w:rPr>
+        <w:t>Wzorzec Odmiany: Pula Obiektów</w:t>
+      </w:r>
+      <w:r>
+        <w:t xml:space="preserve"> natomiast służy do drastycznej optymalizacji zarządzania pamięcią. Nie tworzy on i nie niszczy cały czas obiektów w trakcie ładowania rozgrywki. Jeśli gra potrzebuje nowego obiektu, pamięć nie jest alokowana a wypożyczany </w:t>
+      </w:r>
+      <w:r>
+        <w:lastRenderedPageBreak/>
+        <w:t xml:space="preserve">jest przedmiot z puli. W przypadku kiedy </w:t>
+      </w:r>
+      <w:r>
+        <w:t>obiekt nie jest już potrzebny, zwracany jest on do tej puli i zostaje ukryty, z której był wypożyczany zamiast jego usuwania.</w:t>
+      </w:r>
+    </w:p>
+    <w:p>
+      <w:pPr>
+        <w:jc w:val="center"/>
+        <w:rPr>
+          <w:b/>
+          <w:bCs/>
+        </w:rPr>
+      </w:pPr>
+      <w:r>
+        <w:rPr>
+          <w:b/>
+          <w:bCs/>
+          <w:highlight w:val="yellow"/>
+        </w:rPr>
+        <w:t>Tak naprawdę możliwe jest połączenie tych dwóch wzorców i osiągnięcie wręcz bardzo dobrej optymalizacji gry. Nawet powinno się te dwa wzorce stosować razem.</w:t>
+      </w:r>
+    </w:p>
+    <w:p>
+      <w:pPr>
+        <w:rPr>
+          <w:b/>
+          <w:bCs/>
+        </w:rPr>
+      </w:pPr>
+    </w:p>
+    <w:p>
+      <w:pPr>
+        <w:pStyle w:val="Nagwek3"/>
+        <w:rPr>
+          <w:lang w:val="en-GB"/>
+        </w:rPr>
+      </w:pPr>
+      <w:bookmarkStart w:id="23" w:name="_Toc235829294"/>
+      <w:r>
+        <w:rPr>
+          <w:lang w:val="en-GB"/>
+        </w:rPr>
+        <w:t>3. Wzorzec ECS (Entity Component System)</w:t>
+      </w:r>
+      <w:bookmarkEnd w:id="23"/>
+    </w:p>
+    <w:p>
+      <w:pPr>
+        <w:jc w:val="both"/>
+      </w:pPr>
+      <w:r>
+        <w:rPr>
+          <w:b/>
+          <w:bCs/>
+        </w:rPr>
+        <w:t>Wzorzec ECS</w:t>
+      </w:r>
+      <w:r>
+        <w:t xml:space="preserve"> służy do</w:t>
+      </w:r>
+      <w:r>
+        <w:t xml:space="preserve"> organizacj</w:t>
+      </w:r>
+      <w:r>
+        <w:t>i</w:t>
+      </w:r>
+      <w:r>
+        <w:t xml:space="preserve"> kodu </w:t>
+      </w:r>
+      <w:r>
+        <w:t>i</w:t>
+      </w:r>
+      <w:r>
+        <w:t xml:space="preserve"> d</w:t>
+      </w:r>
+      <w:r>
+        <w:t xml:space="preserve">anych w grze, gdzie odrzucane jest tradycyjne OPP i dziedziczenie. W przypadku podejścia zorientowanego na dane (Data-Oriented Design) jest to fundament. Tutaj wzorzec ECS jest w stanie rozwiązać problem z wydajnością, gdzie dzielimy świat gry na trzy odseparowane elementy: </w:t>
+      </w:r>
+    </w:p>
+    <w:p>
+      <w:pPr>
+        <w:pStyle w:val="Akapitzlist"/>
+        <w:numPr>
+          <w:ilvl w:val="0"/>
+          <w:numId w:val="28"/>
+        </w:numPr>
+        <w:jc w:val="both"/>
+      </w:pPr>
+      <w:r>
+        <w:t>Entity – Jest to tylko ID, brak tutaj kodu czy danych.</w:t>
+      </w:r>
+    </w:p>
+    <w:p>
+      <w:pPr>
+        <w:pStyle w:val="Akapitzlist"/>
+        <w:numPr>
+          <w:ilvl w:val="0"/>
+          <w:numId w:val="28"/>
+        </w:numPr>
+        <w:jc w:val="both"/>
+      </w:pPr>
+      <w:r>
+        <w:t>Component – Czyste dane, które są małymi prostymi strukturami, ale nie zawierają żadnej logiki czy metod</w:t>
+      </w:r>
+      <w:r>
+        <w:t xml:space="preserve"> – opis pojedynczej cechy danego obiektu.</w:t>
+      </w:r>
+    </w:p>
+    <w:p>
+      <w:pPr>
+        <w:pStyle w:val="Akapitzlist"/>
+        <w:numPr>
+          <w:ilvl w:val="0"/>
+          <w:numId w:val="28"/>
+        </w:numPr>
+        <w:jc w:val="both"/>
+      </w:pPr>
+      <w:r>
+        <w:t>System</w:t>
+      </w:r>
+      <w:r>
+        <w:t xml:space="preserve"> – Cała logika, systemy to klasy zawierające całą logikę gry, lecz nie przechowują żadnego stanu – danych. Każdy system odpowiada za jedno konkretne zadanie.</w:t>
+      </w:r>
+    </w:p>
+    <w:p/>
+    <w:p>
+      <w:pPr>
+        <w:pStyle w:val="Nagwek3"/>
+      </w:pPr>
+      <w:bookmarkStart w:id="24" w:name="_Toc235829295"/>
+      <w:r>
+        <w:t>4. Projektowanie Sterowane Danymi (Data-Driven Design)</w:t>
+      </w:r>
+      <w:bookmarkEnd w:id="24"/>
+    </w:p>
+    <w:p>
+      <w:pPr>
+        <w:jc w:val="both"/>
+      </w:pPr>
+      <w:r>
+        <w:rPr>
+          <w:b/>
+          <w:bCs/>
+        </w:rPr>
+        <w:t>Projektowanie Sterowane Danymi</w:t>
+      </w:r>
+      <w:r>
+        <w:t xml:space="preserve"> to podejście, gdzie zasady oraz balans gry są całkowicie odseparowane od kodu źródłowego silnika. Uruchamiane wówczas mogą być pliki tekstowe typu JSON, XML, CSV i na ich podstawie budowany jest świat gry. Zalety dla silnika z wykorzystaniem tego podejścia:</w:t>
+      </w:r>
+    </w:p>
+    <w:p>
+      <w:pPr>
+        <w:numPr>
+          <w:ilvl w:val="0"/>
+          <w:numId w:val="30"/>
+        </w:numPr>
+        <w:jc w:val="both"/>
+      </w:pPr>
+      <w:r>
+        <w:rPr>
+          <w:b/>
+          <w:bCs/>
+        </w:rPr>
+        <w:t>Błyskawiczne testowanie (Hot-Reloading):</w:t>
+      </w:r>
+      <w:r>
+        <w:t xml:space="preserve"> Możesz zaprogramować silnik tak, aby po naciśnięciu klawisza w WinForms ponownie przeładował pliki JSON. Oznacza to, że możesz zmienić zdrowie potwora w pliku tekstowym podczas działania gry i natychmiast zobaczyć efekt w swoim oknie OpenGL, bez wyłączania programu.</w:t>
+      </w:r>
+    </w:p>
+    <w:p>
+      <w:pPr>
+        <w:numPr>
+          <w:ilvl w:val="0"/>
+          <w:numId w:val="30"/>
+        </w:numPr>
+        <w:jc w:val="both"/>
+      </w:pPr>
+      <w:r>
+        <w:rPr>
+          <w:b/>
+          <w:bCs/>
+        </w:rPr>
+        <w:t>Balans gry poza kodem:</w:t>
+      </w:r>
+      <w:r>
+        <w:t xml:space="preserve"> Jako programistka silnika możesz skupić się na matematyce renderowania i optymalizacji wątków WGL. Cały balans (ile punktów życia ma potwór na 5. poziomie lochów, ile złota wypada ze skrzynki) możesz edytować w wygodnych tabelach lub plikach tekstowych.</w:t>
+      </w:r>
+    </w:p>
+    <w:p>
+      <w:pPr>
+        <w:numPr>
+          <w:ilvl w:val="0"/>
+          <w:numId w:val="30"/>
+        </w:numPr>
+        <w:jc w:val="both"/>
+      </w:pPr>
+      <w:r>
+        <w:rPr>
+          <w:b/>
+          <w:bCs/>
+        </w:rPr>
+        <w:t>Łatwe tworzenie modów:</w:t>
+      </w:r>
+      <w:r>
+        <w:t xml:space="preserve"> Dokładnie tak powstało legendarne Diablo II. Cała mechanika gry opierała się na plikach .txt (m.in. ItemStatCost.txt, MonStats.txt). Gracze mogli podmieniać te pliki, tworząc własne wersje gry bez dostępu do kodu źródłowego silnika.</w:t>
+      </w:r>
+    </w:p>
+    <w:p>
+      <w:pPr>
+        <w:pStyle w:val="Nagwek3"/>
+        <w:rPr>
+          <w:lang w:val="en-GB"/>
+        </w:rPr>
+      </w:pPr>
+      <w:bookmarkStart w:id="25" w:name="_Toc235829296"/>
+      <w:r>
+        <w:rPr>
+          <w:lang w:val="en-GB"/>
+        </w:rPr>
+        <w:lastRenderedPageBreak/>
+        <w:t>5. Wzorzec Polecenia (Soft Command Buffer)</w:t>
+      </w:r>
+      <w:bookmarkEnd w:id="25"/>
+    </w:p>
+    <w:p>
+      <w:pPr>
+        <w:jc w:val="both"/>
+      </w:pPr>
+      <w:r>
+        <w:rPr>
+          <w:b/>
+          <w:bCs/>
+        </w:rPr>
+        <w:t>Wzorzec</w:t>
+      </w:r>
+      <w:r>
+        <w:rPr>
+          <w:b/>
+          <w:bCs/>
+        </w:rPr>
+        <w:t xml:space="preserve"> </w:t>
+      </w:r>
+      <w:r>
+        <w:rPr>
+          <w:b/>
+          <w:bCs/>
+        </w:rPr>
+        <w:t>Polecenia</w:t>
+      </w:r>
+      <w:r>
+        <w:t xml:space="preserve"> to wzorzec </w:t>
+      </w:r>
+      <w:r>
+        <w:t>architektoniczny, polegający na zmianie i</w:t>
+      </w:r>
+      <w:r>
+        <w:t>ntencji wykonania jakiejkolwiek akcji w zwykły obiekt lub strukturę danych (polecenia) i odłożeniu jej do kolejki (bufora)</w:t>
+      </w:r>
+      <w:r>
+        <w:t>. W przypadku tego wzorca rozwiązane mogą zostać dwa problemy: wielowątkowość oraz bezpieczeństwo danych.</w:t>
+      </w:r>
+    </w:p>
+    <w:p>
+      <w:pPr>
+        <w:jc w:val="both"/>
+      </w:pPr>
+      <w:r>
+        <w:t>Co możemy zyskać dzięki temu wzorcowi:</w:t>
+      </w:r>
+    </w:p>
+    <w:p>
+      <w:pPr>
+        <w:numPr>
+          <w:ilvl w:val="0"/>
+          <w:numId w:val="31"/>
+        </w:numPr>
+        <w:jc w:val="both"/>
+        <w:rPr>
+          <w:rFonts w:asciiTheme="majorHAnsi" w:hAnsiTheme="majorHAnsi" w:cs="Courier New"/>
+        </w:rPr>
+      </w:pPr>
+      <w:r>
+        <w:rPr>
+          <w:rFonts w:asciiTheme="majorHAnsi" w:hAnsiTheme="majorHAnsi" w:cs="Courier New"/>
+          <w:b/>
+          <w:bCs/>
+        </w:rPr>
+        <w:t>Brak blokad (Lock-free):</w:t>
+      </w:r>
+      <w:r>
+        <w:rPr>
+          <w:rFonts w:asciiTheme="majorHAnsi" w:hAnsiTheme="majorHAnsi" w:cs="Courier New"/>
+        </w:rPr>
+        <w:t xml:space="preserve"> Wątek UI WinForms i wątek gry działają z maksymalną prędkością, komunikując się jedynie przez asynchroniczny bufor.</w:t>
+      </w:r>
+    </w:p>
+    <w:p>
+      <w:pPr>
+        <w:numPr>
+          <w:ilvl w:val="0"/>
+          <w:numId w:val="31"/>
+        </w:numPr>
+        <w:jc w:val="both"/>
+        <w:rPr>
+          <w:rFonts w:asciiTheme="majorHAnsi" w:hAnsiTheme="majorHAnsi" w:cs="Courier New"/>
+        </w:rPr>
+      </w:pPr>
+      <w:r>
+        <w:rPr>
+          <w:rFonts w:asciiTheme="majorHAnsi" w:hAnsiTheme="majorHAnsi" w:cs="Courier New"/>
+          <w:b/>
+          <w:bCs/>
+        </w:rPr>
+        <w:t>Stabilność ECS:</w:t>
+      </w:r>
+      <w:r>
+        <w:rPr>
+          <w:rFonts w:asciiTheme="majorHAnsi" w:hAnsiTheme="majorHAnsi" w:cs="Courier New"/>
+        </w:rPr>
+        <w:t xml:space="preserve"> Masz 100% gwarancji, że żadne dane nie zostaną zmodyfikowane w trakcie ich przetwarzania przez procesor.</w:t>
+      </w:r>
+    </w:p>
+    <w:p>
+      <w:pPr>
+        <w:numPr>
+          <w:ilvl w:val="0"/>
+          <w:numId w:val="31"/>
+        </w:numPr>
+        <w:jc w:val="both"/>
+        <w:rPr>
+          <w:rFonts w:asciiTheme="majorHAnsi" w:hAnsiTheme="majorHAnsi" w:cs="Courier New"/>
+        </w:rPr>
+      </w:pPr>
+      <w:r>
+        <w:rPr>
+          <w:rFonts w:asciiTheme="majorHAnsi" w:hAnsiTheme="majorHAnsi" w:cs="Courier New"/>
+          <w:b/>
+          <w:bCs/>
+        </w:rPr>
+        <w:t>Możliwość implementacji sieci (Multiplayer):</w:t>
+      </w:r>
+      <w:r>
+        <w:rPr>
+          <w:rFonts w:asciiTheme="majorHAnsi" w:hAnsiTheme="majorHAnsi" w:cs="Courier New"/>
+        </w:rPr>
+        <w:t xml:space="preserve"> Jeśli w przyszłości </w:t>
+      </w:r>
+      <w:r>
+        <w:rPr>
+          <w:rFonts w:asciiTheme="majorHAnsi" w:hAnsiTheme="majorHAnsi" w:cs="Courier New"/>
+        </w:rPr>
+        <w:t>zechcemy</w:t>
+      </w:r>
+      <w:r>
+        <w:rPr>
+          <w:rFonts w:asciiTheme="majorHAnsi" w:hAnsiTheme="majorHAnsi" w:cs="Courier New"/>
+        </w:rPr>
+        <w:t xml:space="preserve"> dodać tryb kooperacji, Twój Command Buffer z WinForms zmieni się po prostu w Command Buffer przesyłany przez sieć od innych graczy – architektura silnika pozostanie identyczna!</w:t>
+      </w:r>
+    </w:p>
+    <w:p>
+      <w:pPr>
+        <w:jc w:val="both"/>
+        <w:rPr>
+          <w:rFonts w:asciiTheme="majorHAnsi" w:hAnsiTheme="majorHAnsi" w:cs="Courier New"/>
+        </w:rPr>
+      </w:pPr>
+    </w:p>
+    <w:p>
+      <w:pPr>
+        <w:pStyle w:val="Nagwek3"/>
+      </w:pPr>
+      <w:bookmarkStart w:id="26" w:name="_Toc235829297"/>
+      <w:r>
+        <w:t>6. Wzorzec Obserwatora (Event Queue)</w:t>
+      </w:r>
+      <w:bookmarkEnd w:id="26"/>
+    </w:p>
+    <w:p>
+      <w:pPr>
+        <w:jc w:val="both"/>
+        <w:rPr>
+          <w:rFonts w:asciiTheme="majorHAnsi" w:hAnsiTheme="majorHAnsi" w:cs="Courier New"/>
+        </w:rPr>
+      </w:pPr>
+      <w:r>
+        <w:rPr>
+          <w:rFonts w:asciiTheme="majorHAnsi" w:hAnsiTheme="majorHAnsi" w:cs="Courier New"/>
+          <w:b/>
+          <w:bCs/>
+        </w:rPr>
+        <w:t>Wzorzec Obserwatora</w:t>
+      </w:r>
+      <w:r>
+        <w:rPr>
+          <w:rFonts w:asciiTheme="majorHAnsi" w:hAnsiTheme="majorHAnsi" w:cs="Courier New"/>
+        </w:rPr>
+        <w:t xml:space="preserve">, a w szczególności jego lepsza wersja </w:t>
+      </w:r>
+      <w:r>
+        <w:rPr>
+          <w:rFonts w:asciiTheme="majorHAnsi" w:hAnsiTheme="majorHAnsi" w:cs="Courier New"/>
+          <w:b/>
+          <w:bCs/>
+        </w:rPr>
+        <w:t>Event Queue</w:t>
+      </w:r>
+      <w:r>
+        <w:rPr>
+          <w:rFonts w:asciiTheme="majorHAnsi" w:hAnsiTheme="majorHAnsi" w:cs="Courier New"/>
+        </w:rPr>
+        <w:t xml:space="preserve"> jest wydajniejsza dla gier i jest to wzorzec służący do luźnego powiązania różnych systemów w silniku. Wzorzec tej wersji działa asynchronicznie i jest bezpieczny wielowątkowo. Akurat przykładem można nawiązać do tzw. achivementów w grach komputerowych. W momencie, gdy gracz spełnił wymagania dla dwóch achivementów jednocześnie (co może się wydarzyć w grze), system musi po kolei zakolejkować te zdarzenia i wyświetlić je po kolei</w:t>
+      </w:r>
+      <w:r>
+        <w:rPr>
+          <w:rFonts w:asciiTheme="majorHAnsi" w:hAnsiTheme="majorHAnsi" w:cs="Courier New"/>
+        </w:rPr>
+        <w:t>, a nie dwa na raz (jednocześnie) – nieważne jest kto oczekuje na to powiadomienie tylko je wysyła.</w:t>
+      </w:r>
+      <w:r>
+        <w:rPr>
+          <w:rFonts w:asciiTheme="majorHAnsi" w:hAnsiTheme="majorHAnsi" w:cs="Courier New"/>
+        </w:rPr>
+        <w:t xml:space="preserve"> W połączeniu z </w:t>
+      </w:r>
+      <w:r>
+        <w:rPr>
+          <w:rFonts w:asciiTheme="majorHAnsi" w:hAnsiTheme="majorHAnsi" w:cs="Courier New"/>
+          <w:b/>
+          <w:bCs/>
+        </w:rPr>
+        <w:t>wzorcem ECS</w:t>
+      </w:r>
+      <w:r>
+        <w:rPr>
+          <w:rFonts w:asciiTheme="majorHAnsi" w:hAnsiTheme="majorHAnsi" w:cs="Courier New"/>
+        </w:rPr>
+        <w:t xml:space="preserve"> jest to naprawdę dobry kierunek w kontekście silnika 3D. Zdarzenia są wrzucane do bezpiecznej kolejki.</w:t>
+      </w:r>
+    </w:p>
+    <w:p>
+      <w:pPr>
+        <w:jc w:val="both"/>
+        <w:rPr>
+          <w:rFonts w:asciiTheme="majorHAnsi" w:hAnsiTheme="majorHAnsi" w:cs="Courier New"/>
+        </w:rPr>
+      </w:pPr>
+    </w:p>
+    <w:p>
+      <w:pPr>
+        <w:pStyle w:val="Nagwek3"/>
+      </w:pPr>
+      <w:bookmarkStart w:id="27" w:name="_Toc235829298"/>
+      <w:r>
+        <w:t>7. Wzorzec Maszyny Stanów (Finite State Machine)</w:t>
+      </w:r>
+      <w:bookmarkEnd w:id="27"/>
+    </w:p>
+    <w:p>
+      <w:pPr>
+        <w:jc w:val="both"/>
+        <w:rPr>
+          <w:rFonts w:asciiTheme="majorHAnsi" w:hAnsiTheme="majorHAnsi" w:cs="Courier New"/>
+        </w:rPr>
+      </w:pPr>
+      <w:r>
+        <w:rPr>
+          <w:rFonts w:asciiTheme="majorHAnsi" w:hAnsiTheme="majorHAnsi" w:cs="Courier New"/>
+          <w:b/>
+          <w:bCs/>
+        </w:rPr>
+        <w:t>Wzorzec Maszyny Stanów</w:t>
+      </w:r>
+      <w:r>
+        <w:rPr>
+          <w:rFonts w:asciiTheme="majorHAnsi" w:hAnsiTheme="majorHAnsi" w:cs="Courier New"/>
+        </w:rPr>
+        <w:t xml:space="preserve"> służy do zarządzania zachowaniem obiektów, których logika zależy od ich aktualnego stanu. W przypadku gry, dany obiekt może się znajdować w jednym stanie na raz, czyli nie może być przypadku gdzie ogłuszona postać biegnie. Tutaj miała by stan ogłuszony i brak możliwości poruszania się, a nawet możliwości ataku czy użycia zdolności. FSM jest fundamentem dla SI potworów oraz kontroli animacji i akcji gracza. Jeśli zostanie on zastosowany kod będzie czytelniejszy i pozbawiony ciągłych instrukcji if-else czy bloków switch, które mogą doprowadzić do wielu błędów. </w:t>
+      </w:r>
+      <w:r>
+        <w:t xml:space="preserve">W Diablo postać gracza ma bardzo rygorystyczne zasady poruszania się i walki. </w:t>
+      </w:r>
+      <w:r>
+        <w:rPr>
+          <w:lang w:val="en-GB"/>
+        </w:rPr>
+        <w:t>FSM dla gracza (np. PlayerState : Idle, Moving, Casting, Stunned, Dead) gwarantuje, że:</w:t>
+      </w:r>
+    </w:p>
+    <w:p>
+      <w:pPr>
+        <w:numPr>
+          <w:ilvl w:val="0"/>
+          <w:numId w:val="26"/>
+        </w:numPr>
+        <w:jc w:val="both"/>
+      </w:pPr>
+      <w:r>
+        <w:lastRenderedPageBreak/>
+        <w:t>Gdy gracz jest w stanie Stunned (ogłuszony przez potwora), system wejścia (Input) odrzuci komendy ruchu z WinForms.</w:t>
+      </w:r>
+    </w:p>
+    <w:p>
+      <w:pPr>
+        <w:numPr>
+          <w:ilvl w:val="0"/>
+          <w:numId w:val="26"/>
+        </w:numPr>
+        <w:jc w:val="both"/>
+      </w:pPr>
+      <w:r>
+        <w:t>Gdy gracz jest w stanie Casting (rzuca potężne zaklęcie z długą animacją), system walki nie pozwoli mu natychmiast uciec, dopóki stan rzucania czaru się nie zakończy (chyba że animację przerwie ogłuszenie, co wymusi przejście do stanu Stunned).</w:t>
+      </w:r>
+    </w:p>
+    <w:p>
+      <w:pPr>
+        <w:jc w:val="both"/>
+        <w:rPr>
+          <w:rFonts w:asciiTheme="majorHAnsi" w:hAnsiTheme="majorHAnsi" w:cs="Courier New"/>
+        </w:rPr>
+      </w:pPr>
+    </w:p>
     <w:sectPr>
       <w:pgSz w:w="11906" w:h="16838"/>
       <w:pgMar w:top="1417" w:right="1417" w:bottom="1417" w:left="1417" w:header="708" w:footer="708" w:gutter="0"/>
@@ -6460,6 +7880,122 @@
     </w:lvl>
   </w:abstractNum>
   <w:abstractNum w:abstractNumId="5" w15:restartNumberingAfterBreak="0">
+    <w:nsid w:val="0E230B85"/>
+    <w:multiLevelType w:val="multilevel"/>
+    <w:tmpl w:val="D8781B3A"/>
+    <w:lvl w:ilvl="0">
+      <w:start w:val="1"/>
+      <w:numFmt w:val="bullet"/>
+      <w:lvlText w:val=""/>
+      <w:lvlJc w:val="left"/>
+      <w:pPr>
+        <w:tabs>
+          <w:tab w:val="num" w:pos="720"/>
+        </w:tabs>
+        <w:ind w:left="720" w:hanging="360"/>
+      </w:pPr>
+      <w:rPr>
+        <w:rFonts w:ascii="Symbol" w:hAnsi="Symbol" w:hint="default"/>
+      </w:rPr>
+    </w:lvl>
+    <w:lvl w:ilvl="1" w:tentative="1">
+      <w:start w:val="1"/>
+      <w:numFmt w:val="decimal"/>
+      <w:lvlText w:val="%2."/>
+      <w:lvlJc w:val="left"/>
+      <w:pPr>
+        <w:tabs>
+          <w:tab w:val="num" w:pos="1440"/>
+        </w:tabs>
+        <w:ind w:left="1440" w:hanging="360"/>
+      </w:pPr>
+    </w:lvl>
+    <w:lvl w:ilvl="2" w:tentative="1">
+      <w:start w:val="1"/>
+      <w:numFmt w:val="decimal"/>
+      <w:lvlText w:val="%3."/>
+      <w:lvlJc w:val="left"/>
+      <w:pPr>
+        <w:tabs>
+          <w:tab w:val="num" w:pos="2160"/>
+        </w:tabs>
+        <w:ind w:left="2160" w:hanging="360"/>
+      </w:pPr>
+    </w:lvl>
+    <w:lvl w:ilvl="3" w:tentative="1">
+      <w:start w:val="1"/>
+      <w:numFmt w:val="decimal"/>
+      <w:lvlText w:val="%4."/>
+      <w:lvlJc w:val="left"/>
+      <w:pPr>
+        <w:tabs>
+          <w:tab w:val="num" w:pos="2880"/>
+        </w:tabs>
+        <w:ind w:left="2880" w:hanging="360"/>
+      </w:pPr>
+    </w:lvl>
+    <w:lvl w:ilvl="4" w:tentative="1">
+      <w:start w:val="1"/>
+      <w:numFmt w:val="decimal"/>
+      <w:lvlText w:val="%5."/>
+      <w:lvlJc w:val="left"/>
+      <w:pPr>
+        <w:tabs>
+          <w:tab w:val="num" w:pos="3600"/>
+        </w:tabs>
+        <w:ind w:left="3600" w:hanging="360"/>
+      </w:pPr>
+    </w:lvl>
+    <w:lvl w:ilvl="5" w:tentative="1">
+      <w:start w:val="1"/>
+      <w:numFmt w:val="decimal"/>
+      <w:lvlText w:val="%6."/>
+      <w:lvlJc w:val="left"/>
+      <w:pPr>
+        <w:tabs>
+          <w:tab w:val="num" w:pos="4320"/>
+        </w:tabs>
+        <w:ind w:left="4320" w:hanging="360"/>
+      </w:pPr>
+    </w:lvl>
+    <w:lvl w:ilvl="6" w:tentative="1">
+      <w:start w:val="1"/>
+      <w:numFmt w:val="decimal"/>
+      <w:lvlText w:val="%7."/>
+      <w:lvlJc w:val="left"/>
+      <w:pPr>
+        <w:tabs>
+          <w:tab w:val="num" w:pos="5040"/>
+        </w:tabs>
+        <w:ind w:left="5040" w:hanging="360"/>
+      </w:pPr>
+    </w:lvl>
+    <w:lvl w:ilvl="7" w:tentative="1">
+      <w:start w:val="1"/>
+      <w:numFmt w:val="decimal"/>
+      <w:lvlText w:val="%8."/>
+      <w:lvlJc w:val="left"/>
+      <w:pPr>
+        <w:tabs>
+          <w:tab w:val="num" w:pos="5760"/>
+        </w:tabs>
+        <w:ind w:left="5760" w:hanging="360"/>
+      </w:pPr>
+    </w:lvl>
+    <w:lvl w:ilvl="8" w:tentative="1">
+      <w:start w:val="1"/>
+      <w:numFmt w:val="decimal"/>
+      <w:lvlText w:val="%9."/>
+      <w:lvlJc w:val="left"/>
+      <w:pPr>
+        <w:tabs>
+          <w:tab w:val="num" w:pos="6480"/>
+        </w:tabs>
+        <w:ind w:left="6480" w:hanging="360"/>
+      </w:pPr>
+    </w:lvl>
+  </w:abstractNum>
+  <w:abstractNum w:abstractNumId="6" w15:restartNumberingAfterBreak="0">
     <w:nsid w:val="17234A86"/>
     <w:multiLevelType w:val="multilevel"/>
     <w:tmpl w:val="5B646C72"/>
@@ -6572,7 +8108,7 @@
       </w:pPr>
     </w:lvl>
   </w:abstractNum>
-  <w:abstractNum w:abstractNumId="6" w15:restartNumberingAfterBreak="0">
+  <w:abstractNum w:abstractNumId="7" w15:restartNumberingAfterBreak="0">
     <w:nsid w:val="193E1CAD"/>
     <w:multiLevelType w:val="hybridMultilevel"/>
     <w:tmpl w:val="C0E46778"/>
@@ -6685,7 +8221,7 @@
       </w:rPr>
     </w:lvl>
   </w:abstractNum>
-  <w:abstractNum w:abstractNumId="7" w15:restartNumberingAfterBreak="0">
+  <w:abstractNum w:abstractNumId="8" w15:restartNumberingAfterBreak="0">
     <w:nsid w:val="195916DD"/>
     <w:multiLevelType w:val="hybridMultilevel"/>
     <w:tmpl w:val="C8B6799C"/>
@@ -6798,7 +8334,7 @@
       </w:rPr>
     </w:lvl>
   </w:abstractNum>
-  <w:abstractNum w:abstractNumId="8" w15:restartNumberingAfterBreak="0">
+  <w:abstractNum w:abstractNumId="9" w15:restartNumberingAfterBreak="0">
     <w:nsid w:val="1C6C1B75"/>
     <w:multiLevelType w:val="hybridMultilevel"/>
     <w:tmpl w:val="1BF616D4"/>
@@ -6911,7 +8447,120 @@
       </w:rPr>
     </w:lvl>
   </w:abstractNum>
-  <w:abstractNum w:abstractNumId="9" w15:restartNumberingAfterBreak="0">
+  <w:abstractNum w:abstractNumId="10" w15:restartNumberingAfterBreak="0">
+    <w:nsid w:val="1F9B33F4"/>
+    <w:multiLevelType w:val="hybridMultilevel"/>
+    <w:tmpl w:val="ACA6E528"/>
+    <w:lvl w:ilvl="0" w:tplc="04150001">
+      <w:start w:val="1"/>
+      <w:numFmt w:val="bullet"/>
+      <w:lvlText w:val=""/>
+      <w:lvlJc w:val="left"/>
+      <w:pPr>
+        <w:ind w:left="720" w:hanging="360"/>
+      </w:pPr>
+      <w:rPr>
+        <w:rFonts w:ascii="Symbol" w:hAnsi="Symbol" w:hint="default"/>
+      </w:rPr>
+    </w:lvl>
+    <w:lvl w:ilvl="1" w:tplc="04150003" w:tentative="1">
+      <w:start w:val="1"/>
+      <w:numFmt w:val="bullet"/>
+      <w:lvlText w:val="o"/>
+      <w:lvlJc w:val="left"/>
+      <w:pPr>
+        <w:ind w:left="1440" w:hanging="360"/>
+      </w:pPr>
+      <w:rPr>
+        <w:rFonts w:ascii="Courier New" w:hAnsi="Courier New" w:cs="Courier New" w:hint="default"/>
+      </w:rPr>
+    </w:lvl>
+    <w:lvl w:ilvl="2" w:tplc="04150005" w:tentative="1">
+      <w:start w:val="1"/>
+      <w:numFmt w:val="bullet"/>
+      <w:lvlText w:val=""/>
+      <w:lvlJc w:val="left"/>
+      <w:pPr>
+        <w:ind w:left="2160" w:hanging="360"/>
+      </w:pPr>
+      <w:rPr>
+        <w:rFonts w:ascii="Wingdings" w:hAnsi="Wingdings" w:hint="default"/>
+      </w:rPr>
+    </w:lvl>
+    <w:lvl w:ilvl="3" w:tplc="04150001" w:tentative="1">
+      <w:start w:val="1"/>
+      <w:numFmt w:val="bullet"/>
+      <w:lvlText w:val=""/>
+      <w:lvlJc w:val="left"/>
+      <w:pPr>
+        <w:ind w:left="2880" w:hanging="360"/>
+      </w:pPr>
+      <w:rPr>
+        <w:rFonts w:ascii="Symbol" w:hAnsi="Symbol" w:hint="default"/>
+      </w:rPr>
+    </w:lvl>
+    <w:lvl w:ilvl="4" w:tplc="04150003" w:tentative="1">
+      <w:start w:val="1"/>
+      <w:numFmt w:val="bullet"/>
+      <w:lvlText w:val="o"/>
+      <w:lvlJc w:val="left"/>
+      <w:pPr>
+        <w:ind w:left="3600" w:hanging="360"/>
+      </w:pPr>
+      <w:rPr>
+        <w:rFonts w:ascii="Courier New" w:hAnsi="Courier New" w:cs="Courier New" w:hint="default"/>
+      </w:rPr>
+    </w:lvl>
+    <w:lvl w:ilvl="5" w:tplc="04150005" w:tentative="1">
+      <w:start w:val="1"/>
+      <w:numFmt w:val="bullet"/>
+      <w:lvlText w:val=""/>
+      <w:lvlJc w:val="left"/>
+      <w:pPr>
+        <w:ind w:left="4320" w:hanging="360"/>
+      </w:pPr>
+      <w:rPr>
+        <w:rFonts w:ascii="Wingdings" w:hAnsi="Wingdings" w:hint="default"/>
+      </w:rPr>
+    </w:lvl>
+    <w:lvl w:ilvl="6" w:tplc="04150001" w:tentative="1">
+      <w:start w:val="1"/>
+      <w:numFmt w:val="bullet"/>
+      <w:lvlText w:val=""/>
+      <w:lvlJc w:val="left"/>
+      <w:pPr>
+        <w:ind w:left="5040" w:hanging="360"/>
+      </w:pPr>
+      <w:rPr>
+        <w:rFonts w:ascii="Symbol" w:hAnsi="Symbol" w:hint="default"/>
+      </w:rPr>
+    </w:lvl>
+    <w:lvl w:ilvl="7" w:tplc="04150003" w:tentative="1">
+      <w:start w:val="1"/>
+      <w:numFmt w:val="bullet"/>
+      <w:lvlText w:val="o"/>
+      <w:lvlJc w:val="left"/>
+      <w:pPr>
+        <w:ind w:left="5760" w:hanging="360"/>
+      </w:pPr>
+      <w:rPr>
+        <w:rFonts w:ascii="Courier New" w:hAnsi="Courier New" w:cs="Courier New" w:hint="default"/>
+      </w:rPr>
+    </w:lvl>
+    <w:lvl w:ilvl="8" w:tplc="04150005" w:tentative="1">
+      <w:start w:val="1"/>
+      <w:numFmt w:val="bullet"/>
+      <w:lvlText w:val=""/>
+      <w:lvlJc w:val="left"/>
+      <w:pPr>
+        <w:ind w:left="6480" w:hanging="360"/>
+      </w:pPr>
+      <w:rPr>
+        <w:rFonts w:ascii="Wingdings" w:hAnsi="Wingdings" w:hint="default"/>
+      </w:rPr>
+    </w:lvl>
+  </w:abstractNum>
+  <w:abstractNum w:abstractNumId="11" w15:restartNumberingAfterBreak="0">
     <w:nsid w:val="26BF3407"/>
     <w:multiLevelType w:val="hybridMultilevel"/>
     <w:tmpl w:val="A7B8F0CE"/>
@@ -7024,7 +8673,120 @@
       </w:rPr>
     </w:lvl>
   </w:abstractNum>
-  <w:abstractNum w:abstractNumId="10" w15:restartNumberingAfterBreak="0">
+  <w:abstractNum w:abstractNumId="12" w15:restartNumberingAfterBreak="0">
+    <w:nsid w:val="2A20550C"/>
+    <w:multiLevelType w:val="multilevel"/>
+    <w:tmpl w:val="82AC9A32"/>
+    <w:lvl w:ilvl="0">
+      <w:start w:val="1"/>
+      <w:numFmt w:val="decimal"/>
+      <w:lvlText w:val="%1."/>
+      <w:lvlJc w:val="left"/>
+      <w:pPr>
+        <w:tabs>
+          <w:tab w:val="num" w:pos="720"/>
+        </w:tabs>
+        <w:ind w:left="720" w:hanging="360"/>
+      </w:pPr>
+    </w:lvl>
+    <w:lvl w:ilvl="1" w:tentative="1">
+      <w:start w:val="1"/>
+      <w:numFmt w:val="decimal"/>
+      <w:lvlText w:val="%2."/>
+      <w:lvlJc w:val="left"/>
+      <w:pPr>
+        <w:tabs>
+          <w:tab w:val="num" w:pos="1440"/>
+        </w:tabs>
+        <w:ind w:left="1440" w:hanging="360"/>
+      </w:pPr>
+    </w:lvl>
+    <w:lvl w:ilvl="2" w:tentative="1">
+      <w:start w:val="1"/>
+      <w:numFmt w:val="decimal"/>
+      <w:lvlText w:val="%3."/>
+      <w:lvlJc w:val="left"/>
+      <w:pPr>
+        <w:tabs>
+          <w:tab w:val="num" w:pos="2160"/>
+        </w:tabs>
+        <w:ind w:left="2160" w:hanging="360"/>
+      </w:pPr>
+    </w:lvl>
+    <w:lvl w:ilvl="3" w:tentative="1">
+      <w:start w:val="1"/>
+      <w:numFmt w:val="decimal"/>
+      <w:lvlText w:val="%4."/>
+      <w:lvlJc w:val="left"/>
+      <w:pPr>
+        <w:tabs>
+          <w:tab w:val="num" w:pos="2880"/>
+        </w:tabs>
+        <w:ind w:left="2880" w:hanging="360"/>
+      </w:pPr>
+    </w:lvl>
+    <w:lvl w:ilvl="4" w:tentative="1">
+      <w:start w:val="1"/>
+      <w:numFmt w:val="decimal"/>
+      <w:lvlText w:val="%5."/>
+      <w:lvlJc w:val="left"/>
+      <w:pPr>
+        <w:tabs>
+          <w:tab w:val="num" w:pos="3600"/>
+        </w:tabs>
+        <w:ind w:left="3600" w:hanging="360"/>
+      </w:pPr>
+    </w:lvl>
+    <w:lvl w:ilvl="5" w:tentative="1">
+      <w:start w:val="1"/>
+      <w:numFmt w:val="decimal"/>
+      <w:lvlText w:val="%6."/>
+      <w:lvlJc w:val="left"/>
+      <w:pPr>
+        <w:tabs>
+          <w:tab w:val="num" w:pos="4320"/>
+        </w:tabs>
+        <w:ind w:left="4320" w:hanging="360"/>
+      </w:pPr>
+    </w:lvl>
+    <w:lvl w:ilvl="6" w:tentative="1">
+      <w:start w:val="1"/>
+      <w:numFmt w:val="decimal"/>
+      <w:lvlText w:val="%7."/>
+      <w:lvlJc w:val="left"/>
+      <w:pPr>
+        <w:tabs>
+          <w:tab w:val="num" w:pos="5040"/>
+        </w:tabs>
+        <w:ind w:left="5040" w:hanging="360"/>
+      </w:pPr>
+    </w:lvl>
+    <w:lvl w:ilvl="7" w:tentative="1">
+      <w:start w:val="1"/>
+      <w:numFmt w:val="decimal"/>
+      <w:lvlText w:val="%8."/>
+      <w:lvlJc w:val="left"/>
+      <w:pPr>
+        <w:tabs>
+          <w:tab w:val="num" w:pos="5760"/>
+        </w:tabs>
+        <w:ind w:left="5760" w:hanging="360"/>
+      </w:pPr>
+    </w:lvl>
+    <w:lvl w:ilvl="8" w:tentative="1">
+      <w:start w:val="1"/>
+      <w:numFmt w:val="decimal"/>
+      <w:lvlText w:val="%9."/>
+      <w:lvlJc w:val="left"/>
+      <w:pPr>
+        <w:tabs>
+          <w:tab w:val="num" w:pos="6480"/>
+        </w:tabs>
+        <w:ind w:left="6480" w:hanging="360"/>
+      </w:pPr>
+    </w:lvl>
+  </w:abstractNum>
+  <w:abstractNum w:abstractNumId="13" w15:restartNumberingAfterBreak="0">
     <w:nsid w:val="2B1A3707"/>
     <w:multiLevelType w:val="multilevel"/>
     <w:tmpl w:val="9CF2722E"/>
@@ -7169,7 +8931,7 @@
       </w:rPr>
     </w:lvl>
   </w:abstractNum>
-  <w:abstractNum w:abstractNumId="11" w15:restartNumberingAfterBreak="0">
+  <w:abstractNum w:abstractNumId="14" w15:restartNumberingAfterBreak="0">
     <w:nsid w:val="2BA74DE2"/>
     <w:multiLevelType w:val="multilevel"/>
     <w:tmpl w:val="410E3C84"/>
@@ -7318,7 +9080,7 @@
       </w:rPr>
     </w:lvl>
   </w:abstractNum>
-  <w:abstractNum w:abstractNumId="12" w15:restartNumberingAfterBreak="0">
+  <w:abstractNum w:abstractNumId="15" w15:restartNumberingAfterBreak="0">
     <w:nsid w:val="2CEC031E"/>
     <w:multiLevelType w:val="multilevel"/>
     <w:tmpl w:val="9CFE6DA0"/>
@@ -7463,7 +9225,7 @@
       </w:rPr>
     </w:lvl>
   </w:abstractNum>
-  <w:abstractNum w:abstractNumId="13" w15:restartNumberingAfterBreak="0">
+  <w:abstractNum w:abstractNumId="16" w15:restartNumberingAfterBreak="0">
     <w:nsid w:val="35F369BD"/>
     <w:multiLevelType w:val="hybridMultilevel"/>
     <w:tmpl w:val="93B63F36"/>
@@ -7576,7 +9338,7 @@
       </w:rPr>
     </w:lvl>
   </w:abstractNum>
-  <w:abstractNum w:abstractNumId="14" w15:restartNumberingAfterBreak="0">
+  <w:abstractNum w:abstractNumId="17" w15:restartNumberingAfterBreak="0">
     <w:nsid w:val="38F607C7"/>
     <w:multiLevelType w:val="hybridMultilevel"/>
     <w:tmpl w:val="339E94D0"/>
@@ -7689,7 +9451,7 @@
       </w:rPr>
     </w:lvl>
   </w:abstractNum>
-  <w:abstractNum w:abstractNumId="15" w15:restartNumberingAfterBreak="0">
+  <w:abstractNum w:abstractNumId="18" w15:restartNumberingAfterBreak="0">
     <w:nsid w:val="44F36DEC"/>
     <w:multiLevelType w:val="multilevel"/>
     <w:tmpl w:val="923EE678"/>
@@ -7802,7 +9564,7 @@
       </w:pPr>
     </w:lvl>
   </w:abstractNum>
-  <w:abstractNum w:abstractNumId="16" w15:restartNumberingAfterBreak="0">
+  <w:abstractNum w:abstractNumId="19" w15:restartNumberingAfterBreak="0">
     <w:nsid w:val="47415AED"/>
     <w:multiLevelType w:val="multilevel"/>
     <w:tmpl w:val="0EAEA3E4"/>
@@ -7915,7 +9677,7 @@
       </w:pPr>
     </w:lvl>
   </w:abstractNum>
-  <w:abstractNum w:abstractNumId="17" w15:restartNumberingAfterBreak="0">
+  <w:abstractNum w:abstractNumId="20" w15:restartNumberingAfterBreak="0">
     <w:nsid w:val="4EED2B87"/>
     <w:multiLevelType w:val="hybridMultilevel"/>
     <w:tmpl w:val="5EEC0F3E"/>
@@ -8004,7 +9766,7 @@
       </w:pPr>
     </w:lvl>
   </w:abstractNum>
-  <w:abstractNum w:abstractNumId="18" w15:restartNumberingAfterBreak="0">
+  <w:abstractNum w:abstractNumId="21" w15:restartNumberingAfterBreak="0">
     <w:nsid w:val="50BB61B3"/>
     <w:multiLevelType w:val="multilevel"/>
     <w:tmpl w:val="C1FA40D0"/>
@@ -8117,7 +9879,123 @@
       </w:pPr>
     </w:lvl>
   </w:abstractNum>
-  <w:abstractNum w:abstractNumId="19" w15:restartNumberingAfterBreak="0">
+  <w:abstractNum w:abstractNumId="22" w15:restartNumberingAfterBreak="0">
+    <w:nsid w:val="52925F10"/>
+    <w:multiLevelType w:val="multilevel"/>
+    <w:tmpl w:val="D8781B3A"/>
+    <w:lvl w:ilvl="0">
+      <w:start w:val="1"/>
+      <w:numFmt w:val="bullet"/>
+      <w:lvlText w:val=""/>
+      <w:lvlJc w:val="left"/>
+      <w:pPr>
+        <w:tabs>
+          <w:tab w:val="num" w:pos="720"/>
+        </w:tabs>
+        <w:ind w:left="720" w:hanging="360"/>
+      </w:pPr>
+      <w:rPr>
+        <w:rFonts w:ascii="Symbol" w:hAnsi="Symbol" w:hint="default"/>
+      </w:rPr>
+    </w:lvl>
+    <w:lvl w:ilvl="1" w:tentative="1">
+      <w:start w:val="1"/>
+      <w:numFmt w:val="decimal"/>
+      <w:lvlText w:val="%2."/>
+      <w:lvlJc w:val="left"/>
+      <w:pPr>
+        <w:tabs>
+          <w:tab w:val="num" w:pos="1440"/>
+        </w:tabs>
+        <w:ind w:left="1440" w:hanging="360"/>
+      </w:pPr>
+    </w:lvl>
+    <w:lvl w:ilvl="2" w:tentative="1">
+      <w:start w:val="1"/>
+      <w:numFmt w:val="decimal"/>
+      <w:lvlText w:val="%3."/>
+      <w:lvlJc w:val="left"/>
+      <w:pPr>
+        <w:tabs>
+          <w:tab w:val="num" w:pos="2160"/>
+        </w:tabs>
+        <w:ind w:left="2160" w:hanging="360"/>
+      </w:pPr>
+    </w:lvl>
+    <w:lvl w:ilvl="3" w:tentative="1">
+      <w:start w:val="1"/>
+      <w:numFmt w:val="decimal"/>
+      <w:lvlText w:val="%4."/>
+      <w:lvlJc w:val="left"/>
+      <w:pPr>
+        <w:tabs>
+          <w:tab w:val="num" w:pos="2880"/>
+        </w:tabs>
+        <w:ind w:left="2880" w:hanging="360"/>
+      </w:pPr>
+    </w:lvl>
+    <w:lvl w:ilvl="4" w:tentative="1">
+      <w:start w:val="1"/>
+      <w:numFmt w:val="decimal"/>
+      <w:lvlText w:val="%5."/>
+      <w:lvlJc w:val="left"/>
+      <w:pPr>
+        <w:tabs>
+          <w:tab w:val="num" w:pos="3600"/>
+        </w:tabs>
+        <w:ind w:left="3600" w:hanging="360"/>
+      </w:pPr>
+    </w:lvl>
+    <w:lvl w:ilvl="5" w:tentative="1">
+      <w:start w:val="1"/>
+      <w:numFmt w:val="decimal"/>
+      <w:lvlText w:val="%6."/>
+      <w:lvlJc w:val="left"/>
+      <w:pPr>
+        <w:tabs>
+          <w:tab w:val="num" w:pos="4320"/>
+        </w:tabs>
+        <w:ind w:left="4320" w:hanging="360"/>
+      </w:pPr>
+    </w:lvl>
+    <w:lvl w:ilvl="6" w:tentative="1">
+      <w:start w:val="1"/>
+      <w:numFmt w:val="decimal"/>
+      <w:lvlText w:val="%7."/>
+      <w:lvlJc w:val="left"/>
+      <w:pPr>
+        <w:tabs>
+          <w:tab w:val="num" w:pos="5040"/>
+        </w:tabs>
+        <w:ind w:left="5040" w:hanging="360"/>
+      </w:pPr>
+    </w:lvl>
+    <w:lvl w:ilvl="7" w:tentative="1">
+      <w:start w:val="1"/>
+      <w:numFmt w:val="decimal"/>
+      <w:lvlText w:val="%8."/>
+      <w:lvlJc w:val="left"/>
+      <w:pPr>
+        <w:tabs>
+          <w:tab w:val="num" w:pos="5760"/>
+        </w:tabs>
+        <w:ind w:left="5760" w:hanging="360"/>
+      </w:pPr>
+    </w:lvl>
+    <w:lvl w:ilvl="8" w:tentative="1">
+      <w:start w:val="1"/>
+      <w:numFmt w:val="decimal"/>
+      <w:lvlText w:val="%9."/>
+      <w:lvlJc w:val="left"/>
+      <w:pPr>
+        <w:tabs>
+          <w:tab w:val="num" w:pos="6480"/>
+        </w:tabs>
+        <w:ind w:left="6480" w:hanging="360"/>
+      </w:pPr>
+    </w:lvl>
+  </w:abstractNum>
+  <w:abstractNum w:abstractNumId="23" w15:restartNumberingAfterBreak="0">
     <w:nsid w:val="657212CB"/>
     <w:multiLevelType w:val="hybridMultilevel"/>
     <w:tmpl w:val="6DC6AD4C"/>
@@ -8230,7 +10108,7 @@
       </w:rPr>
     </w:lvl>
   </w:abstractNum>
-  <w:abstractNum w:abstractNumId="20" w15:restartNumberingAfterBreak="0">
+  <w:abstractNum w:abstractNumId="24" w15:restartNumberingAfterBreak="0">
     <w:nsid w:val="665929F8"/>
     <w:multiLevelType w:val="hybridMultilevel"/>
     <w:tmpl w:val="E9A87A78"/>
@@ -8343,7 +10221,7 @@
       </w:rPr>
     </w:lvl>
   </w:abstractNum>
-  <w:abstractNum w:abstractNumId="21" w15:restartNumberingAfterBreak="0">
+  <w:abstractNum w:abstractNumId="25" w15:restartNumberingAfterBreak="0">
     <w:nsid w:val="6BC06973"/>
     <w:multiLevelType w:val="multilevel"/>
     <w:tmpl w:val="82AC9A32"/>
@@ -8456,7 +10334,120 @@
       </w:pPr>
     </w:lvl>
   </w:abstractNum>
-  <w:abstractNum w:abstractNumId="22" w15:restartNumberingAfterBreak="0">
+  <w:abstractNum w:abstractNumId="26" w15:restartNumberingAfterBreak="0">
+    <w:nsid w:val="70EC634F"/>
+    <w:multiLevelType w:val="hybridMultilevel"/>
+    <w:tmpl w:val="2636363C"/>
+    <w:lvl w:ilvl="0" w:tplc="04150001">
+      <w:start w:val="1"/>
+      <w:numFmt w:val="bullet"/>
+      <w:lvlText w:val=""/>
+      <w:lvlJc w:val="left"/>
+      <w:pPr>
+        <w:ind w:left="720" w:hanging="360"/>
+      </w:pPr>
+      <w:rPr>
+        <w:rFonts w:ascii="Symbol" w:hAnsi="Symbol" w:hint="default"/>
+      </w:rPr>
+    </w:lvl>
+    <w:lvl w:ilvl="1" w:tplc="04150003" w:tentative="1">
+      <w:start w:val="1"/>
+      <w:numFmt w:val="bullet"/>
+      <w:lvlText w:val="o"/>
+      <w:lvlJc w:val="left"/>
+      <w:pPr>
+        <w:ind w:left="1440" w:hanging="360"/>
+      </w:pPr>
+      <w:rPr>
+        <w:rFonts w:ascii="Courier New" w:hAnsi="Courier New" w:cs="Courier New" w:hint="default"/>
+      </w:rPr>
+    </w:lvl>
+    <w:lvl w:ilvl="2" w:tplc="04150005" w:tentative="1">
+      <w:start w:val="1"/>
+      <w:numFmt w:val="bullet"/>
+      <w:lvlText w:val=""/>
+      <w:lvlJc w:val="left"/>
+      <w:pPr>
+        <w:ind w:left="2160" w:hanging="360"/>
+      </w:pPr>
+      <w:rPr>
+        <w:rFonts w:ascii="Wingdings" w:hAnsi="Wingdings" w:hint="default"/>
+      </w:rPr>
+    </w:lvl>
+    <w:lvl w:ilvl="3" w:tplc="04150001" w:tentative="1">
+      <w:start w:val="1"/>
+      <w:numFmt w:val="bullet"/>
+      <w:lvlText w:val=""/>
+      <w:lvlJc w:val="left"/>
+      <w:pPr>
+        <w:ind w:left="2880" w:hanging="360"/>
+      </w:pPr>
+      <w:rPr>
+        <w:rFonts w:ascii="Symbol" w:hAnsi="Symbol" w:hint="default"/>
+      </w:rPr>
+    </w:lvl>
+    <w:lvl w:ilvl="4" w:tplc="04150003" w:tentative="1">
+      <w:start w:val="1"/>
+      <w:numFmt w:val="bullet"/>
+      <w:lvlText w:val="o"/>
+      <w:lvlJc w:val="left"/>
+      <w:pPr>
+        <w:ind w:left="3600" w:hanging="360"/>
+      </w:pPr>
+      <w:rPr>
+        <w:rFonts w:ascii="Courier New" w:hAnsi="Courier New" w:cs="Courier New" w:hint="default"/>
+      </w:rPr>
+    </w:lvl>
+    <w:lvl w:ilvl="5" w:tplc="04150005" w:tentative="1">
+      <w:start w:val="1"/>
+      <w:numFmt w:val="bullet"/>
+      <w:lvlText w:val=""/>
+      <w:lvlJc w:val="left"/>
+      <w:pPr>
+        <w:ind w:left="4320" w:hanging="360"/>
+      </w:pPr>
+      <w:rPr>
+        <w:rFonts w:ascii="Wingdings" w:hAnsi="Wingdings" w:hint="default"/>
+      </w:rPr>
+    </w:lvl>
+    <w:lvl w:ilvl="6" w:tplc="04150001" w:tentative="1">
+      <w:start w:val="1"/>
+      <w:numFmt w:val="bullet"/>
+      <w:lvlText w:val=""/>
+      <w:lvlJc w:val="left"/>
+      <w:pPr>
+        <w:ind w:left="5040" w:hanging="360"/>
+      </w:pPr>
+      <w:rPr>
+        <w:rFonts w:ascii="Symbol" w:hAnsi="Symbol" w:hint="default"/>
+      </w:rPr>
+    </w:lvl>
+    <w:lvl w:ilvl="7" w:tplc="04150003" w:tentative="1">
+      <w:start w:val="1"/>
+      <w:numFmt w:val="bullet"/>
+      <w:lvlText w:val="o"/>
+      <w:lvlJc w:val="left"/>
+      <w:pPr>
+        <w:ind w:left="5760" w:hanging="360"/>
+      </w:pPr>
+      <w:rPr>
+        <w:rFonts w:ascii="Courier New" w:hAnsi="Courier New" w:cs="Courier New" w:hint="default"/>
+      </w:rPr>
+    </w:lvl>
+    <w:lvl w:ilvl="8" w:tplc="04150005" w:tentative="1">
+      <w:start w:val="1"/>
+      <w:numFmt w:val="bullet"/>
+      <w:lvlText w:val=""/>
+      <w:lvlJc w:val="left"/>
+      <w:pPr>
+        <w:ind w:left="6480" w:hanging="360"/>
+      </w:pPr>
+      <w:rPr>
+        <w:rFonts w:ascii="Wingdings" w:hAnsi="Wingdings" w:hint="default"/>
+      </w:rPr>
+    </w:lvl>
+  </w:abstractNum>
+  <w:abstractNum w:abstractNumId="27" w15:restartNumberingAfterBreak="0">
     <w:nsid w:val="75080142"/>
     <w:multiLevelType w:val="hybridMultilevel"/>
     <w:tmpl w:val="03201D0A"/>
@@ -8569,7 +10560,7 @@
       </w:rPr>
     </w:lvl>
   </w:abstractNum>
-  <w:abstractNum w:abstractNumId="23" w15:restartNumberingAfterBreak="0">
+  <w:abstractNum w:abstractNumId="28" w15:restartNumberingAfterBreak="0">
     <w:nsid w:val="7707181B"/>
     <w:multiLevelType w:val="multilevel"/>
     <w:tmpl w:val="06F64F5A"/>
@@ -8718,7 +10709,7 @@
       </w:rPr>
     </w:lvl>
   </w:abstractNum>
-  <w:abstractNum w:abstractNumId="24" w15:restartNumberingAfterBreak="0">
+  <w:abstractNum w:abstractNumId="29" w15:restartNumberingAfterBreak="0">
     <w:nsid w:val="7893767E"/>
     <w:multiLevelType w:val="multilevel"/>
     <w:tmpl w:val="464079A8"/>
@@ -8835,7 +10826,7 @@
       </w:pPr>
     </w:lvl>
   </w:abstractNum>
-  <w:abstractNum w:abstractNumId="25" w15:restartNumberingAfterBreak="0">
+  <w:abstractNum w:abstractNumId="30" w15:restartNumberingAfterBreak="0">
     <w:nsid w:val="7D7F410D"/>
     <w:multiLevelType w:val="hybridMultilevel"/>
     <w:tmpl w:val="D032AE7E"/>
@@ -8925,82 +10916,97 @@
     </w:lvl>
   </w:abstractNum>
   <w:num w:numId="1" w16cid:durableId="1250192869">
+    <w:abstractNumId w:val="11"/>
+  </w:num>
+  <w:num w:numId="2" w16cid:durableId="1800950931">
+    <w:abstractNumId w:val="23"/>
+  </w:num>
+  <w:num w:numId="3" w16cid:durableId="2078354071">
     <w:abstractNumId w:val="9"/>
   </w:num>
-  <w:num w:numId="2" w16cid:durableId="1800950931">
-    <w:abstractNumId w:val="19"/>
-  </w:num>
-  <w:num w:numId="3" w16cid:durableId="2078354071">
-    <w:abstractNumId w:val="8"/>
-  </w:num>
   <w:num w:numId="4" w16cid:durableId="2132360051">
-    <w:abstractNumId w:val="22"/>
+    <w:abstractNumId w:val="27"/>
   </w:num>
   <w:num w:numId="5" w16cid:durableId="1771777657">
-    <w:abstractNumId w:val="6"/>
+    <w:abstractNumId w:val="7"/>
   </w:num>
   <w:num w:numId="6" w16cid:durableId="1946379223">
     <w:abstractNumId w:val="2"/>
   </w:num>
   <w:num w:numId="7" w16cid:durableId="1342275070">
-    <w:abstractNumId w:val="17"/>
+    <w:abstractNumId w:val="20"/>
   </w:num>
   <w:num w:numId="8" w16cid:durableId="657611001">
     <w:abstractNumId w:val="3"/>
   </w:num>
   <w:num w:numId="9" w16cid:durableId="730152340">
-    <w:abstractNumId w:val="7"/>
+    <w:abstractNumId w:val="8"/>
   </w:num>
   <w:num w:numId="10" w16cid:durableId="67699396">
-    <w:abstractNumId w:val="13"/>
+    <w:abstractNumId w:val="16"/>
   </w:num>
   <w:num w:numId="11" w16cid:durableId="1496337358">
-    <w:abstractNumId w:val="20"/>
+    <w:abstractNumId w:val="24"/>
   </w:num>
   <w:num w:numId="12" w16cid:durableId="166792611">
-    <w:abstractNumId w:val="15"/>
+    <w:abstractNumId w:val="18"/>
   </w:num>
   <w:num w:numId="13" w16cid:durableId="2107995922">
+    <w:abstractNumId w:val="17"/>
+  </w:num>
+  <w:num w:numId="14" w16cid:durableId="216362750">
     <w:abstractNumId w:val="14"/>
   </w:num>
-  <w:num w:numId="14" w16cid:durableId="216362750">
-    <w:abstractNumId w:val="11"/>
-  </w:num>
   <w:num w:numId="15" w16cid:durableId="1582636275">
-    <w:abstractNumId w:val="18"/>
+    <w:abstractNumId w:val="21"/>
   </w:num>
   <w:num w:numId="16" w16cid:durableId="1227566640">
     <w:abstractNumId w:val="4"/>
   </w:num>
   <w:num w:numId="17" w16cid:durableId="1552813241">
-    <w:abstractNumId w:val="24"/>
+    <w:abstractNumId w:val="29"/>
   </w:num>
   <w:num w:numId="18" w16cid:durableId="219904588">
-    <w:abstractNumId w:val="21"/>
+    <w:abstractNumId w:val="25"/>
   </w:num>
   <w:num w:numId="19" w16cid:durableId="1617567943">
     <w:abstractNumId w:val="0"/>
   </w:num>
   <w:num w:numId="20" w16cid:durableId="1866404704">
-    <w:abstractNumId w:val="10"/>
+    <w:abstractNumId w:val="13"/>
   </w:num>
   <w:num w:numId="21" w16cid:durableId="207687208">
-    <w:abstractNumId w:val="12"/>
+    <w:abstractNumId w:val="15"/>
   </w:num>
   <w:num w:numId="22" w16cid:durableId="1813136223">
-    <w:abstractNumId w:val="16"/>
+    <w:abstractNumId w:val="19"/>
   </w:num>
   <w:num w:numId="23" w16cid:durableId="547767323">
     <w:abstractNumId w:val="1"/>
   </w:num>
   <w:num w:numId="24" w16cid:durableId="2008896593">
-    <w:abstractNumId w:val="25"/>
+    <w:abstractNumId w:val="30"/>
   </w:num>
   <w:num w:numId="25" w16cid:durableId="1696423768">
+    <w:abstractNumId w:val="6"/>
+  </w:num>
+  <w:num w:numId="26" w16cid:durableId="1236470476">
+    <w:abstractNumId w:val="28"/>
+  </w:num>
+  <w:num w:numId="27" w16cid:durableId="1566255182">
+    <w:abstractNumId w:val="26"/>
+  </w:num>
+  <w:num w:numId="28" w16cid:durableId="998340106">
+    <w:abstractNumId w:val="10"/>
+  </w:num>
+  <w:num w:numId="29" w16cid:durableId="45683798">
+    <w:abstractNumId w:val="12"/>
+  </w:num>
+  <w:num w:numId="30" w16cid:durableId="436683933">
     <w:abstractNumId w:val="5"/>
   </w:num>
-  <w:num w:numId="26" w16cid:durableId="1236470476">
-    <w:abstractNumId w:val="23"/>
+  <w:num w:numId="31" w16cid:durableId="1170872106">
+    <w:abstractNumId w:val="22"/>
   </w:num>
 </w:numbering>
 </file>
@@ -9455,7 +11461,6 @@
     <w:next w:val="Normalny"/>
     <w:link w:val="Nagwek3Znak"/>
     <w:uiPriority w:val="9"/>
-    <w:semiHidden/>
     <w:unhideWhenUsed/>
     <w:qFormat/>
     <w:rsid w:val="006F17A7"/>
@@ -9607,6 +11612,7 @@
   <w:style w:type="character" w:default="1" w:styleId="Domylnaczcionkaakapitu">
     <w:name w:val="Default Paragraph Font"/>
     <w:uiPriority w:val="1"/>
+    <w:semiHidden/>
     <w:unhideWhenUsed/>
   </w:style>
   <w:style w:type="table" w:default="1" w:styleId="Standardowy">
@@ -9661,7 +11667,6 @@
     <w:basedOn w:val="Domylnaczcionkaakapitu"/>
     <w:link w:val="Nagwek3"/>
     <w:uiPriority w:val="9"/>
-    <w:semiHidden/>
     <w:rsid w:val="006F17A7"/>
     <w:rPr>
       <w:rFonts w:eastAsiaTheme="majorEastAsia" w:cstheme="majorBidi"/>
@@ -10108,6 +12113,19 @@
     <w:uiPriority w:val="99"/>
     <w:rsid w:val="00833869"/>
   </w:style>
+  <w:style w:type="paragraph" w:styleId="Spistreci3">
+    <w:name w:val="toc 3"/>
+    <w:basedOn w:val="Normalny"/>
+    <w:next w:val="Normalny"/>
+    <w:autoRedefine/>
+    <w:uiPriority w:val="39"/>
+    <w:unhideWhenUsed/>
+    <w:rsid w:val="001A6E43"/>
+    <w:pPr>
+      <w:spacing w:after="100"/>
+      <w:ind w:left="480"/>
+    </w:pPr>
+  </w:style>
 </w:styles>
 </file>
 

</xml_diff>

<commit_message>
Drobne poprawki w dokumencie
</commit_message>
<xml_diff>
--- a/Doc/Przykładowe rozwiązania architektoniczne na customowym silniku gry.docx
+++ b/Doc/Przykładowe rozwiązania architektoniczne na customowym silniku gry.docx
@@ -33,11 +33,15 @@
             <w:jc w:val="center"/>
             <w:rPr>
               <w:rStyle w:val="TytuZnak"/>
+              <w:b/>
+              <w:bCs/>
             </w:rPr>
           </w:pPr>
           <w:r>
             <w:rPr>
               <w:rStyle w:val="TytuZnak"/>
+              <w:b/>
+              <w:bCs/>
             </w:rPr>
             <w:t>Spis treści</w:t>
           </w:r>
@@ -76,7 +80,7 @@
             </w:rPr>
             <w:fldChar w:fldCharType="separate"/>
           </w:r>
-          <w:hyperlink w:anchor="_Toc235829271" w:history="1">
+          <w:hyperlink w:anchor="_Toc235900930" w:history="1">
             <w:r>
               <w:rPr>
                 <w:rStyle w:val="Hipercze"/>
@@ -99,7 +103,7 @@
               <w:rPr>
                 <w:webHidden/>
               </w:rPr>
-              <w:instrText xml:space="preserve"> PAGEREF _Toc235829271 \h </w:instrText>
+              <w:instrText xml:space="preserve"> PAGEREF _Toc235900930 \h </w:instrText>
             </w:r>
             <w:r>
               <w:rPr>
@@ -139,7 +143,7 @@
               <w:lang w:eastAsia="pl-PL"/>
             </w:rPr>
           </w:pPr>
-          <w:hyperlink w:anchor="_Toc235829272" w:history="1">
+          <w:hyperlink w:anchor="_Toc235900931" w:history="1">
             <w:r>
               <w:rPr>
                 <w:rStyle w:val="Hipercze"/>
@@ -166,7 +170,7 @@
                 <w:noProof/>
                 <w:webHidden/>
               </w:rPr>
-              <w:instrText xml:space="preserve"> PAGEREF _Toc235829272 \h </w:instrText>
+              <w:instrText xml:space="preserve"> PAGEREF _Toc235900931 \h </w:instrText>
             </w:r>
             <w:r>
               <w:rPr>
@@ -210,7 +214,7 @@
               <w:lang w:eastAsia="pl-PL"/>
             </w:rPr>
           </w:pPr>
-          <w:hyperlink w:anchor="_Toc235829273" w:history="1">
+          <w:hyperlink w:anchor="_Toc235900932" w:history="1">
             <w:r>
               <w:rPr>
                 <w:rStyle w:val="Hipercze"/>
@@ -237,7 +241,7 @@
                 <w:noProof/>
                 <w:webHidden/>
               </w:rPr>
-              <w:instrText xml:space="preserve"> PAGEREF _Toc235829273 \h </w:instrText>
+              <w:instrText xml:space="preserve"> PAGEREF _Toc235900932 \h </w:instrText>
             </w:r>
             <w:r>
               <w:rPr>
@@ -281,7 +285,7 @@
               <w:lang w:eastAsia="pl-PL"/>
             </w:rPr>
           </w:pPr>
-          <w:hyperlink w:anchor="_Toc235829274" w:history="1">
+          <w:hyperlink w:anchor="_Toc235900933" w:history="1">
             <w:r>
               <w:rPr>
                 <w:rStyle w:val="Hipercze"/>
@@ -308,7 +312,7 @@
                 <w:noProof/>
                 <w:webHidden/>
               </w:rPr>
-              <w:instrText xml:space="preserve"> PAGEREF _Toc235829274 \h </w:instrText>
+              <w:instrText xml:space="preserve"> PAGEREF _Toc235900933 \h </w:instrText>
             </w:r>
             <w:r>
               <w:rPr>
@@ -352,7 +356,7 @@
               <w:lang w:eastAsia="pl-PL"/>
             </w:rPr>
           </w:pPr>
-          <w:hyperlink w:anchor="_Toc235829275" w:history="1">
+          <w:hyperlink w:anchor="_Toc235900934" w:history="1">
             <w:r>
               <w:rPr>
                 <w:rStyle w:val="Hipercze"/>
@@ -379,7 +383,7 @@
                 <w:noProof/>
                 <w:webHidden/>
               </w:rPr>
-              <w:instrText xml:space="preserve"> PAGEREF _Toc235829275 \h </w:instrText>
+              <w:instrText xml:space="preserve"> PAGEREF _Toc235900934 \h </w:instrText>
             </w:r>
             <w:r>
               <w:rPr>
@@ -423,7 +427,7 @@
               <w:lang w:eastAsia="pl-PL"/>
             </w:rPr>
           </w:pPr>
-          <w:hyperlink w:anchor="_Toc235829276" w:history="1">
+          <w:hyperlink w:anchor="_Toc235900935" w:history="1">
             <w:r>
               <w:rPr>
                 <w:rStyle w:val="Hipercze"/>
@@ -446,7 +450,7 @@
               <w:rPr>
                 <w:webHidden/>
               </w:rPr>
-              <w:instrText xml:space="preserve"> PAGEREF _Toc235829276 \h </w:instrText>
+              <w:instrText xml:space="preserve"> PAGEREF _Toc235900935 \h </w:instrText>
             </w:r>
             <w:r>
               <w:rPr>
@@ -486,7 +490,7 @@
               <w:lang w:eastAsia="pl-PL"/>
             </w:rPr>
           </w:pPr>
-          <w:hyperlink w:anchor="_Toc235829277" w:history="1">
+          <w:hyperlink w:anchor="_Toc235900936" w:history="1">
             <w:r>
               <w:rPr>
                 <w:rStyle w:val="Hipercze"/>
@@ -513,7 +517,7 @@
                 <w:noProof/>
                 <w:webHidden/>
               </w:rPr>
-              <w:instrText xml:space="preserve"> PAGEREF _Toc235829277 \h </w:instrText>
+              <w:instrText xml:space="preserve"> PAGEREF _Toc235900936 \h </w:instrText>
             </w:r>
             <w:r>
               <w:rPr>
@@ -557,7 +561,7 @@
               <w:lang w:eastAsia="pl-PL"/>
             </w:rPr>
           </w:pPr>
-          <w:hyperlink w:anchor="_Toc235829278" w:history="1">
+          <w:hyperlink w:anchor="_Toc235900937" w:history="1">
             <w:r>
               <w:rPr>
                 <w:rStyle w:val="Hipercze"/>
@@ -584,7 +588,7 @@
                 <w:noProof/>
                 <w:webHidden/>
               </w:rPr>
-              <w:instrText xml:space="preserve"> PAGEREF _Toc235829278 \h </w:instrText>
+              <w:instrText xml:space="preserve"> PAGEREF _Toc235900937 \h </w:instrText>
             </w:r>
             <w:r>
               <w:rPr>
@@ -628,7 +632,7 @@
               <w:lang w:eastAsia="pl-PL"/>
             </w:rPr>
           </w:pPr>
-          <w:hyperlink w:anchor="_Toc235829279" w:history="1">
+          <w:hyperlink w:anchor="_Toc235900938" w:history="1">
             <w:r>
               <w:rPr>
                 <w:rStyle w:val="Hipercze"/>
@@ -676,7 +680,7 @@
                 <w:noProof/>
                 <w:webHidden/>
               </w:rPr>
-              <w:instrText xml:space="preserve"> PAGEREF _Toc235829279 \h </w:instrText>
+              <w:instrText xml:space="preserve"> PAGEREF _Toc235900938 \h </w:instrText>
             </w:r>
             <w:r>
               <w:rPr>
@@ -720,7 +724,7 @@
               <w:lang w:eastAsia="pl-PL"/>
             </w:rPr>
           </w:pPr>
-          <w:hyperlink w:anchor="_Toc235829280" w:history="1">
+          <w:hyperlink w:anchor="_Toc235900939" w:history="1">
             <w:r>
               <w:rPr>
                 <w:rStyle w:val="Hipercze"/>
@@ -747,7 +751,7 @@
                 <w:noProof/>
                 <w:webHidden/>
               </w:rPr>
-              <w:instrText xml:space="preserve"> PAGEREF _Toc235829280 \h </w:instrText>
+              <w:instrText xml:space="preserve"> PAGEREF _Toc235900939 \h </w:instrText>
             </w:r>
             <w:r>
               <w:rPr>
@@ -791,7 +795,7 @@
               <w:lang w:eastAsia="pl-PL"/>
             </w:rPr>
           </w:pPr>
-          <w:hyperlink w:anchor="_Toc235829281" w:history="1">
+          <w:hyperlink w:anchor="_Toc235900940" w:history="1">
             <w:r>
               <w:rPr>
                 <w:rStyle w:val="Hipercze"/>
@@ -814,7 +818,7 @@
               <w:rPr>
                 <w:webHidden/>
               </w:rPr>
-              <w:instrText xml:space="preserve"> PAGEREF _Toc235829281 \h </w:instrText>
+              <w:instrText xml:space="preserve"> PAGEREF _Toc235900940 \h </w:instrText>
             </w:r>
             <w:r>
               <w:rPr>
@@ -854,7 +858,7 @@
               <w:lang w:eastAsia="pl-PL"/>
             </w:rPr>
           </w:pPr>
-          <w:hyperlink w:anchor="_Toc235829282" w:history="1">
+          <w:hyperlink w:anchor="_Toc235900941" w:history="1">
             <w:r>
               <w:rPr>
                 <w:rStyle w:val="Hipercze"/>
@@ -881,7 +885,7 @@
                 <w:noProof/>
                 <w:webHidden/>
               </w:rPr>
-              <w:instrText xml:space="preserve"> PAGEREF _Toc235829282 \h </w:instrText>
+              <w:instrText xml:space="preserve"> PAGEREF _Toc235900941 \h </w:instrText>
             </w:r>
             <w:r>
               <w:rPr>
@@ -925,7 +929,7 @@
               <w:lang w:eastAsia="pl-PL"/>
             </w:rPr>
           </w:pPr>
-          <w:hyperlink w:anchor="_Toc235829283" w:history="1">
+          <w:hyperlink w:anchor="_Toc235900942" w:history="1">
             <w:r>
               <w:rPr>
                 <w:rStyle w:val="Hipercze"/>
@@ -952,7 +956,7 @@
                 <w:noProof/>
                 <w:webHidden/>
               </w:rPr>
-              <w:instrText xml:space="preserve"> PAGEREF _Toc235829283 \h </w:instrText>
+              <w:instrText xml:space="preserve"> PAGEREF _Toc235900942 \h </w:instrText>
             </w:r>
             <w:r>
               <w:rPr>
@@ -996,7 +1000,7 @@
               <w:lang w:eastAsia="pl-PL"/>
             </w:rPr>
           </w:pPr>
-          <w:hyperlink w:anchor="_Toc235829284" w:history="1">
+          <w:hyperlink w:anchor="_Toc235900943" w:history="1">
             <w:r>
               <w:rPr>
                 <w:rStyle w:val="Hipercze"/>
@@ -1023,7 +1027,7 @@
                 <w:noProof/>
                 <w:webHidden/>
               </w:rPr>
-              <w:instrText xml:space="preserve"> PAGEREF _Toc235829284 \h </w:instrText>
+              <w:instrText xml:space="preserve"> PAGEREF _Toc235900943 \h </w:instrText>
             </w:r>
             <w:r>
               <w:rPr>
@@ -1067,7 +1071,7 @@
               <w:lang w:eastAsia="pl-PL"/>
             </w:rPr>
           </w:pPr>
-          <w:hyperlink w:anchor="_Toc235829285" w:history="1">
+          <w:hyperlink w:anchor="_Toc235900944" w:history="1">
             <w:r>
               <w:rPr>
                 <w:rStyle w:val="Hipercze"/>
@@ -1095,7 +1099,7 @@
                 <w:noProof/>
                 <w:webHidden/>
               </w:rPr>
-              <w:instrText xml:space="preserve"> PAGEREF _Toc235829285 \h </w:instrText>
+              <w:instrText xml:space="preserve"> PAGEREF _Toc235900944 \h </w:instrText>
             </w:r>
             <w:r>
               <w:rPr>
@@ -1139,7 +1143,7 @@
               <w:lang w:eastAsia="pl-PL"/>
             </w:rPr>
           </w:pPr>
-          <w:hyperlink w:anchor="_Toc235829286" w:history="1">
+          <w:hyperlink w:anchor="_Toc235900945" w:history="1">
             <w:r>
               <w:rPr>
                 <w:rStyle w:val="Hipercze"/>
@@ -1166,7 +1170,7 @@
                 <w:noProof/>
                 <w:webHidden/>
               </w:rPr>
-              <w:instrText xml:space="preserve"> PAGEREF _Toc235829286 \h </w:instrText>
+              <w:instrText xml:space="preserve"> PAGEREF _Toc235900945 \h </w:instrText>
             </w:r>
             <w:r>
               <w:rPr>
@@ -1210,7 +1214,7 @@
               <w:lang w:eastAsia="pl-PL"/>
             </w:rPr>
           </w:pPr>
-          <w:hyperlink w:anchor="_Toc235829287" w:history="1">
+          <w:hyperlink w:anchor="_Toc235900946" w:history="1">
             <w:r>
               <w:rPr>
                 <w:rStyle w:val="Hipercze"/>
@@ -1237,7 +1241,7 @@
                 <w:noProof/>
                 <w:webHidden/>
               </w:rPr>
-              <w:instrText xml:space="preserve"> PAGEREF _Toc235829287 \h </w:instrText>
+              <w:instrText xml:space="preserve"> PAGEREF _Toc235900946 \h </w:instrText>
             </w:r>
             <w:r>
               <w:rPr>
@@ -1281,7 +1285,7 @@
               <w:lang w:eastAsia="pl-PL"/>
             </w:rPr>
           </w:pPr>
-          <w:hyperlink w:anchor="_Toc235829288" w:history="1">
+          <w:hyperlink w:anchor="_Toc235900947" w:history="1">
             <w:r>
               <w:rPr>
                 <w:rStyle w:val="Hipercze"/>
@@ -1308,7 +1312,7 @@
                 <w:noProof/>
                 <w:webHidden/>
               </w:rPr>
-              <w:instrText xml:space="preserve"> PAGEREF _Toc235829288 \h </w:instrText>
+              <w:instrText xml:space="preserve"> PAGEREF _Toc235900947 \h </w:instrText>
             </w:r>
             <w:r>
               <w:rPr>
@@ -1352,7 +1356,7 @@
               <w:lang w:eastAsia="pl-PL"/>
             </w:rPr>
           </w:pPr>
-          <w:hyperlink w:anchor="_Toc235829289" w:history="1">
+          <w:hyperlink w:anchor="_Toc235900948" w:history="1">
             <w:r>
               <w:rPr>
                 <w:rStyle w:val="Hipercze"/>
@@ -1379,7 +1383,7 @@
                 <w:noProof/>
                 <w:webHidden/>
               </w:rPr>
-              <w:instrText xml:space="preserve"> PAGEREF _Toc235829289 \h </w:instrText>
+              <w:instrText xml:space="preserve"> PAGEREF _Toc235900948 \h </w:instrText>
             </w:r>
             <w:r>
               <w:rPr>
@@ -1423,12 +1427,12 @@
               <w:lang w:eastAsia="pl-PL"/>
             </w:rPr>
           </w:pPr>
-          <w:hyperlink w:anchor="_Toc235829290" w:history="1">
+          <w:hyperlink w:anchor="_Toc235900949" w:history="1">
             <w:r>
               <w:rPr>
                 <w:rStyle w:val="Hipercze"/>
               </w:rPr>
-              <w:t>Wzorce do implementacji wybrane przeze mnie</w:t>
+              <w:t>Wzorce do implementacji  - wybrane przeze mnie</w:t>
             </w:r>
             <w:r>
               <w:rPr>
@@ -1446,7 +1450,7 @@
               <w:rPr>
                 <w:webHidden/>
               </w:rPr>
-              <w:instrText xml:space="preserve"> PAGEREF _Toc235829290 \h </w:instrText>
+              <w:instrText xml:space="preserve"> PAGEREF _Toc235900949 \h </w:instrText>
             </w:r>
             <w:r>
               <w:rPr>
@@ -1486,7 +1490,7 @@
               <w:lang w:eastAsia="pl-PL"/>
             </w:rPr>
           </w:pPr>
-          <w:hyperlink w:anchor="_Toc235829291" w:history="1">
+          <w:hyperlink w:anchor="_Toc235900950" w:history="1">
             <w:r>
               <w:rPr>
                 <w:rStyle w:val="Hipercze"/>
@@ -1515,7 +1519,7 @@
                 <w:noProof/>
                 <w:webHidden/>
               </w:rPr>
-              <w:instrText xml:space="preserve"> PAGEREF _Toc235829291 \h </w:instrText>
+              <w:instrText xml:space="preserve"> PAGEREF _Toc235900950 \h </w:instrText>
             </w:r>
             <w:r>
               <w:rPr>
@@ -1559,7 +1563,7 @@
               <w:lang w:eastAsia="pl-PL"/>
             </w:rPr>
           </w:pPr>
-          <w:hyperlink w:anchor="_Toc235829292" w:history="1">
+          <w:hyperlink w:anchor="_Toc235900951" w:history="1">
             <w:r>
               <w:rPr>
                 <w:rStyle w:val="Hipercze"/>
@@ -1586,7 +1590,7 @@
                 <w:noProof/>
                 <w:webHidden/>
               </w:rPr>
-              <w:instrText xml:space="preserve"> PAGEREF _Toc235829292 \h </w:instrText>
+              <w:instrText xml:space="preserve"> PAGEREF _Toc235900951 \h </w:instrText>
             </w:r>
             <w:r>
               <w:rPr>
@@ -1630,7 +1634,7 @@
               <w:lang w:eastAsia="pl-PL"/>
             </w:rPr>
           </w:pPr>
-          <w:hyperlink w:anchor="_Toc235829293" w:history="1">
+          <w:hyperlink w:anchor="_Toc235900952" w:history="1">
             <w:r>
               <w:rPr>
                 <w:rStyle w:val="Hipercze"/>
@@ -1657,7 +1661,7 @@
                 <w:noProof/>
                 <w:webHidden/>
               </w:rPr>
-              <w:instrText xml:space="preserve"> PAGEREF _Toc235829293 \h </w:instrText>
+              <w:instrText xml:space="preserve"> PAGEREF _Toc235900952 \h </w:instrText>
             </w:r>
             <w:r>
               <w:rPr>
@@ -1701,12 +1705,11 @@
               <w:lang w:eastAsia="pl-PL"/>
             </w:rPr>
           </w:pPr>
-          <w:hyperlink w:anchor="_Toc235829294" w:history="1">
+          <w:hyperlink w:anchor="_Toc235900953" w:history="1">
             <w:r>
               <w:rPr>
                 <w:rStyle w:val="Hipercze"/>
                 <w:noProof/>
-                <w:lang w:val="en-GB"/>
               </w:rPr>
               <w:t>3. Wzorzec ECS (Entity Component System)</w:t>
             </w:r>
@@ -1729,7 +1732,7 @@
                 <w:noProof/>
                 <w:webHidden/>
               </w:rPr>
-              <w:instrText xml:space="preserve"> PAGEREF _Toc235829294 \h </w:instrText>
+              <w:instrText xml:space="preserve"> PAGEREF _Toc235900953 \h </w:instrText>
             </w:r>
             <w:r>
               <w:rPr>
@@ -1773,7 +1776,7 @@
               <w:lang w:eastAsia="pl-PL"/>
             </w:rPr>
           </w:pPr>
-          <w:hyperlink w:anchor="_Toc235829295" w:history="1">
+          <w:hyperlink w:anchor="_Toc235900954" w:history="1">
             <w:r>
               <w:rPr>
                 <w:rStyle w:val="Hipercze"/>
@@ -1800,7 +1803,7 @@
                 <w:noProof/>
                 <w:webHidden/>
               </w:rPr>
-              <w:instrText xml:space="preserve"> PAGEREF _Toc235829295 \h </w:instrText>
+              <w:instrText xml:space="preserve"> PAGEREF _Toc235900954 \h </w:instrText>
             </w:r>
             <w:r>
               <w:rPr>
@@ -1844,7 +1847,7 @@
               <w:lang w:eastAsia="pl-PL"/>
             </w:rPr>
           </w:pPr>
-          <w:hyperlink w:anchor="_Toc235829296" w:history="1">
+          <w:hyperlink w:anchor="_Toc235900955" w:history="1">
             <w:r>
               <w:rPr>
                 <w:rStyle w:val="Hipercze"/>
@@ -1872,7 +1875,7 @@
                 <w:noProof/>
                 <w:webHidden/>
               </w:rPr>
-              <w:instrText xml:space="preserve"> PAGEREF _Toc235829296 \h </w:instrText>
+              <w:instrText xml:space="preserve"> PAGEREF _Toc235900955 \h </w:instrText>
             </w:r>
             <w:r>
               <w:rPr>
@@ -1916,7 +1919,7 @@
               <w:lang w:eastAsia="pl-PL"/>
             </w:rPr>
           </w:pPr>
-          <w:hyperlink w:anchor="_Toc235829297" w:history="1">
+          <w:hyperlink w:anchor="_Toc235900956" w:history="1">
             <w:r>
               <w:rPr>
                 <w:rStyle w:val="Hipercze"/>
@@ -1943,7 +1946,7 @@
                 <w:noProof/>
                 <w:webHidden/>
               </w:rPr>
-              <w:instrText xml:space="preserve"> PAGEREF _Toc235829297 \h </w:instrText>
+              <w:instrText xml:space="preserve"> PAGEREF _Toc235900956 \h </w:instrText>
             </w:r>
             <w:r>
               <w:rPr>
@@ -1987,7 +1990,7 @@
               <w:lang w:eastAsia="pl-PL"/>
             </w:rPr>
           </w:pPr>
-          <w:hyperlink w:anchor="_Toc235829298" w:history="1">
+          <w:hyperlink w:anchor="_Toc235900957" w:history="1">
             <w:r>
               <w:rPr>
                 <w:rStyle w:val="Hipercze"/>
@@ -2014,7 +2017,7 @@
                 <w:noProof/>
                 <w:webHidden/>
               </w:rPr>
-              <w:instrText xml:space="preserve"> PAGEREF _Toc235829298 \h </w:instrText>
+              <w:instrText xml:space="preserve"> PAGEREF _Toc235900957 \h </w:instrText>
             </w:r>
             <w:r>
               <w:rPr>
@@ -2083,7 +2086,7 @@
           <w:bCs/>
         </w:rPr>
       </w:pPr>
-      <w:bookmarkStart w:id="0" w:name="_Toc235829271"/>
+      <w:bookmarkStart w:id="0" w:name="_Toc235900930"/>
       <w:r>
         <w:rPr>
           <w:b/>
@@ -2159,7 +2162,7 @@
       <w:pPr>
         <w:pStyle w:val="Nagwek2"/>
       </w:pPr>
-      <w:bookmarkStart w:id="1" w:name="_Toc235829272"/>
+      <w:bookmarkStart w:id="1" w:name="_Toc235900931"/>
       <w:r>
         <w:t>Architektura Silnika i Gry (Zarządzanie Danymi)</w:t>
       </w:r>
@@ -2275,7 +2278,7 @@
       <w:pPr>
         <w:pStyle w:val="Nagwek2"/>
       </w:pPr>
-      <w:bookmarkStart w:id="2" w:name="_Toc235829273"/>
+      <w:bookmarkStart w:id="2" w:name="_Toc235900932"/>
       <w:r>
         <w:t>Renderowanie i Grafika 3D</w:t>
       </w:r>
@@ -2404,7 +2407,7 @@
       <w:pPr>
         <w:pStyle w:val="Nagwek2"/>
       </w:pPr>
-      <w:bookmarkStart w:id="3" w:name="_Toc235829274"/>
+      <w:bookmarkStart w:id="3" w:name="_Toc235900933"/>
       <w:r>
         <w:t>Logika Rozgrywki (Mechaniki Diablo)</w:t>
       </w:r>
@@ -2487,7 +2490,7 @@
       <w:pPr>
         <w:pStyle w:val="Nagwek2"/>
       </w:pPr>
-      <w:bookmarkStart w:id="4" w:name="_Toc235829275"/>
+      <w:bookmarkStart w:id="4" w:name="_Toc235900934"/>
       <w:r>
         <w:t>Optymalizacja i Systemy Wspierające</w:t>
       </w:r>
@@ -2566,7 +2569,7 @@
           <w:bCs/>
         </w:rPr>
       </w:pPr>
-      <w:bookmarkStart w:id="5" w:name="_Toc235829276"/>
+      <w:bookmarkStart w:id="5" w:name="_Toc235900935"/>
       <w:r>
         <w:rPr>
           <w:b/>
@@ -2630,7 +2633,7 @@
       <w:pPr>
         <w:pStyle w:val="Nagwek2"/>
       </w:pPr>
-      <w:bookmarkStart w:id="6" w:name="_Toc235829277"/>
+      <w:bookmarkStart w:id="6" w:name="_Toc235900936"/>
       <w:r>
         <w:t>Rdzeń silnika i renderowani</w:t>
       </w:r>
@@ -2752,7 +2755,7 @@
       <w:pPr>
         <w:pStyle w:val="Nagwek2"/>
       </w:pPr>
-      <w:bookmarkStart w:id="7" w:name="_Toc235829278"/>
+      <w:bookmarkStart w:id="7" w:name="_Toc235900937"/>
       <w:r>
         <w:t>Architektura danych i gry</w:t>
       </w:r>
@@ -2837,7 +2840,7 @@
       <w:pPr>
         <w:pStyle w:val="Nagwek2"/>
       </w:pPr>
-      <w:bookmarkStart w:id="8" w:name="_Toc235829279"/>
+      <w:bookmarkStart w:id="8" w:name="_Toc235900938"/>
       <w:r>
         <w:t xml:space="preserve">Komunikacja wielowątkowa (WinForms </w:t>
       </w:r>
@@ -2938,7 +2941,7 @@
       <w:pPr>
         <w:pStyle w:val="Nagwek2"/>
       </w:pPr>
-      <w:bookmarkStart w:id="9" w:name="_Toc235829280"/>
+      <w:bookmarkStart w:id="9" w:name="_Toc235900939"/>
       <w:r>
         <w:t>Logika i sztuczna inteligencja</w:t>
       </w:r>
@@ -3006,7 +3009,7 @@
           <w:bCs/>
         </w:rPr>
       </w:pPr>
-      <w:bookmarkStart w:id="10" w:name="_Toc235829281"/>
+      <w:bookmarkStart w:id="10" w:name="_Toc235900940"/>
       <w:r>
         <w:rPr>
           <w:b/>
@@ -3020,7 +3023,7 @@
       <w:pPr>
         <w:pStyle w:val="Nagwek2"/>
       </w:pPr>
-      <w:bookmarkStart w:id="11" w:name="_Toc235829282"/>
+      <w:bookmarkStart w:id="11" w:name="_Toc235900941"/>
       <w:r>
         <w:t>1. Wzorzec Pętli Gry (Game Loop)</w:t>
       </w:r>
@@ -3138,7 +3141,7 @@
       <w:pPr>
         <w:pStyle w:val="Nagwek2"/>
       </w:pPr>
-      <w:bookmarkStart w:id="12" w:name="_Toc235829283"/>
+      <w:bookmarkStart w:id="12" w:name="_Toc235900942"/>
       <w:r>
         <w:t>2. Wzorzec Pyłku (Flyweight)</w:t>
       </w:r>
@@ -3251,7 +3254,7 @@
       <w:pPr>
         <w:pStyle w:val="Nagwek2"/>
       </w:pPr>
-      <w:bookmarkStart w:id="13" w:name="_Toc235829284"/>
+      <w:bookmarkStart w:id="13" w:name="_Toc235900943"/>
       <w:r>
         <w:t xml:space="preserve">3. </w:t>
       </w:r>
@@ -3363,7 +3366,7 @@
           <w:lang w:val="en-GB"/>
         </w:rPr>
       </w:pPr>
-      <w:bookmarkStart w:id="14" w:name="_Toc235829285"/>
+      <w:bookmarkStart w:id="14" w:name="_Toc235900944"/>
       <w:r>
         <w:rPr>
           <w:lang w:val="en-GB"/>
@@ -3755,7 +3758,7 @@
       <w:pPr>
         <w:pStyle w:val="Nagwek2"/>
       </w:pPr>
-      <w:bookmarkStart w:id="15" w:name="_Toc235829286"/>
+      <w:bookmarkStart w:id="15" w:name="_Toc235900945"/>
       <w:r>
         <w:t>5. Projektowanie sterowane danymi (Data-Driven Design)</w:t>
       </w:r>
@@ -4529,7 +4532,7 @@
       <w:pPr>
         <w:pStyle w:val="Nagwek2"/>
       </w:pPr>
-      <w:bookmarkStart w:id="16" w:name="_Toc235829287"/>
+      <w:bookmarkStart w:id="16" w:name="_Toc235900946"/>
       <w:r>
         <w:t>6. Wzorzec polecenia (Command Buffer)</w:t>
       </w:r>
@@ -5535,7 +5538,7 @@
       <w:pPr>
         <w:pStyle w:val="Nagwek2"/>
       </w:pPr>
-      <w:bookmarkStart w:id="17" w:name="_Toc235829288"/>
+      <w:bookmarkStart w:id="17" w:name="_Toc235900947"/>
       <w:r>
         <w:t>7. Wzorzec Obserwatora (Observer)</w:t>
       </w:r>
@@ -6024,7 +6027,7 @@
       <w:pPr>
         <w:pStyle w:val="Nagwek2"/>
       </w:pPr>
-      <w:bookmarkStart w:id="18" w:name="_Toc235829289"/>
+      <w:bookmarkStart w:id="18" w:name="_Toc235900948"/>
       <w:r>
         <w:t>8. Maszyna Stanów (FSM)</w:t>
       </w:r>
@@ -6401,14 +6404,28 @@
           <w:bCs/>
         </w:rPr>
       </w:pPr>
-      <w:bookmarkStart w:id="19" w:name="_Toc235829290"/>
+      <w:bookmarkStart w:id="19" w:name="_Toc235900949"/>
       <w:r>
         <w:rPr>
           <w:b/>
           <w:bCs/>
         </w:rPr>
         <w:lastRenderedPageBreak/>
-        <w:t>Wzorce do implementacji wybrane przeze mnie</w:t>
+        <w:t xml:space="preserve">Wzorce do implementacji </w:t>
+      </w:r>
+      <w:r>
+        <w:rPr>
+          <w:b/>
+          <w:bCs/>
+        </w:rPr>
+        <w:t xml:space="preserve"> - </w:t>
+      </w:r>
+      <w:r>
+        <w:rPr>
+          <w:b/>
+          <w:bCs/>
+        </w:rPr>
+        <w:t>wybrane przeze mnie</w:t>
       </w:r>
       <w:bookmarkEnd w:id="19"/>
     </w:p>
@@ -6565,7 +6582,7 @@
           <w:bCs/>
         </w:rPr>
       </w:pPr>
-      <w:bookmarkStart w:id="20" w:name="_Toc235829291"/>
+      <w:bookmarkStart w:id="20" w:name="_Toc235900950"/>
       <w:r>
         <w:rPr>
           <w:b/>
@@ -6579,7 +6596,7 @@
       <w:pPr>
         <w:pStyle w:val="Nagwek3"/>
       </w:pPr>
-      <w:bookmarkStart w:id="21" w:name="_Toc235829292"/>
+      <w:bookmarkStart w:id="21" w:name="_Toc235900951"/>
       <w:r>
         <w:t xml:space="preserve">1. </w:t>
       </w:r>
@@ -6624,7 +6641,7 @@
       <w:pPr>
         <w:pStyle w:val="Nagwek3"/>
       </w:pPr>
-      <w:bookmarkStart w:id="22" w:name="_Toc235829293"/>
+      <w:bookmarkStart w:id="22" w:name="_Toc235900952"/>
       <w:r>
         <w:t>2. Wzorzec Pyłku (Flyweight) + Wzorzec Odmiany: Pula Obiektów (Object Pool)</w:t>
       </w:r>
@@ -6695,15 +6712,9 @@
     <w:p>
       <w:pPr>
         <w:pStyle w:val="Nagwek3"/>
-        <w:rPr>
-          <w:lang w:val="en-GB"/>
-        </w:rPr>
-      </w:pPr>
-      <w:bookmarkStart w:id="23" w:name="_Toc235829294"/>
-      <w:r>
-        <w:rPr>
-          <w:lang w:val="en-GB"/>
-        </w:rPr>
+      </w:pPr>
+      <w:bookmarkStart w:id="23" w:name="_Toc235900953"/>
+      <w:r>
         <w:t>3. Wzorzec ECS (Entity Component System)</w:t>
       </w:r>
       <w:bookmarkEnd w:id="23"/>
@@ -6791,7 +6802,7 @@
       <w:pPr>
         <w:pStyle w:val="Nagwek3"/>
       </w:pPr>
-      <w:bookmarkStart w:id="24" w:name="_Toc235829295"/>
+      <w:bookmarkStart w:id="24" w:name="_Toc235900954"/>
       <w:r>
         <w:t>4. Projektowanie Sterowane Danymi (Data-Driven Design)</w:t>
       </w:r>
@@ -6876,7 +6887,7 @@
           <w:lang w:val="en-GB"/>
         </w:rPr>
       </w:pPr>
-      <w:bookmarkStart w:id="25" w:name="_Toc235829296"/>
+      <w:bookmarkStart w:id="25" w:name="_Toc235900955"/>
       <w:r>
         <w:rPr>
           <w:lang w:val="en-GB"/>
@@ -7034,7 +7045,7 @@
       <w:pPr>
         <w:pStyle w:val="Nagwek3"/>
       </w:pPr>
-      <w:bookmarkStart w:id="26" w:name="_Toc235829297"/>
+      <w:bookmarkStart w:id="26" w:name="_Toc235900956"/>
       <w:r>
         <w:t>6. Wzorzec Obserwatora (Event Queue)</w:t>
       </w:r>
@@ -7114,7 +7125,7 @@
       <w:pPr>
         <w:pStyle w:val="Nagwek3"/>
       </w:pPr>
-      <w:bookmarkStart w:id="27" w:name="_Toc235829298"/>
+      <w:bookmarkStart w:id="27" w:name="_Toc235900957"/>
       <w:r>
         <w:t>7. Wzorzec Maszyny Stanów (Finite State Machine)</w:t>
       </w:r>
@@ -7125,6 +7136,7 @@
         <w:jc w:val="both"/>
         <w:rPr>
           <w:rFonts w:asciiTheme="majorHAnsi" w:hAnsiTheme="majorHAnsi" w:cs="Courier New"/>
+          <w:lang w:val="en-GB"/>
         </w:rPr>
       </w:pPr>
       <w:r>

</xml_diff>

<commit_message>
Update notatki - dodano sekcję: Architektura i podział silnika na warstwy (ECS) - wstępna wersja
</commit_message>
<xml_diff>
--- a/Doc/Przykładowe rozwiązania architektoniczne na customowym silniku gry.docx
+++ b/Doc/Przykładowe rozwiązania architektoniczne na customowym silniku gry.docx
@@ -1,6 +1,6 @@
 
 <file path=word/document.xml><?xml version="1.0" encoding="utf-8"?>
-<w:document xmlns:wpc="http://schemas.microsoft.com/office/word/2010/wordprocessingCanvas" xmlns:cx="http://schemas.microsoft.com/office/drawing/2014/chartex" xmlns:cx1="http://schemas.microsoft.com/office/drawing/2015/9/8/chartex" xmlns:cx2="http://schemas.microsoft.com/office/drawing/2015/10/21/chartex" xmlns:cx3="http://schemas.microsoft.com/office/drawing/2016/5/9/chartex" xmlns:cx4="http://schemas.microsoft.com/office/drawing/2016/5/10/chartex" xmlns:cx5="http://schemas.microsoft.com/office/drawing/2016/5/11/chartex" xmlns:cx6="http://schemas.microsoft.com/office/drawing/2016/5/12/chartex" xmlns:cx7="http://schemas.microsoft.com/office/drawing/2016/5/13/chartex" xmlns:cx8="http://schemas.microsoft.com/office/drawing/2016/5/14/chartex" xmlns:mc="http://schemas.openxmlformats.org/markup-compatibility/2006" xmlns:aink="http://schemas.microsoft.com/office/drawing/2016/ink" xmlns:am3d="http://schemas.microsoft.com/office/drawing/2017/model3d" xmlns:o="urn:schemas-microsoft-com:office:office" xmlns:oel="http://schemas.microsoft.com/office/2019/extlst" xmlns:r="http://schemas.openxmlformats.org/officeDocument/2006/relationships" xmlns:m="http://schemas.openxmlformats.org/officeDocument/2006/math" xmlns:v="urn:schemas-microsoft-com:vml" xmlns:wp14="http://schemas.microsoft.com/office/word/2010/wordprocessingDrawing" xmlns:wp="http://schemas.openxmlformats.org/drawingml/2006/wordprocessingDrawing" xmlns:w10="urn:schemas-microsoft-com:office:word" xmlns:w="http://schemas.openxmlformats.org/wordprocessingml/2006/main" xmlns:w14="http://schemas.microsoft.com/office/word/2010/wordml" xmlns:w15="http://schemas.microsoft.com/office/word/2012/wordml" xmlns:w16cex="http://schemas.microsoft.com/office/word/2018/wordml/cex" xmlns:w16cid="http://schemas.microsoft.com/office/word/2016/wordml/cid" xmlns:w16="http://schemas.microsoft.com/office/word/2018/wordml" xmlns:w16du="http://schemas.microsoft.com/office/word/2023/wordml/word16du" xmlns:w16sdtdh="http://schemas.microsoft.com/office/word/2020/wordml/sdtdatahash" xmlns:w16sdtfl="http://schemas.microsoft.com/office/word/2024/wordml/sdtformatlock" xmlns:w16se="http://schemas.microsoft.com/office/word/2015/wordml/symex" xmlns:wpg="http://schemas.microsoft.com/office/word/2010/wordprocessingGroup" xmlns:wpi="http://schemas.microsoft.com/office/word/2010/wordprocessingInk" xmlns:wne="http://schemas.microsoft.com/office/word/2006/wordml" xmlns:wps="http://schemas.microsoft.com/office/word/2010/wordprocessingShape" mc:Ignorable="w14 w15 w16se w16cid w16 w16cex w16sdtdh w16sdtfl w16du wp14">
+<w:document xmlns:wpc="http://schemas.microsoft.com/office/word/2010/wordprocessingCanvas" xmlns:cx="http://schemas.microsoft.com/office/drawing/2014/chartex" xmlns:cx1="http://schemas.microsoft.com/office/drawing/2015/9/8/chartex" xmlns:cx2="http://schemas.microsoft.com/office/drawing/2015/10/21/chartex" xmlns:cx3="http://schemas.microsoft.com/office/drawing/2016/5/9/chartex" xmlns:cx4="http://schemas.microsoft.com/office/drawing/2016/5/10/chartex" xmlns:cx5="http://schemas.microsoft.com/office/drawing/2016/5/11/chartex" xmlns:cx6="http://schemas.microsoft.com/office/drawing/2016/5/12/chartex" xmlns:cx7="http://schemas.microsoft.com/office/drawing/2016/5/13/chartex" xmlns:cx8="http://schemas.microsoft.com/office/drawing/2016/5/14/chartex" xmlns:mc="http://schemas.openxmlformats.org/markup-compatibility/2006" xmlns:aink="http://schemas.microsoft.com/office/drawing/2016/ink" xmlns:am3d="http://schemas.microsoft.com/office/drawing/2017/model3d" xmlns:o="urn:schemas-microsoft-com:office:office" xmlns:oel="http://schemas.microsoft.com/office/2019/extlst" xmlns:r="http://schemas.openxmlformats.org/officeDocument/2006/relationships" xmlns:m="http://schemas.openxmlformats.org/officeDocument/2006/math" xmlns:v="urn:schemas-microsoft-com:vml" xmlns:wp14="http://schemas.microsoft.com/office/word/2010/wordprocessingDrawing" xmlns:wp="http://schemas.openxmlformats.org/drawingml/2006/wordprocessingDrawing" xmlns:w10="urn:schemas-microsoft-com:office:word" xmlns:w="http://schemas.openxmlformats.org/wordprocessingml/2006/main" xmlns:w14="http://schemas.microsoft.com/office/word/2010/wordml" xmlns:w15="http://schemas.microsoft.com/office/word/2012/wordml" xmlns:w16cei="http://schemas.microsoft.com/office/word/2026/wordml/cei" xmlns:w16cex="http://schemas.microsoft.com/office/word/2018/wordml/cex" xmlns:w16cid="http://schemas.microsoft.com/office/word/2016/wordml/cid" xmlns:w16="http://schemas.microsoft.com/office/word/2018/wordml" xmlns:w16du="http://schemas.microsoft.com/office/word/2023/wordml/word16du" xmlns:w16sdtdh="http://schemas.microsoft.com/office/word/2020/wordml/sdtdatahash" xmlns:w16sdtfl="http://schemas.microsoft.com/office/word/2024/wordml/sdtformatlock" xmlns:w16se="http://schemas.microsoft.com/office/word/2015/wordml/symex" xmlns:wpg="http://schemas.microsoft.com/office/word/2010/wordprocessingGroup" xmlns:wpi="http://schemas.microsoft.com/office/word/2010/wordprocessingInk" xmlns:wne="http://schemas.microsoft.com/office/word/2006/wordml" xmlns:wps="http://schemas.microsoft.com/office/word/2010/wordprocessingShape" mc:Ignorable="w14 w15 w16se w16cid w16 w16cex w16sdtdh w16sdtfl w16du wp14">
   <w:body>
     <w:sdt>
       <w:sdtPr>
@@ -49,7 +49,6 @@
         <w:p>
           <w:pPr>
             <w:pStyle w:val="Spistreci1"/>
-            <w:spacing w:line="240" w:lineRule="auto"/>
             <w:rPr>
               <w:rFonts w:eastAsiaTheme="minorEastAsia"/>
               <w:b w:val="0"/>
@@ -80,7 +79,7 @@
             </w:rPr>
             <w:fldChar w:fldCharType="separate"/>
           </w:r>
-          <w:hyperlink w:anchor="_Toc235900930" w:history="1">
+          <w:hyperlink w:anchor="_Toc236174773" w:history="1">
             <w:r>
               <w:rPr>
                 <w:rStyle w:val="Hipercze"/>
@@ -103,7 +102,7 @@
               <w:rPr>
                 <w:webHidden/>
               </w:rPr>
-              <w:instrText xml:space="preserve"> PAGEREF _Toc235900930 \h </w:instrText>
+              <w:instrText xml:space="preserve"> PAGEREF _Toc236174773 \h </w:instrText>
             </w:r>
             <w:r>
               <w:rPr>
@@ -136,14 +135,13 @@
             <w:tabs>
               <w:tab w:val="right" w:leader="dot" w:pos="9062"/>
             </w:tabs>
-            <w:spacing w:line="240" w:lineRule="auto"/>
             <w:rPr>
               <w:rFonts w:eastAsiaTheme="minorEastAsia"/>
               <w:noProof/>
               <w:lang w:eastAsia="pl-PL"/>
             </w:rPr>
           </w:pPr>
-          <w:hyperlink w:anchor="_Toc235900931" w:history="1">
+          <w:hyperlink w:anchor="_Toc236174774" w:history="1">
             <w:r>
               <w:rPr>
                 <w:rStyle w:val="Hipercze"/>
@@ -170,7 +168,7 @@
                 <w:noProof/>
                 <w:webHidden/>
               </w:rPr>
-              <w:instrText xml:space="preserve"> PAGEREF _Toc235900931 \h </w:instrText>
+              <w:instrText xml:space="preserve"> PAGEREF _Toc236174774 \h </w:instrText>
             </w:r>
             <w:r>
               <w:rPr>
@@ -207,14 +205,13 @@
             <w:tabs>
               <w:tab w:val="right" w:leader="dot" w:pos="9062"/>
             </w:tabs>
-            <w:spacing w:line="240" w:lineRule="auto"/>
             <w:rPr>
               <w:rFonts w:eastAsiaTheme="minorEastAsia"/>
               <w:noProof/>
               <w:lang w:eastAsia="pl-PL"/>
             </w:rPr>
           </w:pPr>
-          <w:hyperlink w:anchor="_Toc235900932" w:history="1">
+          <w:hyperlink w:anchor="_Toc236174775" w:history="1">
             <w:r>
               <w:rPr>
                 <w:rStyle w:val="Hipercze"/>
@@ -241,7 +238,7 @@
                 <w:noProof/>
                 <w:webHidden/>
               </w:rPr>
-              <w:instrText xml:space="preserve"> PAGEREF _Toc235900932 \h </w:instrText>
+              <w:instrText xml:space="preserve"> PAGEREF _Toc236174775 \h </w:instrText>
             </w:r>
             <w:r>
               <w:rPr>
@@ -278,14 +275,13 @@
             <w:tabs>
               <w:tab w:val="right" w:leader="dot" w:pos="9062"/>
             </w:tabs>
-            <w:spacing w:line="240" w:lineRule="auto"/>
             <w:rPr>
               <w:rFonts w:eastAsiaTheme="minorEastAsia"/>
               <w:noProof/>
               <w:lang w:eastAsia="pl-PL"/>
             </w:rPr>
           </w:pPr>
-          <w:hyperlink w:anchor="_Toc235900933" w:history="1">
+          <w:hyperlink w:anchor="_Toc236174776" w:history="1">
             <w:r>
               <w:rPr>
                 <w:rStyle w:val="Hipercze"/>
@@ -312,7 +308,7 @@
                 <w:noProof/>
                 <w:webHidden/>
               </w:rPr>
-              <w:instrText xml:space="preserve"> PAGEREF _Toc235900933 \h </w:instrText>
+              <w:instrText xml:space="preserve"> PAGEREF _Toc236174776 \h </w:instrText>
             </w:r>
             <w:r>
               <w:rPr>
@@ -349,14 +345,13 @@
             <w:tabs>
               <w:tab w:val="right" w:leader="dot" w:pos="9062"/>
             </w:tabs>
-            <w:spacing w:line="240" w:lineRule="auto"/>
             <w:rPr>
               <w:rFonts w:eastAsiaTheme="minorEastAsia"/>
               <w:noProof/>
               <w:lang w:eastAsia="pl-PL"/>
             </w:rPr>
           </w:pPr>
-          <w:hyperlink w:anchor="_Toc235900934" w:history="1">
+          <w:hyperlink w:anchor="_Toc236174777" w:history="1">
             <w:r>
               <w:rPr>
                 <w:rStyle w:val="Hipercze"/>
@@ -383,7 +378,7 @@
                 <w:noProof/>
                 <w:webHidden/>
               </w:rPr>
-              <w:instrText xml:space="preserve"> PAGEREF _Toc235900934 \h </w:instrText>
+              <w:instrText xml:space="preserve"> PAGEREF _Toc236174777 \h </w:instrText>
             </w:r>
             <w:r>
               <w:rPr>
@@ -417,7 +412,6 @@
         <w:p>
           <w:pPr>
             <w:pStyle w:val="Spistreci1"/>
-            <w:spacing w:line="240" w:lineRule="auto"/>
             <w:rPr>
               <w:rFonts w:eastAsiaTheme="minorEastAsia"/>
               <w:b w:val="0"/>
@@ -427,7 +421,7 @@
               <w:lang w:eastAsia="pl-PL"/>
             </w:rPr>
           </w:pPr>
-          <w:hyperlink w:anchor="_Toc235900935" w:history="1">
+          <w:hyperlink w:anchor="_Toc236174778" w:history="1">
             <w:r>
               <w:rPr>
                 <w:rStyle w:val="Hipercze"/>
@@ -450,7 +444,7 @@
               <w:rPr>
                 <w:webHidden/>
               </w:rPr>
-              <w:instrText xml:space="preserve"> PAGEREF _Toc235900935 \h </w:instrText>
+              <w:instrText xml:space="preserve"> PAGEREF _Toc236174778 \h </w:instrText>
             </w:r>
             <w:r>
               <w:rPr>
@@ -483,14 +477,13 @@
             <w:tabs>
               <w:tab w:val="right" w:leader="dot" w:pos="9062"/>
             </w:tabs>
-            <w:spacing w:line="240" w:lineRule="auto"/>
             <w:rPr>
               <w:rFonts w:eastAsiaTheme="minorEastAsia"/>
               <w:noProof/>
               <w:lang w:eastAsia="pl-PL"/>
             </w:rPr>
           </w:pPr>
-          <w:hyperlink w:anchor="_Toc235900936" w:history="1">
+          <w:hyperlink w:anchor="_Toc236174779" w:history="1">
             <w:r>
               <w:rPr>
                 <w:rStyle w:val="Hipercze"/>
@@ -517,7 +510,7 @@
                 <w:noProof/>
                 <w:webHidden/>
               </w:rPr>
-              <w:instrText xml:space="preserve"> PAGEREF _Toc235900936 \h </w:instrText>
+              <w:instrText xml:space="preserve"> PAGEREF _Toc236174779 \h </w:instrText>
             </w:r>
             <w:r>
               <w:rPr>
@@ -554,14 +547,13 @@
             <w:tabs>
               <w:tab w:val="right" w:leader="dot" w:pos="9062"/>
             </w:tabs>
-            <w:spacing w:line="240" w:lineRule="auto"/>
             <w:rPr>
               <w:rFonts w:eastAsiaTheme="minorEastAsia"/>
               <w:noProof/>
               <w:lang w:eastAsia="pl-PL"/>
             </w:rPr>
           </w:pPr>
-          <w:hyperlink w:anchor="_Toc235900937" w:history="1">
+          <w:hyperlink w:anchor="_Toc236174780" w:history="1">
             <w:r>
               <w:rPr>
                 <w:rStyle w:val="Hipercze"/>
@@ -588,7 +580,7 @@
                 <w:noProof/>
                 <w:webHidden/>
               </w:rPr>
-              <w:instrText xml:space="preserve"> PAGEREF _Toc235900937 \h </w:instrText>
+              <w:instrText xml:space="preserve"> PAGEREF _Toc236174780 \h </w:instrText>
             </w:r>
             <w:r>
               <w:rPr>
@@ -625,14 +617,13 @@
             <w:tabs>
               <w:tab w:val="right" w:leader="dot" w:pos="9062"/>
             </w:tabs>
-            <w:spacing w:line="240" w:lineRule="auto"/>
             <w:rPr>
               <w:rFonts w:eastAsiaTheme="minorEastAsia"/>
               <w:noProof/>
               <w:lang w:eastAsia="pl-PL"/>
             </w:rPr>
           </w:pPr>
-          <w:hyperlink w:anchor="_Toc235900938" w:history="1">
+          <w:hyperlink w:anchor="_Toc236174781" w:history="1">
             <w:r>
               <w:rPr>
                 <w:rStyle w:val="Hipercze"/>
@@ -680,7 +671,7 @@
                 <w:noProof/>
                 <w:webHidden/>
               </w:rPr>
-              <w:instrText xml:space="preserve"> PAGEREF _Toc235900938 \h </w:instrText>
+              <w:instrText xml:space="preserve"> PAGEREF _Toc236174781 \h </w:instrText>
             </w:r>
             <w:r>
               <w:rPr>
@@ -717,14 +708,13 @@
             <w:tabs>
               <w:tab w:val="right" w:leader="dot" w:pos="9062"/>
             </w:tabs>
-            <w:spacing w:line="240" w:lineRule="auto"/>
             <w:rPr>
               <w:rFonts w:eastAsiaTheme="minorEastAsia"/>
               <w:noProof/>
               <w:lang w:eastAsia="pl-PL"/>
             </w:rPr>
           </w:pPr>
-          <w:hyperlink w:anchor="_Toc235900939" w:history="1">
+          <w:hyperlink w:anchor="_Toc236174782" w:history="1">
             <w:r>
               <w:rPr>
                 <w:rStyle w:val="Hipercze"/>
@@ -751,7 +741,7 @@
                 <w:noProof/>
                 <w:webHidden/>
               </w:rPr>
-              <w:instrText xml:space="preserve"> PAGEREF _Toc235900939 \h </w:instrText>
+              <w:instrText xml:space="preserve"> PAGEREF _Toc236174782 \h </w:instrText>
             </w:r>
             <w:r>
               <w:rPr>
@@ -785,7 +775,6 @@
         <w:p>
           <w:pPr>
             <w:pStyle w:val="Spistreci1"/>
-            <w:spacing w:line="240" w:lineRule="auto"/>
             <w:rPr>
               <w:rFonts w:eastAsiaTheme="minorEastAsia"/>
               <w:b w:val="0"/>
@@ -795,7 +784,7 @@
               <w:lang w:eastAsia="pl-PL"/>
             </w:rPr>
           </w:pPr>
-          <w:hyperlink w:anchor="_Toc235900940" w:history="1">
+          <w:hyperlink w:anchor="_Toc236174783" w:history="1">
             <w:r>
               <w:rPr>
                 <w:rStyle w:val="Hipercze"/>
@@ -818,7 +807,7 @@
               <w:rPr>
                 <w:webHidden/>
               </w:rPr>
-              <w:instrText xml:space="preserve"> PAGEREF _Toc235900940 \h </w:instrText>
+              <w:instrText xml:space="preserve"> PAGEREF _Toc236174783 \h </w:instrText>
             </w:r>
             <w:r>
               <w:rPr>
@@ -851,14 +840,13 @@
             <w:tabs>
               <w:tab w:val="right" w:leader="dot" w:pos="9062"/>
             </w:tabs>
-            <w:spacing w:line="240" w:lineRule="auto"/>
             <w:rPr>
               <w:rFonts w:eastAsiaTheme="minorEastAsia"/>
               <w:noProof/>
               <w:lang w:eastAsia="pl-PL"/>
             </w:rPr>
           </w:pPr>
-          <w:hyperlink w:anchor="_Toc235900941" w:history="1">
+          <w:hyperlink w:anchor="_Toc236174784" w:history="1">
             <w:r>
               <w:rPr>
                 <w:rStyle w:val="Hipercze"/>
@@ -885,7 +873,7 @@
                 <w:noProof/>
                 <w:webHidden/>
               </w:rPr>
-              <w:instrText xml:space="preserve"> PAGEREF _Toc235900941 \h </w:instrText>
+              <w:instrText xml:space="preserve"> PAGEREF _Toc236174784 \h </w:instrText>
             </w:r>
             <w:r>
               <w:rPr>
@@ -922,14 +910,13 @@
             <w:tabs>
               <w:tab w:val="right" w:leader="dot" w:pos="9062"/>
             </w:tabs>
-            <w:spacing w:line="240" w:lineRule="auto"/>
             <w:rPr>
               <w:rFonts w:eastAsiaTheme="minorEastAsia"/>
               <w:noProof/>
               <w:lang w:eastAsia="pl-PL"/>
             </w:rPr>
           </w:pPr>
-          <w:hyperlink w:anchor="_Toc235900942" w:history="1">
+          <w:hyperlink w:anchor="_Toc236174785" w:history="1">
             <w:r>
               <w:rPr>
                 <w:rStyle w:val="Hipercze"/>
@@ -956,7 +943,7 @@
                 <w:noProof/>
                 <w:webHidden/>
               </w:rPr>
-              <w:instrText xml:space="preserve"> PAGEREF _Toc235900942 \h </w:instrText>
+              <w:instrText xml:space="preserve"> PAGEREF _Toc236174785 \h </w:instrText>
             </w:r>
             <w:r>
               <w:rPr>
@@ -993,14 +980,13 @@
             <w:tabs>
               <w:tab w:val="right" w:leader="dot" w:pos="9062"/>
             </w:tabs>
-            <w:spacing w:line="240" w:lineRule="auto"/>
             <w:rPr>
               <w:rFonts w:eastAsiaTheme="minorEastAsia"/>
               <w:noProof/>
               <w:lang w:eastAsia="pl-PL"/>
             </w:rPr>
           </w:pPr>
-          <w:hyperlink w:anchor="_Toc235900943" w:history="1">
+          <w:hyperlink w:anchor="_Toc236174786" w:history="1">
             <w:r>
               <w:rPr>
                 <w:rStyle w:val="Hipercze"/>
@@ -1027,7 +1013,7 @@
                 <w:noProof/>
                 <w:webHidden/>
               </w:rPr>
-              <w:instrText xml:space="preserve"> PAGEREF _Toc235900943 \h </w:instrText>
+              <w:instrText xml:space="preserve"> PAGEREF _Toc236174786 \h </w:instrText>
             </w:r>
             <w:r>
               <w:rPr>
@@ -1064,14 +1050,13 @@
             <w:tabs>
               <w:tab w:val="right" w:leader="dot" w:pos="9062"/>
             </w:tabs>
-            <w:spacing w:line="240" w:lineRule="auto"/>
             <w:rPr>
               <w:rFonts w:eastAsiaTheme="minorEastAsia"/>
               <w:noProof/>
               <w:lang w:eastAsia="pl-PL"/>
             </w:rPr>
           </w:pPr>
-          <w:hyperlink w:anchor="_Toc235900944" w:history="1">
+          <w:hyperlink w:anchor="_Toc236174787" w:history="1">
             <w:r>
               <w:rPr>
                 <w:rStyle w:val="Hipercze"/>
@@ -1099,7 +1084,7 @@
                 <w:noProof/>
                 <w:webHidden/>
               </w:rPr>
-              <w:instrText xml:space="preserve"> PAGEREF _Toc235900944 \h </w:instrText>
+              <w:instrText xml:space="preserve"> PAGEREF _Toc236174787 \h </w:instrText>
             </w:r>
             <w:r>
               <w:rPr>
@@ -1136,14 +1121,13 @@
             <w:tabs>
               <w:tab w:val="right" w:leader="dot" w:pos="9062"/>
             </w:tabs>
-            <w:spacing w:line="240" w:lineRule="auto"/>
             <w:rPr>
               <w:rFonts w:eastAsiaTheme="minorEastAsia"/>
               <w:noProof/>
               <w:lang w:eastAsia="pl-PL"/>
             </w:rPr>
           </w:pPr>
-          <w:hyperlink w:anchor="_Toc235900945" w:history="1">
+          <w:hyperlink w:anchor="_Toc236174788" w:history="1">
             <w:r>
               <w:rPr>
                 <w:rStyle w:val="Hipercze"/>
@@ -1170,7 +1154,7 @@
                 <w:noProof/>
                 <w:webHidden/>
               </w:rPr>
-              <w:instrText xml:space="preserve"> PAGEREF _Toc235900945 \h </w:instrText>
+              <w:instrText xml:space="preserve"> PAGEREF _Toc236174788 \h </w:instrText>
             </w:r>
             <w:r>
               <w:rPr>
@@ -1207,14 +1191,13 @@
             <w:tabs>
               <w:tab w:val="right" w:leader="dot" w:pos="9062"/>
             </w:tabs>
-            <w:spacing w:line="240" w:lineRule="auto"/>
             <w:rPr>
               <w:rFonts w:eastAsiaTheme="minorEastAsia"/>
               <w:noProof/>
               <w:lang w:eastAsia="pl-PL"/>
             </w:rPr>
           </w:pPr>
-          <w:hyperlink w:anchor="_Toc235900946" w:history="1">
+          <w:hyperlink w:anchor="_Toc236174789" w:history="1">
             <w:r>
               <w:rPr>
                 <w:rStyle w:val="Hipercze"/>
@@ -1241,7 +1224,7 @@
                 <w:noProof/>
                 <w:webHidden/>
               </w:rPr>
-              <w:instrText xml:space="preserve"> PAGEREF _Toc235900946 \h </w:instrText>
+              <w:instrText xml:space="preserve"> PAGEREF _Toc236174789 \h </w:instrText>
             </w:r>
             <w:r>
               <w:rPr>
@@ -1278,14 +1261,13 @@
             <w:tabs>
               <w:tab w:val="right" w:leader="dot" w:pos="9062"/>
             </w:tabs>
-            <w:spacing w:line="240" w:lineRule="auto"/>
             <w:rPr>
               <w:rFonts w:eastAsiaTheme="minorEastAsia"/>
               <w:noProof/>
               <w:lang w:eastAsia="pl-PL"/>
             </w:rPr>
           </w:pPr>
-          <w:hyperlink w:anchor="_Toc235900947" w:history="1">
+          <w:hyperlink w:anchor="_Toc236174790" w:history="1">
             <w:r>
               <w:rPr>
                 <w:rStyle w:val="Hipercze"/>
@@ -1312,7 +1294,7 @@
                 <w:noProof/>
                 <w:webHidden/>
               </w:rPr>
-              <w:instrText xml:space="preserve"> PAGEREF _Toc235900947 \h </w:instrText>
+              <w:instrText xml:space="preserve"> PAGEREF _Toc236174790 \h </w:instrText>
             </w:r>
             <w:r>
               <w:rPr>
@@ -1349,14 +1331,13 @@
             <w:tabs>
               <w:tab w:val="right" w:leader="dot" w:pos="9062"/>
             </w:tabs>
-            <w:spacing w:line="240" w:lineRule="auto"/>
             <w:rPr>
               <w:rFonts w:eastAsiaTheme="minorEastAsia"/>
               <w:noProof/>
               <w:lang w:eastAsia="pl-PL"/>
             </w:rPr>
           </w:pPr>
-          <w:hyperlink w:anchor="_Toc235900948" w:history="1">
+          <w:hyperlink w:anchor="_Toc236174791" w:history="1">
             <w:r>
               <w:rPr>
                 <w:rStyle w:val="Hipercze"/>
@@ -1383,7 +1364,7 @@
                 <w:noProof/>
                 <w:webHidden/>
               </w:rPr>
-              <w:instrText xml:space="preserve"> PAGEREF _Toc235900948 \h </w:instrText>
+              <w:instrText xml:space="preserve"> PAGEREF _Toc236174791 \h </w:instrText>
             </w:r>
             <w:r>
               <w:rPr>
@@ -1417,7 +1398,6 @@
         <w:p>
           <w:pPr>
             <w:pStyle w:val="Spistreci1"/>
-            <w:spacing w:line="240" w:lineRule="auto"/>
             <w:rPr>
               <w:rFonts w:eastAsiaTheme="minorEastAsia"/>
               <w:b w:val="0"/>
@@ -1427,7 +1407,7 @@
               <w:lang w:eastAsia="pl-PL"/>
             </w:rPr>
           </w:pPr>
-          <w:hyperlink w:anchor="_Toc235900949" w:history="1">
+          <w:hyperlink w:anchor="_Toc236174792" w:history="1">
             <w:r>
               <w:rPr>
                 <w:rStyle w:val="Hipercze"/>
@@ -1450,7 +1430,7 @@
               <w:rPr>
                 <w:webHidden/>
               </w:rPr>
-              <w:instrText xml:space="preserve"> PAGEREF _Toc235900949 \h </w:instrText>
+              <w:instrText xml:space="preserve"> PAGEREF _Toc236174792 \h </w:instrText>
             </w:r>
             <w:r>
               <w:rPr>
@@ -1483,14 +1463,13 @@
             <w:tabs>
               <w:tab w:val="right" w:leader="dot" w:pos="9062"/>
             </w:tabs>
-            <w:spacing w:line="240" w:lineRule="auto"/>
             <w:rPr>
               <w:rFonts w:eastAsiaTheme="minorEastAsia"/>
               <w:noProof/>
               <w:lang w:eastAsia="pl-PL"/>
             </w:rPr>
           </w:pPr>
-          <w:hyperlink w:anchor="_Toc235900950" w:history="1">
+          <w:hyperlink w:anchor="_Toc236174793" w:history="1">
             <w:r>
               <w:rPr>
                 <w:rStyle w:val="Hipercze"/>
@@ -1519,7 +1498,7 @@
                 <w:noProof/>
                 <w:webHidden/>
               </w:rPr>
-              <w:instrText xml:space="preserve"> PAGEREF _Toc235900950 \h </w:instrText>
+              <w:instrText xml:space="preserve"> PAGEREF _Toc236174793 \h </w:instrText>
             </w:r>
             <w:r>
               <w:rPr>
@@ -1556,14 +1535,13 @@
             <w:tabs>
               <w:tab w:val="right" w:leader="dot" w:pos="9062"/>
             </w:tabs>
-            <w:spacing w:line="240" w:lineRule="auto"/>
             <w:rPr>
               <w:rFonts w:eastAsiaTheme="minorEastAsia"/>
               <w:noProof/>
               <w:lang w:eastAsia="pl-PL"/>
             </w:rPr>
           </w:pPr>
-          <w:hyperlink w:anchor="_Toc235900951" w:history="1">
+          <w:hyperlink w:anchor="_Toc236174794" w:history="1">
             <w:r>
               <w:rPr>
                 <w:rStyle w:val="Hipercze"/>
@@ -1590,7 +1568,7 @@
                 <w:noProof/>
                 <w:webHidden/>
               </w:rPr>
-              <w:instrText xml:space="preserve"> PAGEREF _Toc235900951 \h </w:instrText>
+              <w:instrText xml:space="preserve"> PAGEREF _Toc236174794 \h </w:instrText>
             </w:r>
             <w:r>
               <w:rPr>
@@ -1627,14 +1605,13 @@
             <w:tabs>
               <w:tab w:val="right" w:leader="dot" w:pos="9062"/>
             </w:tabs>
-            <w:spacing w:line="240" w:lineRule="auto"/>
             <w:rPr>
               <w:rFonts w:eastAsiaTheme="minorEastAsia"/>
               <w:noProof/>
               <w:lang w:eastAsia="pl-PL"/>
             </w:rPr>
           </w:pPr>
-          <w:hyperlink w:anchor="_Toc235900952" w:history="1">
+          <w:hyperlink w:anchor="_Toc236174795" w:history="1">
             <w:r>
               <w:rPr>
                 <w:rStyle w:val="Hipercze"/>
@@ -1661,7 +1638,7 @@
                 <w:noProof/>
                 <w:webHidden/>
               </w:rPr>
-              <w:instrText xml:space="preserve"> PAGEREF _Toc235900952 \h </w:instrText>
+              <w:instrText xml:space="preserve"> PAGEREF _Toc236174795 \h </w:instrText>
             </w:r>
             <w:r>
               <w:rPr>
@@ -1698,14 +1675,13 @@
             <w:tabs>
               <w:tab w:val="right" w:leader="dot" w:pos="9062"/>
             </w:tabs>
-            <w:spacing w:line="240" w:lineRule="auto"/>
             <w:rPr>
               <w:rFonts w:eastAsiaTheme="minorEastAsia"/>
               <w:noProof/>
               <w:lang w:eastAsia="pl-PL"/>
             </w:rPr>
           </w:pPr>
-          <w:hyperlink w:anchor="_Toc235900953" w:history="1">
+          <w:hyperlink w:anchor="_Toc236174796" w:history="1">
             <w:r>
               <w:rPr>
                 <w:rStyle w:val="Hipercze"/>
@@ -1732,7 +1708,7 @@
                 <w:noProof/>
                 <w:webHidden/>
               </w:rPr>
-              <w:instrText xml:space="preserve"> PAGEREF _Toc235900953 \h </w:instrText>
+              <w:instrText xml:space="preserve"> PAGEREF _Toc236174796 \h </w:instrText>
             </w:r>
             <w:r>
               <w:rPr>
@@ -1769,14 +1745,13 @@
             <w:tabs>
               <w:tab w:val="right" w:leader="dot" w:pos="9062"/>
             </w:tabs>
-            <w:spacing w:line="240" w:lineRule="auto"/>
             <w:rPr>
               <w:rFonts w:eastAsiaTheme="minorEastAsia"/>
               <w:noProof/>
               <w:lang w:eastAsia="pl-PL"/>
             </w:rPr>
           </w:pPr>
-          <w:hyperlink w:anchor="_Toc235900954" w:history="1">
+          <w:hyperlink w:anchor="_Toc236174797" w:history="1">
             <w:r>
               <w:rPr>
                 <w:rStyle w:val="Hipercze"/>
@@ -1803,7 +1778,7 @@
                 <w:noProof/>
                 <w:webHidden/>
               </w:rPr>
-              <w:instrText xml:space="preserve"> PAGEREF _Toc235900954 \h </w:instrText>
+              <w:instrText xml:space="preserve"> PAGEREF _Toc236174797 \h </w:instrText>
             </w:r>
             <w:r>
               <w:rPr>
@@ -1840,14 +1815,13 @@
             <w:tabs>
               <w:tab w:val="right" w:leader="dot" w:pos="9062"/>
             </w:tabs>
-            <w:spacing w:line="240" w:lineRule="auto"/>
             <w:rPr>
               <w:rFonts w:eastAsiaTheme="minorEastAsia"/>
               <w:noProof/>
               <w:lang w:eastAsia="pl-PL"/>
             </w:rPr>
           </w:pPr>
-          <w:hyperlink w:anchor="_Toc235900955" w:history="1">
+          <w:hyperlink w:anchor="_Toc236174798" w:history="1">
             <w:r>
               <w:rPr>
                 <w:rStyle w:val="Hipercze"/>
@@ -1875,7 +1849,7 @@
                 <w:noProof/>
                 <w:webHidden/>
               </w:rPr>
-              <w:instrText xml:space="preserve"> PAGEREF _Toc235900955 \h </w:instrText>
+              <w:instrText xml:space="preserve"> PAGEREF _Toc236174798 \h </w:instrText>
             </w:r>
             <w:r>
               <w:rPr>
@@ -1912,14 +1886,13 @@
             <w:tabs>
               <w:tab w:val="right" w:leader="dot" w:pos="9062"/>
             </w:tabs>
-            <w:spacing w:line="240" w:lineRule="auto"/>
             <w:rPr>
               <w:rFonts w:eastAsiaTheme="minorEastAsia"/>
               <w:noProof/>
               <w:lang w:eastAsia="pl-PL"/>
             </w:rPr>
           </w:pPr>
-          <w:hyperlink w:anchor="_Toc235900956" w:history="1">
+          <w:hyperlink w:anchor="_Toc236174799" w:history="1">
             <w:r>
               <w:rPr>
                 <w:rStyle w:val="Hipercze"/>
@@ -1946,7 +1919,7 @@
                 <w:noProof/>
                 <w:webHidden/>
               </w:rPr>
-              <w:instrText xml:space="preserve"> PAGEREF _Toc235900956 \h </w:instrText>
+              <w:instrText xml:space="preserve"> PAGEREF _Toc236174799 \h </w:instrText>
             </w:r>
             <w:r>
               <w:rPr>
@@ -1983,14 +1956,13 @@
             <w:tabs>
               <w:tab w:val="right" w:leader="dot" w:pos="9062"/>
             </w:tabs>
-            <w:spacing w:line="240" w:lineRule="auto"/>
             <w:rPr>
               <w:rFonts w:eastAsiaTheme="minorEastAsia"/>
               <w:noProof/>
               <w:lang w:eastAsia="pl-PL"/>
             </w:rPr>
           </w:pPr>
-          <w:hyperlink w:anchor="_Toc235900957" w:history="1">
+          <w:hyperlink w:anchor="_Toc236174800" w:history="1">
             <w:r>
               <w:rPr>
                 <w:rStyle w:val="Hipercze"/>
@@ -2017,7 +1989,7 @@
                 <w:noProof/>
                 <w:webHidden/>
               </w:rPr>
-              <w:instrText xml:space="preserve"> PAGEREF _Toc235900957 \h </w:instrText>
+              <w:instrText xml:space="preserve"> PAGEREF _Toc236174800 \h </w:instrText>
             </w:r>
             <w:r>
               <w:rPr>
@@ -2038,6 +2010,348 @@
                 <w:webHidden/>
               </w:rPr>
               <w:t>20</w:t>
+            </w:r>
+            <w:r>
+              <w:rPr>
+                <w:noProof/>
+                <w:webHidden/>
+              </w:rPr>
+              <w:fldChar w:fldCharType="end"/>
+            </w:r>
+          </w:hyperlink>
+        </w:p>
+        <w:p>
+          <w:pPr>
+            <w:pStyle w:val="Spistreci1"/>
+            <w:rPr>
+              <w:rFonts w:eastAsiaTheme="minorEastAsia"/>
+              <w:b w:val="0"/>
+              <w:bCs w:val="0"/>
+              <w:sz w:val="24"/>
+              <w:szCs w:val="24"/>
+              <w:lang w:eastAsia="pl-PL"/>
+            </w:rPr>
+          </w:pPr>
+          <w:hyperlink w:anchor="_Toc236174801" w:history="1">
+            <w:r>
+              <w:rPr>
+                <w:rStyle w:val="Hipercze"/>
+              </w:rPr>
+              <w:t>Architektura i podział silnika na warstwy (ECS)</w:t>
+            </w:r>
+            <w:r>
+              <w:rPr>
+                <w:webHidden/>
+              </w:rPr>
+              <w:tab/>
+            </w:r>
+            <w:r>
+              <w:rPr>
+                <w:webHidden/>
+              </w:rPr>
+              <w:fldChar w:fldCharType="begin"/>
+            </w:r>
+            <w:r>
+              <w:rPr>
+                <w:webHidden/>
+              </w:rPr>
+              <w:instrText xml:space="preserve"> PAGEREF _Toc236174801 \h </w:instrText>
+            </w:r>
+            <w:r>
+              <w:rPr>
+                <w:webHidden/>
+              </w:rPr>
+            </w:r>
+            <w:r>
+              <w:rPr>
+                <w:webHidden/>
+              </w:rPr>
+              <w:fldChar w:fldCharType="separate"/>
+            </w:r>
+            <w:r>
+              <w:rPr>
+                <w:webHidden/>
+              </w:rPr>
+              <w:t>21</w:t>
+            </w:r>
+            <w:r>
+              <w:rPr>
+                <w:webHidden/>
+              </w:rPr>
+              <w:fldChar w:fldCharType="end"/>
+            </w:r>
+          </w:hyperlink>
+        </w:p>
+        <w:p>
+          <w:pPr>
+            <w:pStyle w:val="Spistreci2"/>
+            <w:tabs>
+              <w:tab w:val="right" w:leader="dot" w:pos="9062"/>
+            </w:tabs>
+            <w:rPr>
+              <w:rFonts w:eastAsiaTheme="minorEastAsia"/>
+              <w:noProof/>
+              <w:lang w:eastAsia="pl-PL"/>
+            </w:rPr>
+          </w:pPr>
+          <w:hyperlink w:anchor="_Toc236174802" w:history="1">
+            <w:r>
+              <w:rPr>
+                <w:rStyle w:val="Hipercze"/>
+                <w:noProof/>
+              </w:rPr>
+              <w:t>CORE (Jądro Silnika i ECS)</w:t>
+            </w:r>
+            <w:r>
+              <w:rPr>
+                <w:noProof/>
+                <w:webHidden/>
+              </w:rPr>
+              <w:tab/>
+            </w:r>
+            <w:r>
+              <w:rPr>
+                <w:noProof/>
+                <w:webHidden/>
+              </w:rPr>
+              <w:fldChar w:fldCharType="begin"/>
+            </w:r>
+            <w:r>
+              <w:rPr>
+                <w:noProof/>
+                <w:webHidden/>
+              </w:rPr>
+              <w:instrText xml:space="preserve"> PAGEREF _Toc236174802 \h </w:instrText>
+            </w:r>
+            <w:r>
+              <w:rPr>
+                <w:noProof/>
+                <w:webHidden/>
+              </w:rPr>
+            </w:r>
+            <w:r>
+              <w:rPr>
+                <w:noProof/>
+                <w:webHidden/>
+              </w:rPr>
+              <w:fldChar w:fldCharType="separate"/>
+            </w:r>
+            <w:r>
+              <w:rPr>
+                <w:noProof/>
+                <w:webHidden/>
+              </w:rPr>
+              <w:t>21</w:t>
+            </w:r>
+            <w:r>
+              <w:rPr>
+                <w:noProof/>
+                <w:webHidden/>
+              </w:rPr>
+              <w:fldChar w:fldCharType="end"/>
+            </w:r>
+          </w:hyperlink>
+        </w:p>
+        <w:p>
+          <w:pPr>
+            <w:pStyle w:val="Spistreci2"/>
+            <w:tabs>
+              <w:tab w:val="right" w:leader="dot" w:pos="9062"/>
+            </w:tabs>
+            <w:rPr>
+              <w:rFonts w:eastAsiaTheme="minorEastAsia"/>
+              <w:noProof/>
+              <w:lang w:eastAsia="pl-PL"/>
+            </w:rPr>
+          </w:pPr>
+          <w:hyperlink w:anchor="_Toc236174803" w:history="1">
+            <w:r>
+              <w:rPr>
+                <w:rStyle w:val="Hipercze"/>
+                <w:noProof/>
+              </w:rPr>
+              <w:t>RENDERING (Silnik Graficzny i Potok OpenGL)</w:t>
+            </w:r>
+            <w:r>
+              <w:rPr>
+                <w:noProof/>
+                <w:webHidden/>
+              </w:rPr>
+              <w:tab/>
+            </w:r>
+            <w:r>
+              <w:rPr>
+                <w:noProof/>
+                <w:webHidden/>
+              </w:rPr>
+              <w:fldChar w:fldCharType="begin"/>
+            </w:r>
+            <w:r>
+              <w:rPr>
+                <w:noProof/>
+                <w:webHidden/>
+              </w:rPr>
+              <w:instrText xml:space="preserve"> PAGEREF _Toc236174803 \h </w:instrText>
+            </w:r>
+            <w:r>
+              <w:rPr>
+                <w:noProof/>
+                <w:webHidden/>
+              </w:rPr>
+            </w:r>
+            <w:r>
+              <w:rPr>
+                <w:noProof/>
+                <w:webHidden/>
+              </w:rPr>
+              <w:fldChar w:fldCharType="separate"/>
+            </w:r>
+            <w:r>
+              <w:rPr>
+                <w:noProof/>
+                <w:webHidden/>
+              </w:rPr>
+              <w:t>21</w:t>
+            </w:r>
+            <w:r>
+              <w:rPr>
+                <w:noProof/>
+                <w:webHidden/>
+              </w:rPr>
+              <w:fldChar w:fldCharType="end"/>
+            </w:r>
+          </w:hyperlink>
+        </w:p>
+        <w:p>
+          <w:pPr>
+            <w:pStyle w:val="Spistreci2"/>
+            <w:tabs>
+              <w:tab w:val="right" w:leader="dot" w:pos="9062"/>
+            </w:tabs>
+            <w:rPr>
+              <w:rFonts w:eastAsiaTheme="minorEastAsia"/>
+              <w:noProof/>
+              <w:lang w:eastAsia="pl-PL"/>
+            </w:rPr>
+          </w:pPr>
+          <w:hyperlink w:anchor="_Toc236174804" w:history="1">
+            <w:r>
+              <w:rPr>
+                <w:rStyle w:val="Hipercze"/>
+                <w:noProof/>
+              </w:rPr>
+              <w:t>COMPONENTS (Czyste Dane / Struktury)</w:t>
+            </w:r>
+            <w:r>
+              <w:rPr>
+                <w:noProof/>
+                <w:webHidden/>
+              </w:rPr>
+              <w:tab/>
+            </w:r>
+            <w:r>
+              <w:rPr>
+                <w:noProof/>
+                <w:webHidden/>
+              </w:rPr>
+              <w:fldChar w:fldCharType="begin"/>
+            </w:r>
+            <w:r>
+              <w:rPr>
+                <w:noProof/>
+                <w:webHidden/>
+              </w:rPr>
+              <w:instrText xml:space="preserve"> PAGEREF _Toc236174804 \h </w:instrText>
+            </w:r>
+            <w:r>
+              <w:rPr>
+                <w:noProof/>
+                <w:webHidden/>
+              </w:rPr>
+            </w:r>
+            <w:r>
+              <w:rPr>
+                <w:noProof/>
+                <w:webHidden/>
+              </w:rPr>
+              <w:fldChar w:fldCharType="separate"/>
+            </w:r>
+            <w:r>
+              <w:rPr>
+                <w:noProof/>
+                <w:webHidden/>
+              </w:rPr>
+              <w:t>22</w:t>
+            </w:r>
+            <w:r>
+              <w:rPr>
+                <w:noProof/>
+                <w:webHidden/>
+              </w:rPr>
+              <w:fldChar w:fldCharType="end"/>
+            </w:r>
+          </w:hyperlink>
+        </w:p>
+        <w:p>
+          <w:pPr>
+            <w:pStyle w:val="Spistreci2"/>
+            <w:tabs>
+              <w:tab w:val="right" w:leader="dot" w:pos="9062"/>
+            </w:tabs>
+            <w:rPr>
+              <w:rFonts w:eastAsiaTheme="minorEastAsia"/>
+              <w:noProof/>
+              <w:lang w:eastAsia="pl-PL"/>
+            </w:rPr>
+          </w:pPr>
+          <w:hyperlink w:anchor="_Toc236174805" w:history="1">
+            <w:r>
+              <w:rPr>
+                <w:rStyle w:val="Hipercze"/>
+                <w:noProof/>
+              </w:rPr>
+              <w:t>SYSTEMS (Logika Rozgrywki)</w:t>
+            </w:r>
+            <w:r>
+              <w:rPr>
+                <w:noProof/>
+                <w:webHidden/>
+              </w:rPr>
+              <w:tab/>
+            </w:r>
+            <w:r>
+              <w:rPr>
+                <w:noProof/>
+                <w:webHidden/>
+              </w:rPr>
+              <w:fldChar w:fldCharType="begin"/>
+            </w:r>
+            <w:r>
+              <w:rPr>
+                <w:noProof/>
+                <w:webHidden/>
+              </w:rPr>
+              <w:instrText xml:space="preserve"> PAGEREF _Toc236174805 \h </w:instrText>
+            </w:r>
+            <w:r>
+              <w:rPr>
+                <w:noProof/>
+                <w:webHidden/>
+              </w:rPr>
+            </w:r>
+            <w:r>
+              <w:rPr>
+                <w:noProof/>
+                <w:webHidden/>
+              </w:rPr>
+              <w:fldChar w:fldCharType="separate"/>
+            </w:r>
+            <w:r>
+              <w:rPr>
+                <w:noProof/>
+                <w:webHidden/>
+              </w:rPr>
+              <w:t>22</w:t>
             </w:r>
             <w:r>
               <w:rPr>
@@ -2086,7 +2400,7 @@
           <w:bCs/>
         </w:rPr>
       </w:pPr>
-      <w:bookmarkStart w:id="0" w:name="_Toc235900930"/>
+      <w:bookmarkStart w:id="0" w:name="_Toc236174773"/>
       <w:r>
         <w:rPr>
           <w:b/>
@@ -2162,7 +2476,7 @@
       <w:pPr>
         <w:pStyle w:val="Nagwek2"/>
       </w:pPr>
-      <w:bookmarkStart w:id="1" w:name="_Toc235900931"/>
+      <w:bookmarkStart w:id="1" w:name="_Toc236174774"/>
       <w:r>
         <w:t>Architektura Silnika i Gry (Zarządzanie Danymi)</w:t>
       </w:r>
@@ -2278,7 +2592,7 @@
       <w:pPr>
         <w:pStyle w:val="Nagwek2"/>
       </w:pPr>
-      <w:bookmarkStart w:id="2" w:name="_Toc235900932"/>
+      <w:bookmarkStart w:id="2" w:name="_Toc236174775"/>
       <w:r>
         <w:t>Renderowanie i Grafika 3D</w:t>
       </w:r>
@@ -2407,7 +2721,7 @@
       <w:pPr>
         <w:pStyle w:val="Nagwek2"/>
       </w:pPr>
-      <w:bookmarkStart w:id="3" w:name="_Toc235900933"/>
+      <w:bookmarkStart w:id="3" w:name="_Toc236174776"/>
       <w:r>
         <w:t>Logika Rozgrywki (Mechaniki Diablo)</w:t>
       </w:r>
@@ -2490,7 +2804,7 @@
       <w:pPr>
         <w:pStyle w:val="Nagwek2"/>
       </w:pPr>
-      <w:bookmarkStart w:id="4" w:name="_Toc235900934"/>
+      <w:bookmarkStart w:id="4" w:name="_Toc236174777"/>
       <w:r>
         <w:t>Optymalizacja i Systemy Wspierające</w:t>
       </w:r>
@@ -2569,7 +2883,7 @@
           <w:bCs/>
         </w:rPr>
       </w:pPr>
-      <w:bookmarkStart w:id="5" w:name="_Toc235900935"/>
+      <w:bookmarkStart w:id="5" w:name="_Toc236174778"/>
       <w:r>
         <w:rPr>
           <w:b/>
@@ -2633,7 +2947,7 @@
       <w:pPr>
         <w:pStyle w:val="Nagwek2"/>
       </w:pPr>
-      <w:bookmarkStart w:id="6" w:name="_Toc235900936"/>
+      <w:bookmarkStart w:id="6" w:name="_Toc236174779"/>
       <w:r>
         <w:t>Rdzeń silnika i renderowani</w:t>
       </w:r>
@@ -2755,7 +3069,7 @@
       <w:pPr>
         <w:pStyle w:val="Nagwek2"/>
       </w:pPr>
-      <w:bookmarkStart w:id="7" w:name="_Toc235900937"/>
+      <w:bookmarkStart w:id="7" w:name="_Toc236174780"/>
       <w:r>
         <w:t>Architektura danych i gry</w:t>
       </w:r>
@@ -2840,7 +3154,7 @@
       <w:pPr>
         <w:pStyle w:val="Nagwek2"/>
       </w:pPr>
-      <w:bookmarkStart w:id="8" w:name="_Toc235900938"/>
+      <w:bookmarkStart w:id="8" w:name="_Toc236174781"/>
       <w:r>
         <w:t xml:space="preserve">Komunikacja wielowątkowa (WinForms </w:t>
       </w:r>
@@ -2941,7 +3255,7 @@
       <w:pPr>
         <w:pStyle w:val="Nagwek2"/>
       </w:pPr>
-      <w:bookmarkStart w:id="9" w:name="_Toc235900939"/>
+      <w:bookmarkStart w:id="9" w:name="_Toc236174782"/>
       <w:r>
         <w:t>Logika i sztuczna inteligencja</w:t>
       </w:r>
@@ -3009,7 +3323,7 @@
           <w:bCs/>
         </w:rPr>
       </w:pPr>
-      <w:bookmarkStart w:id="10" w:name="_Toc235900940"/>
+      <w:bookmarkStart w:id="10" w:name="_Toc236174783"/>
       <w:r>
         <w:rPr>
           <w:b/>
@@ -3023,7 +3337,7 @@
       <w:pPr>
         <w:pStyle w:val="Nagwek2"/>
       </w:pPr>
-      <w:bookmarkStart w:id="11" w:name="_Toc235900941"/>
+      <w:bookmarkStart w:id="11" w:name="_Toc236174784"/>
       <w:r>
         <w:t>1. Wzorzec Pętli Gry (Game Loop)</w:t>
       </w:r>
@@ -3141,7 +3455,7 @@
       <w:pPr>
         <w:pStyle w:val="Nagwek2"/>
       </w:pPr>
-      <w:bookmarkStart w:id="12" w:name="_Toc235900942"/>
+      <w:bookmarkStart w:id="12" w:name="_Toc236174785"/>
       <w:r>
         <w:t>2. Wzorzec Pyłku (Flyweight)</w:t>
       </w:r>
@@ -3254,7 +3568,7 @@
       <w:pPr>
         <w:pStyle w:val="Nagwek2"/>
       </w:pPr>
-      <w:bookmarkStart w:id="13" w:name="_Toc235900943"/>
+      <w:bookmarkStart w:id="13" w:name="_Toc236174786"/>
       <w:r>
         <w:t xml:space="preserve">3. </w:t>
       </w:r>
@@ -3366,7 +3680,7 @@
           <w:lang w:val="en-GB"/>
         </w:rPr>
       </w:pPr>
-      <w:bookmarkStart w:id="14" w:name="_Toc235900944"/>
+      <w:bookmarkStart w:id="14" w:name="_Toc236174787"/>
       <w:r>
         <w:rPr>
           <w:lang w:val="en-GB"/>
@@ -3758,7 +4072,7 @@
       <w:pPr>
         <w:pStyle w:val="Nagwek2"/>
       </w:pPr>
-      <w:bookmarkStart w:id="15" w:name="_Toc235900945"/>
+      <w:bookmarkStart w:id="15" w:name="_Toc236174788"/>
       <w:r>
         <w:t>5. Projektowanie sterowane danymi (Data-Driven Design)</w:t>
       </w:r>
@@ -4532,7 +4846,7 @@
       <w:pPr>
         <w:pStyle w:val="Nagwek2"/>
       </w:pPr>
-      <w:bookmarkStart w:id="16" w:name="_Toc235900946"/>
+      <w:bookmarkStart w:id="16" w:name="_Toc236174789"/>
       <w:r>
         <w:t>6. Wzorzec polecenia (Command Buffer)</w:t>
       </w:r>
@@ -5538,7 +5852,7 @@
       <w:pPr>
         <w:pStyle w:val="Nagwek2"/>
       </w:pPr>
-      <w:bookmarkStart w:id="17" w:name="_Toc235900947"/>
+      <w:bookmarkStart w:id="17" w:name="_Toc236174790"/>
       <w:r>
         <w:t>7. Wzorzec Obserwatora (Observer)</w:t>
       </w:r>
@@ -6027,7 +6341,7 @@
       <w:pPr>
         <w:pStyle w:val="Nagwek2"/>
       </w:pPr>
-      <w:bookmarkStart w:id="18" w:name="_Toc235900948"/>
+      <w:bookmarkStart w:id="18" w:name="_Toc236174791"/>
       <w:r>
         <w:t>8. Maszyna Stanów (FSM)</w:t>
       </w:r>
@@ -6404,7 +6718,7 @@
           <w:bCs/>
         </w:rPr>
       </w:pPr>
-      <w:bookmarkStart w:id="19" w:name="_Toc235900949"/>
+      <w:bookmarkStart w:id="19" w:name="_Toc236174792"/>
       <w:r>
         <w:rPr>
           <w:b/>
@@ -6582,7 +6896,7 @@
           <w:bCs/>
         </w:rPr>
       </w:pPr>
-      <w:bookmarkStart w:id="20" w:name="_Toc235900950"/>
+      <w:bookmarkStart w:id="20" w:name="_Toc236174793"/>
       <w:r>
         <w:rPr>
           <w:b/>
@@ -6596,7 +6910,7 @@
       <w:pPr>
         <w:pStyle w:val="Nagwek3"/>
       </w:pPr>
-      <w:bookmarkStart w:id="21" w:name="_Toc235900951"/>
+      <w:bookmarkStart w:id="21" w:name="_Toc236174794"/>
       <w:r>
         <w:t xml:space="preserve">1. </w:t>
       </w:r>
@@ -6641,7 +6955,7 @@
       <w:pPr>
         <w:pStyle w:val="Nagwek3"/>
       </w:pPr>
-      <w:bookmarkStart w:id="22" w:name="_Toc235900952"/>
+      <w:bookmarkStart w:id="22" w:name="_Toc236174795"/>
       <w:r>
         <w:t>2. Wzorzec Pyłku (Flyweight) + Wzorzec Odmiany: Pula Obiektów (Object Pool)</w:t>
       </w:r>
@@ -6713,7 +7027,7 @@
       <w:pPr>
         <w:pStyle w:val="Nagwek3"/>
       </w:pPr>
-      <w:bookmarkStart w:id="23" w:name="_Toc235900953"/>
+      <w:bookmarkStart w:id="23" w:name="_Toc236174796"/>
       <w:r>
         <w:t>3. Wzorzec ECS (Entity Component System)</w:t>
       </w:r>
@@ -6802,7 +7116,7 @@
       <w:pPr>
         <w:pStyle w:val="Nagwek3"/>
       </w:pPr>
-      <w:bookmarkStart w:id="24" w:name="_Toc235900954"/>
+      <w:bookmarkStart w:id="24" w:name="_Toc236174797"/>
       <w:r>
         <w:t>4. Projektowanie Sterowane Danymi (Data-Driven Design)</w:t>
       </w:r>
@@ -6887,7 +7201,7 @@
           <w:lang w:val="en-GB"/>
         </w:rPr>
       </w:pPr>
-      <w:bookmarkStart w:id="25" w:name="_Toc235900955"/>
+      <w:bookmarkStart w:id="25" w:name="_Toc236174798"/>
       <w:r>
         <w:rPr>
           <w:lang w:val="en-GB"/>
@@ -7045,7 +7359,7 @@
       <w:pPr>
         <w:pStyle w:val="Nagwek3"/>
       </w:pPr>
-      <w:bookmarkStart w:id="26" w:name="_Toc235900956"/>
+      <w:bookmarkStart w:id="26" w:name="_Toc236174799"/>
       <w:r>
         <w:t>6. Wzorzec Obserwatora (Event Queue)</w:t>
       </w:r>
@@ -7125,7 +7439,7 @@
       <w:pPr>
         <w:pStyle w:val="Nagwek3"/>
       </w:pPr>
-      <w:bookmarkStart w:id="27" w:name="_Toc235900957"/>
+      <w:bookmarkStart w:id="27" w:name="_Toc236174800"/>
       <w:r>
         <w:t>7. Wzorzec Maszyny Stanów (Finite State Machine)</w:t>
       </w:r>
@@ -7195,6 +7509,868 @@
           <w:rFonts w:asciiTheme="majorHAnsi" w:hAnsiTheme="majorHAnsi" w:cs="Courier New"/>
         </w:rPr>
       </w:pPr>
+    </w:p>
+    <w:p>
+      <w:pPr>
+        <w:pStyle w:val="Nagwek1"/>
+        <w:jc w:val="center"/>
+        <w:rPr>
+          <w:b/>
+          <w:bCs/>
+        </w:rPr>
+      </w:pPr>
+      <w:bookmarkStart w:id="28" w:name="_Toc236174801"/>
+      <w:r>
+        <w:rPr>
+          <w:b/>
+          <w:bCs/>
+        </w:rPr>
+        <w:t>Architektura i podział silnika na warstwy (ECS)</w:t>
+      </w:r>
+      <w:bookmarkEnd w:id="28"/>
+    </w:p>
+    <w:p>
+      <w:pPr>
+        <w:jc w:val="both"/>
+        <w:rPr>
+          <w:rFonts w:asciiTheme="majorHAnsi" w:hAnsiTheme="majorHAnsi" w:cs="Courier New"/>
+        </w:rPr>
+      </w:pPr>
+      <w:r>
+        <w:rPr>
+          <w:rFonts w:asciiTheme="majorHAnsi" w:hAnsiTheme="majorHAnsi" w:cs="Courier New"/>
+        </w:rPr>
+        <w:t>Strukturalny podział odpowiedzialności wewnątrz kodu silnika, optymalizujący zarządzanie pamięcią w języku C# oraz komunikację z OpenGL.</w:t>
+      </w:r>
+    </w:p>
+    <w:p>
+      <w:pPr>
+        <w:jc w:val="both"/>
+        <w:rPr>
+          <w:rFonts w:asciiTheme="majorHAnsi" w:hAnsiTheme="majorHAnsi" w:cs="Courier New"/>
+        </w:rPr>
+      </w:pPr>
+    </w:p>
+    <w:p>
+      <w:pPr>
+        <w:pStyle w:val="Nagwek2"/>
+      </w:pPr>
+      <w:bookmarkStart w:id="29" w:name="_Toc236174802"/>
+      <w:r>
+        <w:t>CORE (Jądro Silnika i ECS)</w:t>
+      </w:r>
+      <w:bookmarkEnd w:id="29"/>
+    </w:p>
+    <w:p>
+      <w:pPr>
+        <w:jc w:val="both"/>
+        <w:rPr>
+          <w:rFonts w:asciiTheme="majorHAnsi" w:hAnsiTheme="majorHAnsi" w:cs="Courier New"/>
+          <w:b/>
+          <w:bCs/>
+        </w:rPr>
+      </w:pPr>
+      <w:r>
+        <w:rPr>
+          <w:rFonts w:asciiTheme="majorHAnsi" w:hAnsiTheme="majorHAnsi" w:cs="Courier New"/>
+        </w:rPr>
+        <w:t>W</w:t>
+      </w:r>
+      <w:r>
+        <w:rPr>
+          <w:rFonts w:asciiTheme="majorHAnsi" w:hAnsiTheme="majorHAnsi" w:cs="Courier New"/>
+        </w:rPr>
+        <w:t xml:space="preserve"> architekturze ECS warstwa Core zawiera nie tylko pętlę gry, ale staje się "menedżerem bazy danych" dla wszystkich obiektów w świecie gry</w:t>
+      </w:r>
+      <w:r>
+        <w:rPr>
+          <w:rFonts w:asciiTheme="majorHAnsi" w:hAnsiTheme="majorHAnsi" w:cs="Courier New"/>
+        </w:rPr>
+        <w:t>:</w:t>
+      </w:r>
+    </w:p>
+    <w:p>
+      <w:pPr>
+        <w:pStyle w:val="z1qcye"/>
+        <w:numPr>
+          <w:ilvl w:val="1"/>
+          <w:numId w:val="32"/>
+        </w:numPr>
+        <w:spacing w:before="0" w:beforeAutospacing="0" w:after="0" w:afterAutospacing="0" w:line="276" w:lineRule="auto"/>
+        <w:rPr>
+          <w:rFonts w:asciiTheme="majorHAnsi" w:hAnsiTheme="majorHAnsi" w:cs="Arial"/>
+        </w:rPr>
+      </w:pPr>
+      <w:r>
+        <w:rPr>
+          <w:rStyle w:val="Pogrubienie"/>
+          <w:rFonts w:asciiTheme="majorHAnsi" w:hAnsiTheme="majorHAnsi" w:cs="Arial"/>
+        </w:rPr>
+        <w:t>Pętla Gry (Game Loop &amp; Time):</w:t>
+      </w:r>
+      <w:r>
+        <w:rPr>
+          <w:rStyle w:val="inqyif"/>
+          <w:rFonts w:asciiTheme="majorHAnsi" w:hAnsiTheme="majorHAnsi" w:cs="Arial"/>
+        </w:rPr>
+        <w:t xml:space="preserve"> Odpowiada za taktowanie silnika (</w:t>
+      </w:r>
+      <w:r>
+        <w:rPr>
+          <w:rStyle w:val="Uwydatnienie"/>
+          <w:rFonts w:asciiTheme="majorHAnsi" w:hAnsiTheme="majorHAnsi" w:cs="Arial"/>
+        </w:rPr>
+        <w:t>Fixed Update / Variable Render</w:t>
+      </w:r>
+      <w:r>
+        <w:rPr>
+          <w:rStyle w:val="inqyif"/>
+          <w:rFonts w:asciiTheme="majorHAnsi" w:hAnsiTheme="majorHAnsi" w:cs="Arial"/>
+        </w:rPr>
+        <w:t>), dostarcza stabilny krok czasu dla systemów logicznyc</w:t>
+      </w:r>
+      <w:r>
+        <w:rPr>
+          <w:rStyle w:val="inqyif"/>
+          <w:rFonts w:asciiTheme="majorHAnsi" w:hAnsiTheme="majorHAnsi" w:cs="Arial"/>
+        </w:rPr>
+        <w:t>h.</w:t>
+      </w:r>
+    </w:p>
+    <w:p>
+      <w:pPr>
+        <w:pStyle w:val="z1qcye"/>
+        <w:numPr>
+          <w:ilvl w:val="1"/>
+          <w:numId w:val="32"/>
+        </w:numPr>
+        <w:spacing w:before="0" w:beforeAutospacing="0" w:after="0" w:afterAutospacing="0" w:line="276" w:lineRule="auto"/>
+        <w:rPr>
+          <w:rFonts w:asciiTheme="majorHAnsi" w:hAnsiTheme="majorHAnsi" w:cs="Arial"/>
+        </w:rPr>
+      </w:pPr>
+      <w:r>
+        <w:rPr>
+          <w:rStyle w:val="Pogrubienie"/>
+          <w:rFonts w:asciiTheme="majorHAnsi" w:hAnsiTheme="majorHAnsi" w:cs="Arial"/>
+          <w:lang w:val="en-GB"/>
+        </w:rPr>
+        <w:t>Menedżer Świata ECS (World / EntityManager):</w:t>
+      </w:r>
+      <w:r>
+        <w:rPr>
+          <w:rStyle w:val="inqyif"/>
+          <w:rFonts w:asciiTheme="majorHAnsi" w:hAnsiTheme="majorHAnsi" w:cs="Arial"/>
+          <w:lang w:val="en-GB"/>
+        </w:rPr>
+        <w:t xml:space="preserve"> Serce ECS. </w:t>
+      </w:r>
+      <w:r>
+        <w:rPr>
+          <w:rStyle w:val="inqyif"/>
+          <w:rFonts w:asciiTheme="majorHAnsi" w:hAnsiTheme="majorHAnsi" w:cs="Arial"/>
+        </w:rPr>
+        <w:t>Zarządza tablicami encji (zwykłe numery ID z Puli Obiektów) oraz przydzielaniem i recyklingiem pamięci dla struktur komponentów.</w:t>
+      </w:r>
+    </w:p>
+    <w:p>
+      <w:pPr>
+        <w:pStyle w:val="z1qcye"/>
+        <w:numPr>
+          <w:ilvl w:val="1"/>
+          <w:numId w:val="32"/>
+        </w:numPr>
+        <w:spacing w:before="0" w:beforeAutospacing="0" w:after="0" w:afterAutospacing="0" w:line="276" w:lineRule="auto"/>
+        <w:rPr>
+          <w:rFonts w:asciiTheme="majorHAnsi" w:hAnsiTheme="majorHAnsi" w:cs="Arial"/>
+        </w:rPr>
+      </w:pPr>
+      <w:r>
+        <w:rPr>
+          <w:rStyle w:val="Pogrubienie"/>
+          <w:rFonts w:asciiTheme="majorHAnsi" w:hAnsiTheme="majorHAnsi" w:cs="Arial"/>
+        </w:rPr>
+        <w:t>Bufor Poleceń i Kolejka Zdarzeń (Command Buffer &amp; Event Queue):</w:t>
+      </w:r>
+      <w:r>
+        <w:rPr>
+          <w:rStyle w:val="inqyif"/>
+          <w:rFonts w:asciiTheme="majorHAnsi" w:hAnsiTheme="majorHAnsi" w:cs="Arial"/>
+        </w:rPr>
+        <w:t xml:space="preserve"> Mechanizmy wątkowo bezpiecznej komunikacji między zdarzeniami WinForms a wątkiem gry, oraz kolejka do asynchronicznego informowania UI o zmianach w świecie gry.</w:t>
+      </w:r>
+    </w:p>
+    <w:p>
+      <w:pPr>
+        <w:pStyle w:val="z1qcye"/>
+        <w:numPr>
+          <w:ilvl w:val="1"/>
+          <w:numId w:val="32"/>
+        </w:numPr>
+        <w:spacing w:before="0" w:beforeAutospacing="0" w:after="0" w:afterAutospacing="0" w:line="276" w:lineRule="auto"/>
+        <w:rPr>
+          <w:rStyle w:val="inqyif"/>
+          <w:rFonts w:asciiTheme="majorHAnsi" w:hAnsiTheme="majorHAnsi" w:cs="Arial"/>
+        </w:rPr>
+      </w:pPr>
+      <w:r>
+        <w:rPr>
+          <w:rStyle w:val="Pogrubienie"/>
+          <w:rFonts w:asciiTheme="majorHAnsi" w:hAnsiTheme="majorHAnsi" w:cs="Arial"/>
+        </w:rPr>
+        <w:t>Matematyka 3D (Math):</w:t>
+      </w:r>
+      <w:r>
+        <w:rPr>
+          <w:rStyle w:val="inqyif"/>
+          <w:rFonts w:asciiTheme="majorHAnsi" w:hAnsiTheme="majorHAnsi" w:cs="Arial"/>
+        </w:rPr>
+        <w:t xml:space="preserve"> Wektory, macierze oraz </w:t>
+      </w:r>
+      <w:r>
+        <w:rPr>
+          <w:rStyle w:val="Pogrubienie"/>
+          <w:rFonts w:asciiTheme="majorHAnsi" w:hAnsiTheme="majorHAnsi" w:cs="Arial"/>
+        </w:rPr>
+        <w:t>Kwaterniony</w:t>
+      </w:r>
+      <w:r>
+        <w:rPr>
+          <w:rStyle w:val="inqyif"/>
+          <w:rFonts w:asciiTheme="majorHAnsi" w:hAnsiTheme="majorHAnsi" w:cs="Arial"/>
+        </w:rPr>
+        <w:t xml:space="preserve"> (</w:t>
+      </w:r>
+      <w:r>
+        <w:rPr>
+          <w:rStyle w:val="HTML-kod"/>
+          <w:rFonts w:asciiTheme="majorHAnsi" w:hAnsiTheme="majorHAnsi"/>
+          <w:sz w:val="24"/>
+          <w:szCs w:val="24"/>
+        </w:rPr>
+        <w:t>Quaternion</w:t>
+      </w:r>
+      <w:r>
+        <w:rPr>
+          <w:rStyle w:val="inqyif"/>
+          <w:rFonts w:asciiTheme="majorHAnsi" w:hAnsiTheme="majorHAnsi" w:cs="Arial"/>
+        </w:rPr>
+        <w:t>).</w:t>
+      </w:r>
+    </w:p>
+    <w:p>
+      <w:pPr>
+        <w:pStyle w:val="z1qcye"/>
+        <w:spacing w:before="0" w:beforeAutospacing="0" w:after="0" w:afterAutospacing="0" w:line="276" w:lineRule="auto"/>
+        <w:rPr>
+          <w:rStyle w:val="inqyif"/>
+          <w:rFonts w:asciiTheme="majorHAnsi" w:hAnsiTheme="majorHAnsi" w:cs="Arial"/>
+        </w:rPr>
+      </w:pPr>
+    </w:p>
+    <w:p>
+      <w:pPr>
+        <w:pStyle w:val="Nagwek2"/>
+      </w:pPr>
+      <w:bookmarkStart w:id="30" w:name="_Toc236174803"/>
+      <w:r>
+        <w:t>RENDERING (Silnik Graficzny i Potok OpenGL)</w:t>
+      </w:r>
+      <w:bookmarkEnd w:id="30"/>
+    </w:p>
+    <w:p>
+      <w:pPr>
+        <w:rPr>
+          <w:rFonts w:cstheme="majorBidi"/>
+        </w:rPr>
+      </w:pPr>
+      <w:r>
+        <w:t>W</w:t>
+      </w:r>
+      <w:r>
+        <w:rPr>
+          <w:lang w:eastAsia="pl-PL"/>
+        </w:rPr>
+        <w:t>arstwa staje się bezstanowym wykonawcą. Pobiera dane z Core (z tablic komponentów ECS) i przesyła je bezpośrednio do GPU</w:t>
+      </w:r>
+      <w:r>
+        <w:t>:</w:t>
+      </w:r>
+    </w:p>
+    <w:p>
+      <w:pPr>
+        <w:pStyle w:val="z1qcye"/>
+        <w:numPr>
+          <w:ilvl w:val="1"/>
+          <w:numId w:val="32"/>
+        </w:numPr>
+        <w:spacing w:before="0" w:beforeAutospacing="0" w:after="0" w:afterAutospacing="0" w:line="276" w:lineRule="auto"/>
+        <w:rPr>
+          <w:rFonts w:asciiTheme="majorHAnsi" w:hAnsiTheme="majorHAnsi" w:cs="Arial"/>
+        </w:rPr>
+      </w:pPr>
+      <w:r>
+        <w:rPr>
+          <w:rStyle w:val="Pogrubienie"/>
+          <w:rFonts w:asciiTheme="majorHAnsi" w:hAnsiTheme="majorHAnsi" w:cs="Arial"/>
+        </w:rPr>
+        <w:t>Opakowanie Kontekstu (WGL Context):</w:t>
+      </w:r>
+      <w:r>
+        <w:rPr>
+          <w:rStyle w:val="inqyif"/>
+          <w:rFonts w:asciiTheme="majorHAnsi" w:hAnsiTheme="majorHAnsi" w:cs="Arial"/>
+        </w:rPr>
+        <w:t xml:space="preserve"> </w:t>
+      </w:r>
+      <w:r>
+        <w:rPr>
+          <w:rStyle w:val="inqyif"/>
+          <w:rFonts w:asciiTheme="majorHAnsi" w:hAnsiTheme="majorHAnsi" w:cs="Arial"/>
+        </w:rPr>
+        <w:t>N</w:t>
+      </w:r>
+      <w:r>
+        <w:rPr>
+          <w:rStyle w:val="inqyif"/>
+          <w:rFonts w:asciiTheme="majorHAnsi" w:hAnsiTheme="majorHAnsi" w:cs="Arial"/>
+        </w:rPr>
+        <w:t>iskopoziomowe zarządzani</w:t>
+      </w:r>
+      <w:r>
+        <w:rPr>
+          <w:rStyle w:val="inqyif"/>
+          <w:rFonts w:asciiTheme="majorHAnsi" w:hAnsiTheme="majorHAnsi" w:cs="Arial"/>
+        </w:rPr>
+        <w:t>e</w:t>
+      </w:r>
+      <w:r>
+        <w:rPr>
+          <w:rStyle w:val="inqyif"/>
+          <w:rFonts w:asciiTheme="majorHAnsi" w:hAnsiTheme="majorHAnsi" w:cs="Arial"/>
+        </w:rPr>
+        <w:t xml:space="preserve"> kontekstem graficznym i wywołaniem </w:t>
+      </w:r>
+      <w:r>
+        <w:rPr>
+          <w:rStyle w:val="HTML-kod"/>
+          <w:rFonts w:asciiTheme="majorHAnsi" w:hAnsiTheme="majorHAnsi"/>
+          <w:sz w:val="24"/>
+          <w:szCs w:val="24"/>
+        </w:rPr>
+        <w:t>wglSwapBuffers</w:t>
+      </w:r>
+      <w:r>
+        <w:rPr>
+          <w:rStyle w:val="HTML-kod"/>
+          <w:rFonts w:asciiTheme="majorHAnsi" w:hAnsiTheme="majorHAnsi"/>
+          <w:sz w:val="24"/>
+          <w:szCs w:val="24"/>
+        </w:rPr>
+        <w:t xml:space="preserve"> (klasa TGLContext)</w:t>
+      </w:r>
+      <w:r>
+        <w:rPr>
+          <w:rStyle w:val="inqyif"/>
+          <w:rFonts w:asciiTheme="majorHAnsi" w:hAnsiTheme="majorHAnsi" w:cs="Arial"/>
+        </w:rPr>
+        <w:t>.</w:t>
+      </w:r>
+    </w:p>
+    <w:p>
+      <w:pPr>
+        <w:pStyle w:val="z1qcye"/>
+        <w:numPr>
+          <w:ilvl w:val="1"/>
+          <w:numId w:val="32"/>
+        </w:numPr>
+        <w:spacing w:before="0" w:beforeAutospacing="0" w:after="0" w:afterAutospacing="0" w:line="276" w:lineRule="auto"/>
+        <w:rPr>
+          <w:rFonts w:asciiTheme="majorHAnsi" w:hAnsiTheme="majorHAnsi" w:cs="Arial"/>
+        </w:rPr>
+      </w:pPr>
+      <w:r>
+        <w:rPr>
+          <w:rStyle w:val="Pogrubienie"/>
+          <w:rFonts w:asciiTheme="majorHAnsi" w:hAnsiTheme="majorHAnsi" w:cs="Arial"/>
+        </w:rPr>
+        <w:t>Zasoby Niezarządzane (OpenGL Wrappers):</w:t>
+      </w:r>
+      <w:r>
+        <w:rPr>
+          <w:rStyle w:val="inqyif"/>
+          <w:rFonts w:asciiTheme="majorHAnsi" w:hAnsiTheme="majorHAnsi" w:cs="Arial"/>
+        </w:rPr>
+        <w:t xml:space="preserve"> Klasy bezpiecznie opakowujące natywne obiekty OpenGL (</w:t>
+      </w:r>
+      <w:r>
+        <w:rPr>
+          <w:rStyle w:val="HTML-kod"/>
+          <w:rFonts w:asciiTheme="majorHAnsi" w:hAnsiTheme="majorHAnsi"/>
+          <w:sz w:val="21"/>
+          <w:szCs w:val="21"/>
+        </w:rPr>
+        <w:t>VAO</w:t>
+      </w:r>
+      <w:r>
+        <w:rPr>
+          <w:rStyle w:val="inqyif"/>
+          <w:rFonts w:asciiTheme="majorHAnsi" w:hAnsiTheme="majorHAnsi" w:cs="Arial"/>
+        </w:rPr>
+        <w:t xml:space="preserve">, </w:t>
+      </w:r>
+      <w:r>
+        <w:rPr>
+          <w:rStyle w:val="HTML-kod"/>
+          <w:rFonts w:asciiTheme="majorHAnsi" w:hAnsiTheme="majorHAnsi"/>
+          <w:sz w:val="21"/>
+          <w:szCs w:val="21"/>
+        </w:rPr>
+        <w:t>VBO</w:t>
+      </w:r>
+      <w:r>
+        <w:rPr>
+          <w:rStyle w:val="inqyif"/>
+          <w:rFonts w:asciiTheme="majorHAnsi" w:hAnsiTheme="majorHAnsi" w:cs="Arial"/>
+        </w:rPr>
+        <w:t xml:space="preserve">, </w:t>
+      </w:r>
+      <w:r>
+        <w:rPr>
+          <w:rStyle w:val="HTML-kod"/>
+          <w:rFonts w:asciiTheme="majorHAnsi" w:hAnsiTheme="majorHAnsi"/>
+          <w:sz w:val="21"/>
+          <w:szCs w:val="21"/>
+        </w:rPr>
+        <w:t>IBO</w:t>
+      </w:r>
+      <w:r>
+        <w:rPr>
+          <w:rStyle w:val="inqyif"/>
+          <w:rFonts w:asciiTheme="majorHAnsi" w:hAnsiTheme="majorHAnsi" w:cs="Arial"/>
+        </w:rPr>
+        <w:t xml:space="preserve">, Shadery, Tekstury) implementujące interfejs </w:t>
+      </w:r>
+      <w:r>
+        <w:rPr>
+          <w:rStyle w:val="HTML-kod"/>
+          <w:rFonts w:asciiTheme="majorHAnsi" w:hAnsiTheme="majorHAnsi"/>
+          <w:sz w:val="24"/>
+          <w:szCs w:val="24"/>
+        </w:rPr>
+        <w:t>IDisposable</w:t>
+      </w:r>
+      <w:r>
+        <w:rPr>
+          <w:rStyle w:val="inqyif"/>
+          <w:rFonts w:asciiTheme="majorHAnsi" w:hAnsiTheme="majorHAnsi" w:cs="Arial"/>
+        </w:rPr>
+        <w:t>.</w:t>
+      </w:r>
+    </w:p>
+    <w:p>
+      <w:pPr>
+        <w:pStyle w:val="z1qcye"/>
+        <w:numPr>
+          <w:ilvl w:val="1"/>
+          <w:numId w:val="32"/>
+        </w:numPr>
+        <w:spacing w:before="0" w:beforeAutospacing="0" w:after="0" w:afterAutospacing="0" w:line="276" w:lineRule="auto"/>
+        <w:rPr>
+          <w:rFonts w:asciiTheme="majorHAnsi" w:hAnsiTheme="majorHAnsi" w:cs="Arial"/>
+        </w:rPr>
+      </w:pPr>
+      <w:r>
+        <w:rPr>
+          <w:rStyle w:val="Pogrubienie"/>
+          <w:rFonts w:asciiTheme="majorHAnsi" w:hAnsiTheme="majorHAnsi" w:cs="Arial"/>
+        </w:rPr>
+        <w:lastRenderedPageBreak/>
+        <w:t>Menedżer Zasobów (Asset Manager):</w:t>
+      </w:r>
+      <w:r>
+        <w:rPr>
+          <w:rStyle w:val="inqyif"/>
+          <w:rFonts w:asciiTheme="majorHAnsi" w:hAnsiTheme="majorHAnsi" w:cs="Arial"/>
+        </w:rPr>
+        <w:t xml:space="preserve"> System realizujący wzorzec Pyłku. Ładuje modele przez parser FBX, zapobiegając duplikacji tekstur i siatek geometrycznych w pamięci karty.</w:t>
+      </w:r>
+    </w:p>
+    <w:p>
+      <w:pPr>
+        <w:pStyle w:val="z1qcye"/>
+        <w:numPr>
+          <w:ilvl w:val="1"/>
+          <w:numId w:val="32"/>
+        </w:numPr>
+        <w:spacing w:before="0" w:beforeAutospacing="0" w:after="0" w:afterAutospacing="0" w:line="276" w:lineRule="auto"/>
+        <w:rPr>
+          <w:rStyle w:val="inqyif"/>
+          <w:rFonts w:asciiTheme="majorHAnsi" w:hAnsiTheme="majorHAnsi" w:cs="Arial"/>
+        </w:rPr>
+      </w:pPr>
+      <w:r>
+        <w:rPr>
+          <w:rStyle w:val="Pogrubienie"/>
+          <w:rFonts w:asciiTheme="majorHAnsi" w:hAnsiTheme="majorHAnsi" w:cs="Arial"/>
+        </w:rPr>
+        <w:t>Systemy Renderujące ECS (Render Systems):</w:t>
+      </w:r>
+      <w:r>
+        <w:rPr>
+          <w:rStyle w:val="inqyif"/>
+          <w:rFonts w:asciiTheme="majorHAnsi" w:hAnsiTheme="majorHAnsi" w:cs="Arial"/>
+        </w:rPr>
+        <w:t xml:space="preserve"> Specyficzne systemy (klasy z logiką), które co klatkę pobierają z bazy danych ECS komponenty pozycji oraz grafiki i rysują je w oknie. Tu implementujesz </w:t>
+      </w:r>
+      <w:r>
+        <w:rPr>
+          <w:rStyle w:val="Uwydatnienie"/>
+          <w:rFonts w:asciiTheme="majorHAnsi" w:hAnsiTheme="majorHAnsi" w:cs="Arial"/>
+        </w:rPr>
+        <w:t>Frustum Culling</w:t>
+      </w:r>
+      <w:r>
+        <w:rPr>
+          <w:rStyle w:val="inqyif"/>
+          <w:rFonts w:asciiTheme="majorHAnsi" w:hAnsiTheme="majorHAnsi" w:cs="Arial"/>
+        </w:rPr>
+        <w:t xml:space="preserve">, oświetlenie sceny oraz </w:t>
+      </w:r>
+      <w:r>
+        <w:rPr>
+          <w:rStyle w:val="Uwydatnienie"/>
+          <w:rFonts w:asciiTheme="majorHAnsi" w:hAnsiTheme="majorHAnsi" w:cs="Arial"/>
+        </w:rPr>
+        <w:t>Particle System</w:t>
+      </w:r>
+      <w:r>
+        <w:rPr>
+          <w:rStyle w:val="inqyif"/>
+          <w:rFonts w:asciiTheme="majorHAnsi" w:hAnsiTheme="majorHAnsi" w:cs="Arial"/>
+        </w:rPr>
+        <w:t>.</w:t>
+      </w:r>
+    </w:p>
+    <w:p>
+      <w:pPr>
+        <w:pStyle w:val="z1qcye"/>
+        <w:spacing w:before="0" w:beforeAutospacing="0" w:after="0" w:afterAutospacing="0" w:line="276" w:lineRule="auto"/>
+        <w:rPr>
+          <w:rStyle w:val="inqyif"/>
+          <w:rFonts w:asciiTheme="majorHAnsi" w:hAnsiTheme="majorHAnsi" w:cs="Arial"/>
+        </w:rPr>
+      </w:pPr>
+    </w:p>
+    <w:p>
+      <w:pPr>
+        <w:pStyle w:val="Nagwek2"/>
+      </w:pPr>
+      <w:bookmarkStart w:id="31" w:name="_Toc236174804"/>
+      <w:r>
+        <w:t>COMPONENTS (Czyste Dane / Struktury)</w:t>
+      </w:r>
+      <w:bookmarkEnd w:id="31"/>
+    </w:p>
+    <w:p>
+      <w:pPr>
+        <w:rPr>
+          <w:rFonts w:cstheme="majorBidi"/>
+        </w:rPr>
+      </w:pPr>
+      <w:r>
+        <w:t>W</w:t>
+      </w:r>
+      <w:r>
+        <w:rPr>
+          <w:lang w:eastAsia="pl-PL"/>
+        </w:rPr>
+        <w:t xml:space="preserve"> czystym ECS ta warstwa zawiera wyłącznie struktury danych (struct), pozbawione jakichkolwiek metod czy logiki. Służą one jako klocki opisujące stan obiektów w pamięci RAM</w:t>
+      </w:r>
+      <w:r>
+        <w:t>:</w:t>
+      </w:r>
+    </w:p>
+    <w:p>
+      <w:pPr>
+        <w:pStyle w:val="z1qcye"/>
+        <w:numPr>
+          <w:ilvl w:val="1"/>
+          <w:numId w:val="32"/>
+        </w:numPr>
+        <w:spacing w:line="276" w:lineRule="auto"/>
+        <w:rPr>
+          <w:rFonts w:asciiTheme="majorHAnsi" w:hAnsiTheme="majorHAnsi" w:cs="Arial"/>
+        </w:rPr>
+      </w:pPr>
+      <w:r>
+        <w:rPr>
+          <w:rFonts w:asciiTheme="majorHAnsi" w:hAnsiTheme="majorHAnsi" w:cs="Arial"/>
+          <w:b/>
+          <w:bCs/>
+        </w:rPr>
+        <w:t>TransformComponent:</w:t>
+      </w:r>
+      <w:r>
+        <w:rPr>
+          <w:rFonts w:asciiTheme="majorHAnsi" w:hAnsiTheme="majorHAnsi" w:cs="Arial"/>
+        </w:rPr>
+        <w:t xml:space="preserve"> Zawiera tylko pozycję, skalę oraz kwaternion rotacji (Quaternion).</w:t>
+      </w:r>
+    </w:p>
+    <w:p>
+      <w:pPr>
+        <w:pStyle w:val="z1qcye"/>
+        <w:numPr>
+          <w:ilvl w:val="1"/>
+          <w:numId w:val="32"/>
+        </w:numPr>
+        <w:spacing w:line="276" w:lineRule="auto"/>
+        <w:rPr>
+          <w:rFonts w:asciiTheme="majorHAnsi" w:hAnsiTheme="majorHAnsi" w:cs="Arial"/>
+        </w:rPr>
+      </w:pPr>
+      <w:r>
+        <w:rPr>
+          <w:rFonts w:asciiTheme="majorHAnsi" w:hAnsiTheme="majorHAnsi" w:cs="Arial"/>
+          <w:b/>
+          <w:bCs/>
+        </w:rPr>
+        <w:t>RenderMeshComponent:</w:t>
+      </w:r>
+      <w:r>
+        <w:rPr>
+          <w:rFonts w:asciiTheme="majorHAnsi" w:hAnsiTheme="majorHAnsi" w:cs="Arial"/>
+        </w:rPr>
+        <w:t xml:space="preserve"> Zawiera tylko identyfikatory (numery ID) zasobów z Menedżera Zasobów: MeshId i TextureId (Wzorzec Pyłku).</w:t>
+      </w:r>
+    </w:p>
+    <w:p>
+      <w:pPr>
+        <w:pStyle w:val="z1qcye"/>
+        <w:numPr>
+          <w:ilvl w:val="1"/>
+          <w:numId w:val="32"/>
+        </w:numPr>
+        <w:spacing w:line="276" w:lineRule="auto"/>
+        <w:rPr>
+          <w:rFonts w:asciiTheme="majorHAnsi" w:hAnsiTheme="majorHAnsi" w:cs="Arial"/>
+        </w:rPr>
+      </w:pPr>
+      <w:r>
+        <w:rPr>
+          <w:rFonts w:asciiTheme="majorHAnsi" w:hAnsiTheme="majorHAnsi" w:cs="Arial"/>
+          <w:b/>
+          <w:bCs/>
+        </w:rPr>
+        <w:t>PhysicsComponent / Collider:</w:t>
+      </w:r>
+      <w:r>
+        <w:rPr>
+          <w:rFonts w:asciiTheme="majorHAnsi" w:hAnsiTheme="majorHAnsi" w:cs="Arial"/>
+        </w:rPr>
+        <w:t xml:space="preserve"> Zawiera wymiary bryły brzegowej (Bounding Box) do detekcji kolizji.</w:t>
+      </w:r>
+    </w:p>
+    <w:p>
+      <w:pPr>
+        <w:pStyle w:val="z1qcye"/>
+        <w:numPr>
+          <w:ilvl w:val="1"/>
+          <w:numId w:val="32"/>
+        </w:numPr>
+        <w:spacing w:before="0" w:beforeAutospacing="0" w:after="0" w:afterAutospacing="0" w:line="276" w:lineRule="auto"/>
+        <w:rPr>
+          <w:rFonts w:asciiTheme="majorHAnsi" w:hAnsiTheme="majorHAnsi" w:cs="Arial"/>
+        </w:rPr>
+      </w:pPr>
+      <w:r>
+        <w:rPr>
+          <w:rFonts w:asciiTheme="majorHAnsi" w:hAnsiTheme="majorHAnsi" w:cs="Arial"/>
+          <w:b/>
+          <w:bCs/>
+        </w:rPr>
+        <w:t>AiComponent:</w:t>
+      </w:r>
+      <w:r>
+        <w:rPr>
+          <w:rFonts w:asciiTheme="majorHAnsi" w:hAnsiTheme="majorHAnsi" w:cs="Arial"/>
+        </w:rPr>
+        <w:t xml:space="preserve"> Przechowuje tylko aktualny stan potwora w postaci prostego enuma (Maszyna Stanów) oraz zmienne pomocnicze, np. czas trwania stanu czy ID celu.</w:t>
+      </w:r>
+    </w:p>
+    <w:p>
+      <w:pPr>
+        <w:pStyle w:val="z1qcye"/>
+        <w:spacing w:before="0" w:beforeAutospacing="0" w:after="0" w:afterAutospacing="0" w:line="276" w:lineRule="auto"/>
+        <w:rPr>
+          <w:rFonts w:asciiTheme="majorHAnsi" w:hAnsiTheme="majorHAnsi" w:cs="Arial"/>
+        </w:rPr>
+      </w:pPr>
+    </w:p>
+    <w:p>
+      <w:pPr>
+        <w:pStyle w:val="Nagwek2"/>
+      </w:pPr>
+      <w:bookmarkStart w:id="32" w:name="_Toc236174805"/>
+      <w:r>
+        <w:t>SYSTEMS (Logika Rozgrywki)</w:t>
+      </w:r>
+      <w:bookmarkEnd w:id="32"/>
+    </w:p>
+    <w:p>
+      <w:pPr>
+        <w:rPr>
+          <w:rFonts w:cstheme="majorBidi"/>
+        </w:rPr>
+      </w:pPr>
+      <w:r>
+        <w:t>K</w:t>
+      </w:r>
+      <w:r>
+        <w:rPr>
+          <w:lang w:eastAsia="pl-PL"/>
+        </w:rPr>
+        <w:t xml:space="preserve">omponenty są "ślepe" i nie mają kodu, </w:t>
+      </w:r>
+      <w:r>
+        <w:t>potrzebna jest</w:t>
+      </w:r>
+      <w:r>
+        <w:rPr>
+          <w:lang w:eastAsia="pl-PL"/>
+        </w:rPr>
+        <w:t xml:space="preserve"> </w:t>
+      </w:r>
+      <w:r>
+        <w:t>czwarta</w:t>
+      </w:r>
+      <w:r>
+        <w:rPr>
+          <w:lang w:eastAsia="pl-PL"/>
+        </w:rPr>
+        <w:t xml:space="preserve"> </w:t>
+      </w:r>
+      <w:r>
+        <w:t>warstwa</w:t>
+      </w:r>
+      <w:r>
+        <w:rPr>
+          <w:lang w:eastAsia="pl-PL"/>
+        </w:rPr>
+        <w:t>, która spina logikę gry. To tutaj lądują wszystkie klasy przetwarzające dane</w:t>
+      </w:r>
+      <w:r>
+        <w:t>:</w:t>
+      </w:r>
+    </w:p>
+    <w:p>
+      <w:pPr>
+        <w:pStyle w:val="z1qcye"/>
+        <w:numPr>
+          <w:ilvl w:val="1"/>
+          <w:numId w:val="32"/>
+        </w:numPr>
+        <w:spacing w:line="276" w:lineRule="auto"/>
+        <w:rPr>
+          <w:rFonts w:asciiTheme="majorHAnsi" w:hAnsiTheme="majorHAnsi" w:cs="Arial"/>
+        </w:rPr>
+      </w:pPr>
+      <w:r>
+        <w:rPr>
+          <w:rFonts w:asciiTheme="majorHAnsi" w:hAnsiTheme="majorHAnsi" w:cs="Arial"/>
+          <w:b/>
+          <w:bCs/>
+        </w:rPr>
+        <w:t>InputSystem:</w:t>
+      </w:r>
+      <w:r>
+        <w:rPr>
+          <w:rFonts w:asciiTheme="majorHAnsi" w:hAnsiTheme="majorHAnsi" w:cs="Arial"/>
+        </w:rPr>
+        <w:t xml:space="preserve"> Pobiera polecenia z Command Buffera (z WinForms) i przekłada je na akcje w grze.</w:t>
+      </w:r>
+    </w:p>
+    <w:p>
+      <w:pPr>
+        <w:pStyle w:val="z1qcye"/>
+        <w:numPr>
+          <w:ilvl w:val="1"/>
+          <w:numId w:val="32"/>
+        </w:numPr>
+        <w:spacing w:line="276" w:lineRule="auto"/>
+        <w:rPr>
+          <w:rFonts w:asciiTheme="majorHAnsi" w:hAnsiTheme="majorHAnsi" w:cs="Arial"/>
+        </w:rPr>
+      </w:pPr>
+      <w:r>
+        <w:rPr>
+          <w:rFonts w:asciiTheme="majorHAnsi" w:hAnsiTheme="majorHAnsi" w:cs="Arial"/>
+          <w:b/>
+          <w:bCs/>
+        </w:rPr>
+        <w:t>MovementSystem:</w:t>
+      </w:r>
+      <w:r>
+        <w:rPr>
+          <w:rFonts w:asciiTheme="majorHAnsi" w:hAnsiTheme="majorHAnsi" w:cs="Arial"/>
+        </w:rPr>
+        <w:t xml:space="preserve"> Liniowo przetwarza tablicę komponentów ruchu i aktualizuje pozycje.</w:t>
+      </w:r>
+    </w:p>
+    <w:p>
+      <w:pPr>
+        <w:pStyle w:val="z1qcye"/>
+        <w:numPr>
+          <w:ilvl w:val="1"/>
+          <w:numId w:val="32"/>
+        </w:numPr>
+        <w:spacing w:line="276" w:lineRule="auto"/>
+        <w:rPr>
+          <w:rFonts w:asciiTheme="majorHAnsi" w:hAnsiTheme="majorHAnsi" w:cs="Arial"/>
+        </w:rPr>
+      </w:pPr>
+      <w:r>
+        <w:rPr>
+          <w:rFonts w:asciiTheme="majorHAnsi" w:hAnsiTheme="majorHAnsi" w:cs="Arial"/>
+          <w:b/>
+          <w:bCs/>
+        </w:rPr>
+        <w:t>AiSystem:</w:t>
+      </w:r>
+      <w:r>
+        <w:rPr>
+          <w:rFonts w:asciiTheme="majorHAnsi" w:hAnsiTheme="majorHAnsi" w:cs="Arial"/>
+        </w:rPr>
+        <w:t xml:space="preserve"> Analizuje komponenty sztucznej inteligencji, realizuje Maszynę Stanów potworów i uruchamia algorytm Pathfindingu (A*).</w:t>
+      </w:r>
+    </w:p>
+    <w:p>
+      <w:pPr>
+        <w:pStyle w:val="z1qcye"/>
+        <w:numPr>
+          <w:ilvl w:val="1"/>
+          <w:numId w:val="32"/>
+        </w:numPr>
+        <w:spacing w:after="0" w:line="276" w:lineRule="auto"/>
+        <w:rPr>
+          <w:rFonts w:asciiTheme="majorHAnsi" w:hAnsiTheme="majorHAnsi" w:cs="Arial"/>
+        </w:rPr>
+      </w:pPr>
+      <w:r>
+        <w:rPr>
+          <w:rFonts w:asciiTheme="majorHAnsi" w:hAnsiTheme="majorHAnsi" w:cs="Arial"/>
+          <w:b/>
+          <w:bCs/>
+        </w:rPr>
+        <w:t>CollisionSystem:</w:t>
+      </w:r>
+      <w:r>
+        <w:rPr>
+          <w:rFonts w:asciiTheme="majorHAnsi" w:hAnsiTheme="majorHAnsi" w:cs="Arial"/>
+        </w:rPr>
+        <w:t xml:space="preserve"> Odpowiada za detekcję kolizji, omijanie przeszkód przez gracza oraz rejestrowanie trafień pocisków.</w:t>
+      </w:r>
     </w:p>
     <w:sectPr>
       <w:pgSz w:w="11906" w:h="16838"/>
@@ -7207,7 +8383,7 @@
 </file>
 
 <file path=word/endnotes.xml><?xml version="1.0" encoding="utf-8"?>
-<w:endnotes xmlns:wpc="http://schemas.microsoft.com/office/word/2010/wordprocessingCanvas" xmlns:cx="http://schemas.microsoft.com/office/drawing/2014/chartex" xmlns:cx1="http://schemas.microsoft.com/office/drawing/2015/9/8/chartex" xmlns:cx2="http://schemas.microsoft.com/office/drawing/2015/10/21/chartex" xmlns:cx3="http://schemas.microsoft.com/office/drawing/2016/5/9/chartex" xmlns:cx4="http://schemas.microsoft.com/office/drawing/2016/5/10/chartex" xmlns:cx5="http://schemas.microsoft.com/office/drawing/2016/5/11/chartex" xmlns:cx6="http://schemas.microsoft.com/office/drawing/2016/5/12/chartex" xmlns:cx7="http://schemas.microsoft.com/office/drawing/2016/5/13/chartex" xmlns:cx8="http://schemas.microsoft.com/office/drawing/2016/5/14/chartex" xmlns:mc="http://schemas.openxmlformats.org/markup-compatibility/2006" xmlns:aink="http://schemas.microsoft.com/office/drawing/2016/ink" xmlns:am3d="http://schemas.microsoft.com/office/drawing/2017/model3d" xmlns:o="urn:schemas-microsoft-com:office:office" xmlns:oel="http://schemas.microsoft.com/office/2019/extlst" xmlns:r="http://schemas.openxmlformats.org/officeDocument/2006/relationships" xmlns:m="http://schemas.openxmlformats.org/officeDocument/2006/math" xmlns:v="urn:schemas-microsoft-com:vml" xmlns:wp14="http://schemas.microsoft.com/office/word/2010/wordprocessingDrawing" xmlns:wp="http://schemas.openxmlformats.org/drawingml/2006/wordprocessingDrawing" xmlns:w10="urn:schemas-microsoft-com:office:word" xmlns:w="http://schemas.openxmlformats.org/wordprocessingml/2006/main" xmlns:w14="http://schemas.microsoft.com/office/word/2010/wordml" xmlns:w15="http://schemas.microsoft.com/office/word/2012/wordml" xmlns:w16cex="http://schemas.microsoft.com/office/word/2018/wordml/cex" xmlns:w16cid="http://schemas.microsoft.com/office/word/2016/wordml/cid" xmlns:w16="http://schemas.microsoft.com/office/word/2018/wordml" xmlns:w16du="http://schemas.microsoft.com/office/word/2023/wordml/word16du" xmlns:w16sdtdh="http://schemas.microsoft.com/office/word/2020/wordml/sdtdatahash" xmlns:w16sdtfl="http://schemas.microsoft.com/office/word/2024/wordml/sdtformatlock" xmlns:w16se="http://schemas.microsoft.com/office/word/2015/wordml/symex" xmlns:wpg="http://schemas.microsoft.com/office/word/2010/wordprocessingGroup" xmlns:wpi="http://schemas.microsoft.com/office/word/2010/wordprocessingInk" xmlns:wne="http://schemas.microsoft.com/office/word/2006/wordml" xmlns:wps="http://schemas.microsoft.com/office/word/2010/wordprocessingShape" mc:Ignorable="w14 w15 w16se w16cid w16 w16cex w16sdtdh w16sdtfl w16du wp14">
+<w:endnotes xmlns:wpc="http://schemas.microsoft.com/office/word/2010/wordprocessingCanvas" xmlns:cx="http://schemas.microsoft.com/office/drawing/2014/chartex" xmlns:cx1="http://schemas.microsoft.com/office/drawing/2015/9/8/chartex" xmlns:cx2="http://schemas.microsoft.com/office/drawing/2015/10/21/chartex" xmlns:cx3="http://schemas.microsoft.com/office/drawing/2016/5/9/chartex" xmlns:cx4="http://schemas.microsoft.com/office/drawing/2016/5/10/chartex" xmlns:cx5="http://schemas.microsoft.com/office/drawing/2016/5/11/chartex" xmlns:cx6="http://schemas.microsoft.com/office/drawing/2016/5/12/chartex" xmlns:cx7="http://schemas.microsoft.com/office/drawing/2016/5/13/chartex" xmlns:cx8="http://schemas.microsoft.com/office/drawing/2016/5/14/chartex" xmlns:mc="http://schemas.openxmlformats.org/markup-compatibility/2006" xmlns:aink="http://schemas.microsoft.com/office/drawing/2016/ink" xmlns:am3d="http://schemas.microsoft.com/office/drawing/2017/model3d" xmlns:o="urn:schemas-microsoft-com:office:office" xmlns:oel="http://schemas.microsoft.com/office/2019/extlst" xmlns:r="http://schemas.openxmlformats.org/officeDocument/2006/relationships" xmlns:m="http://schemas.openxmlformats.org/officeDocument/2006/math" xmlns:v="urn:schemas-microsoft-com:vml" xmlns:wp14="http://schemas.microsoft.com/office/word/2010/wordprocessingDrawing" xmlns:wp="http://schemas.openxmlformats.org/drawingml/2006/wordprocessingDrawing" xmlns:w10="urn:schemas-microsoft-com:office:word" xmlns:w="http://schemas.openxmlformats.org/wordprocessingml/2006/main" xmlns:w14="http://schemas.microsoft.com/office/word/2010/wordml" xmlns:w15="http://schemas.microsoft.com/office/word/2012/wordml" xmlns:w16cei="http://schemas.microsoft.com/office/word/2026/wordml/cei" xmlns:w16cex="http://schemas.microsoft.com/office/word/2018/wordml/cex" xmlns:w16cid="http://schemas.microsoft.com/office/word/2016/wordml/cid" xmlns:w16="http://schemas.microsoft.com/office/word/2018/wordml" xmlns:w16du="http://schemas.microsoft.com/office/word/2023/wordml/word16du" xmlns:w16sdtdh="http://schemas.microsoft.com/office/word/2020/wordml/sdtdatahash" xmlns:w16sdtfl="http://schemas.microsoft.com/office/word/2024/wordml/sdtformatlock" xmlns:w16se="http://schemas.microsoft.com/office/word/2015/wordml/symex" xmlns:wpg="http://schemas.microsoft.com/office/word/2010/wordprocessingGroup" xmlns:wpi="http://schemas.microsoft.com/office/word/2010/wordprocessingInk" xmlns:wne="http://schemas.microsoft.com/office/word/2006/wordml" xmlns:wps="http://schemas.microsoft.com/office/word/2010/wordprocessingShape" mc:Ignorable="w14 w15 w16se w16cid w16 w16cex w16sdtdh w16sdtfl w16du wp14">
   <w:endnote w:type="separator" w:id="-1">
     <w:p>
       <w:pPr>
@@ -7232,7 +8408,7 @@
 </file>
 
 <file path=word/footnotes.xml><?xml version="1.0" encoding="utf-8"?>
-<w:footnotes xmlns:wpc="http://schemas.microsoft.com/office/word/2010/wordprocessingCanvas" xmlns:cx="http://schemas.microsoft.com/office/drawing/2014/chartex" xmlns:cx1="http://schemas.microsoft.com/office/drawing/2015/9/8/chartex" xmlns:cx2="http://schemas.microsoft.com/office/drawing/2015/10/21/chartex" xmlns:cx3="http://schemas.microsoft.com/office/drawing/2016/5/9/chartex" xmlns:cx4="http://schemas.microsoft.com/office/drawing/2016/5/10/chartex" xmlns:cx5="http://schemas.microsoft.com/office/drawing/2016/5/11/chartex" xmlns:cx6="http://schemas.microsoft.com/office/drawing/2016/5/12/chartex" xmlns:cx7="http://schemas.microsoft.com/office/drawing/2016/5/13/chartex" xmlns:cx8="http://schemas.microsoft.com/office/drawing/2016/5/14/chartex" xmlns:mc="http://schemas.openxmlformats.org/markup-compatibility/2006" xmlns:aink="http://schemas.microsoft.com/office/drawing/2016/ink" xmlns:am3d="http://schemas.microsoft.com/office/drawing/2017/model3d" xmlns:o="urn:schemas-microsoft-com:office:office" xmlns:oel="http://schemas.microsoft.com/office/2019/extlst" xmlns:r="http://schemas.openxmlformats.org/officeDocument/2006/relationships" xmlns:m="http://schemas.openxmlformats.org/officeDocument/2006/math" xmlns:v="urn:schemas-microsoft-com:vml" xmlns:wp14="http://schemas.microsoft.com/office/word/2010/wordprocessingDrawing" xmlns:wp="http://schemas.openxmlformats.org/drawingml/2006/wordprocessingDrawing" xmlns:w10="urn:schemas-microsoft-com:office:word" xmlns:w="http://schemas.openxmlformats.org/wordprocessingml/2006/main" xmlns:w14="http://schemas.microsoft.com/office/word/2010/wordml" xmlns:w15="http://schemas.microsoft.com/office/word/2012/wordml" xmlns:w16cex="http://schemas.microsoft.com/office/word/2018/wordml/cex" xmlns:w16cid="http://schemas.microsoft.com/office/word/2016/wordml/cid" xmlns:w16="http://schemas.microsoft.com/office/word/2018/wordml" xmlns:w16du="http://schemas.microsoft.com/office/word/2023/wordml/word16du" xmlns:w16sdtdh="http://schemas.microsoft.com/office/word/2020/wordml/sdtdatahash" xmlns:w16sdtfl="http://schemas.microsoft.com/office/word/2024/wordml/sdtformatlock" xmlns:w16se="http://schemas.microsoft.com/office/word/2015/wordml/symex" xmlns:wpg="http://schemas.microsoft.com/office/word/2010/wordprocessingGroup" xmlns:wpi="http://schemas.microsoft.com/office/word/2010/wordprocessingInk" xmlns:wne="http://schemas.microsoft.com/office/word/2006/wordml" xmlns:wps="http://schemas.microsoft.com/office/word/2010/wordprocessingShape" mc:Ignorable="w14 w15 w16se w16cid w16 w16cex w16sdtdh w16sdtfl w16du wp14">
+<w:footnotes xmlns:wpc="http://schemas.microsoft.com/office/word/2010/wordprocessingCanvas" xmlns:cx="http://schemas.microsoft.com/office/drawing/2014/chartex" xmlns:cx1="http://schemas.microsoft.com/office/drawing/2015/9/8/chartex" xmlns:cx2="http://schemas.microsoft.com/office/drawing/2015/10/21/chartex" xmlns:cx3="http://schemas.microsoft.com/office/drawing/2016/5/9/chartex" xmlns:cx4="http://schemas.microsoft.com/office/drawing/2016/5/10/chartex" xmlns:cx5="http://schemas.microsoft.com/office/drawing/2016/5/11/chartex" xmlns:cx6="http://schemas.microsoft.com/office/drawing/2016/5/12/chartex" xmlns:cx7="http://schemas.microsoft.com/office/drawing/2016/5/13/chartex" xmlns:cx8="http://schemas.microsoft.com/office/drawing/2016/5/14/chartex" xmlns:mc="http://schemas.openxmlformats.org/markup-compatibility/2006" xmlns:aink="http://schemas.microsoft.com/office/drawing/2016/ink" xmlns:am3d="http://schemas.microsoft.com/office/drawing/2017/model3d" xmlns:o="urn:schemas-microsoft-com:office:office" xmlns:oel="http://schemas.microsoft.com/office/2019/extlst" xmlns:r="http://schemas.openxmlformats.org/officeDocument/2006/relationships" xmlns:m="http://schemas.openxmlformats.org/officeDocument/2006/math" xmlns:v="urn:schemas-microsoft-com:vml" xmlns:wp14="http://schemas.microsoft.com/office/word/2010/wordprocessingDrawing" xmlns:wp="http://schemas.openxmlformats.org/drawingml/2006/wordprocessingDrawing" xmlns:w10="urn:schemas-microsoft-com:office:word" xmlns:w="http://schemas.openxmlformats.org/wordprocessingml/2006/main" xmlns:w14="http://schemas.microsoft.com/office/word/2010/wordml" xmlns:w15="http://schemas.microsoft.com/office/word/2012/wordml" xmlns:w16cei="http://schemas.microsoft.com/office/word/2026/wordml/cei" xmlns:w16cex="http://schemas.microsoft.com/office/word/2018/wordml/cex" xmlns:w16cid="http://schemas.microsoft.com/office/word/2016/wordml/cid" xmlns:w16="http://schemas.microsoft.com/office/word/2018/wordml" xmlns:w16du="http://schemas.microsoft.com/office/word/2023/wordml/word16du" xmlns:w16sdtdh="http://schemas.microsoft.com/office/word/2020/wordml/sdtdatahash" xmlns:w16sdtfl="http://schemas.microsoft.com/office/word/2024/wordml/sdtformatlock" xmlns:w16se="http://schemas.microsoft.com/office/word/2015/wordml/symex" xmlns:wpg="http://schemas.microsoft.com/office/word/2010/wordprocessingGroup" xmlns:wpi="http://schemas.microsoft.com/office/word/2010/wordprocessingInk" xmlns:wne="http://schemas.microsoft.com/office/word/2006/wordml" xmlns:wps="http://schemas.microsoft.com/office/word/2010/wordprocessingShape" mc:Ignorable="w14 w15 w16se w16cid w16 w16cex w16sdtdh w16sdtfl w16du wp14">
   <w:footnote w:type="separator" w:id="-1">
     <w:p>
       <w:pPr>
@@ -7257,7 +8433,7 @@
 </file>
 
 <file path=word/numbering.xml><?xml version="1.0" encoding="utf-8"?>
-<w:numbering xmlns:wpc="http://schemas.microsoft.com/office/word/2010/wordprocessingCanvas" xmlns:cx="http://schemas.microsoft.com/office/drawing/2014/chartex" xmlns:cx1="http://schemas.microsoft.com/office/drawing/2015/9/8/chartex" xmlns:cx2="http://schemas.microsoft.com/office/drawing/2015/10/21/chartex" xmlns:cx3="http://schemas.microsoft.com/office/drawing/2016/5/9/chartex" xmlns:cx4="http://schemas.microsoft.com/office/drawing/2016/5/10/chartex" xmlns:cx5="http://schemas.microsoft.com/office/drawing/2016/5/11/chartex" xmlns:cx6="http://schemas.microsoft.com/office/drawing/2016/5/12/chartex" xmlns:cx7="http://schemas.microsoft.com/office/drawing/2016/5/13/chartex" xmlns:cx8="http://schemas.microsoft.com/office/drawing/2016/5/14/chartex" xmlns:mc="http://schemas.openxmlformats.org/markup-compatibility/2006" xmlns:aink="http://schemas.microsoft.com/office/drawing/2016/ink" xmlns:am3d="http://schemas.microsoft.com/office/drawing/2017/model3d" xmlns:o="urn:schemas-microsoft-com:office:office" xmlns:oel="http://schemas.microsoft.com/office/2019/extlst" xmlns:r="http://schemas.openxmlformats.org/officeDocument/2006/relationships" xmlns:m="http://schemas.openxmlformats.org/officeDocument/2006/math" xmlns:v="urn:schemas-microsoft-com:vml" xmlns:wp14="http://schemas.microsoft.com/office/word/2010/wordprocessingDrawing" xmlns:wp="http://schemas.openxmlformats.org/drawingml/2006/wordprocessingDrawing" xmlns:w10="urn:schemas-microsoft-com:office:word" xmlns:w="http://schemas.openxmlformats.org/wordprocessingml/2006/main" xmlns:w14="http://schemas.microsoft.com/office/word/2010/wordml" xmlns:w15="http://schemas.microsoft.com/office/word/2012/wordml" xmlns:w16cex="http://schemas.microsoft.com/office/word/2018/wordml/cex" xmlns:w16cid="http://schemas.microsoft.com/office/word/2016/wordml/cid" xmlns:w16="http://schemas.microsoft.com/office/word/2018/wordml" xmlns:w16du="http://schemas.microsoft.com/office/word/2023/wordml/word16du" xmlns:w16sdtdh="http://schemas.microsoft.com/office/word/2020/wordml/sdtdatahash" xmlns:w16sdtfl="http://schemas.microsoft.com/office/word/2024/wordml/sdtformatlock" xmlns:w16se="http://schemas.microsoft.com/office/word/2015/wordml/symex" xmlns:wpg="http://schemas.microsoft.com/office/word/2010/wordprocessingGroup" xmlns:wpi="http://schemas.microsoft.com/office/word/2010/wordprocessingInk" xmlns:wne="http://schemas.microsoft.com/office/word/2006/wordml" xmlns:wps="http://schemas.microsoft.com/office/word/2010/wordprocessingShape" mc:Ignorable="w14 w15 w16se w16cid w16 w16cex w16sdtdh w16sdtfl w16du wp14">
+<w:numbering xmlns:wpc="http://schemas.microsoft.com/office/word/2010/wordprocessingCanvas" xmlns:cx="http://schemas.microsoft.com/office/drawing/2014/chartex" xmlns:cx1="http://schemas.microsoft.com/office/drawing/2015/9/8/chartex" xmlns:cx2="http://schemas.microsoft.com/office/drawing/2015/10/21/chartex" xmlns:cx3="http://schemas.microsoft.com/office/drawing/2016/5/9/chartex" xmlns:cx4="http://schemas.microsoft.com/office/drawing/2016/5/10/chartex" xmlns:cx5="http://schemas.microsoft.com/office/drawing/2016/5/11/chartex" xmlns:cx6="http://schemas.microsoft.com/office/drawing/2016/5/12/chartex" xmlns:cx7="http://schemas.microsoft.com/office/drawing/2016/5/13/chartex" xmlns:cx8="http://schemas.microsoft.com/office/drawing/2016/5/14/chartex" xmlns:mc="http://schemas.openxmlformats.org/markup-compatibility/2006" xmlns:aink="http://schemas.microsoft.com/office/drawing/2016/ink" xmlns:am3d="http://schemas.microsoft.com/office/drawing/2017/model3d" xmlns:o="urn:schemas-microsoft-com:office:office" xmlns:oel="http://schemas.microsoft.com/office/2019/extlst" xmlns:r="http://schemas.openxmlformats.org/officeDocument/2006/relationships" xmlns:m="http://schemas.openxmlformats.org/officeDocument/2006/math" xmlns:v="urn:schemas-microsoft-com:vml" xmlns:wp14="http://schemas.microsoft.com/office/word/2010/wordprocessingDrawing" xmlns:wp="http://schemas.openxmlformats.org/drawingml/2006/wordprocessingDrawing" xmlns:w10="urn:schemas-microsoft-com:office:word" xmlns:w="http://schemas.openxmlformats.org/wordprocessingml/2006/main" xmlns:w14="http://schemas.microsoft.com/office/word/2010/wordml" xmlns:w15="http://schemas.microsoft.com/office/word/2012/wordml" xmlns:w16cei="http://schemas.microsoft.com/office/word/2026/wordml/cei" xmlns:w16cex="http://schemas.microsoft.com/office/word/2018/wordml/cex" xmlns:w16cid="http://schemas.microsoft.com/office/word/2016/wordml/cid" xmlns:w16="http://schemas.microsoft.com/office/word/2018/wordml" xmlns:w16du="http://schemas.microsoft.com/office/word/2023/wordml/word16du" xmlns:w16sdtdh="http://schemas.microsoft.com/office/word/2020/wordml/sdtdatahash" xmlns:w16sdtfl="http://schemas.microsoft.com/office/word/2024/wordml/sdtformatlock" xmlns:w16se="http://schemas.microsoft.com/office/word/2015/wordml/symex" xmlns:wpg="http://schemas.microsoft.com/office/word/2010/wordprocessingGroup" xmlns:wpi="http://schemas.microsoft.com/office/word/2010/wordprocessingInk" xmlns:wne="http://schemas.microsoft.com/office/word/2006/wordml" xmlns:wps="http://schemas.microsoft.com/office/word/2010/wordprocessingShape" mc:Ignorable="w14 w15 w16se w16cid w16 w16cex w16sdtdh w16sdtfl w16du wp14">
   <w:abstractNum w:abstractNumId="0" w15:restartNumberingAfterBreak="0">
     <w:nsid w:val="027E53C9"/>
     <w:multiLevelType w:val="multilevel"/>
@@ -7517,6 +8693,155 @@
     </w:lvl>
   </w:abstractNum>
   <w:abstractNum w:abstractNumId="2" w15:restartNumberingAfterBreak="0">
+    <w:nsid w:val="02AC335F"/>
+    <w:multiLevelType w:val="multilevel"/>
+    <w:tmpl w:val="F04C5E66"/>
+    <w:lvl w:ilvl="0">
+      <w:start w:val="1"/>
+      <w:numFmt w:val="bullet"/>
+      <w:lvlText w:val=""/>
+      <w:lvlJc w:val="left"/>
+      <w:pPr>
+        <w:tabs>
+          <w:tab w:val="num" w:pos="720"/>
+        </w:tabs>
+        <w:ind w:left="720" w:hanging="360"/>
+      </w:pPr>
+      <w:rPr>
+        <w:rFonts w:ascii="Symbol" w:hAnsi="Symbol" w:hint="default"/>
+        <w:sz w:val="20"/>
+      </w:rPr>
+    </w:lvl>
+    <w:lvl w:ilvl="1" w:tentative="1">
+      <w:start w:val="1"/>
+      <w:numFmt w:val="bullet"/>
+      <w:lvlText w:val="o"/>
+      <w:lvlJc w:val="left"/>
+      <w:pPr>
+        <w:tabs>
+          <w:tab w:val="num" w:pos="1440"/>
+        </w:tabs>
+        <w:ind w:left="1440" w:hanging="360"/>
+      </w:pPr>
+      <w:rPr>
+        <w:rFonts w:ascii="Courier New" w:hAnsi="Courier New" w:hint="default"/>
+        <w:sz w:val="20"/>
+      </w:rPr>
+    </w:lvl>
+    <w:lvl w:ilvl="2" w:tentative="1">
+      <w:start w:val="1"/>
+      <w:numFmt w:val="bullet"/>
+      <w:lvlText w:val=""/>
+      <w:lvlJc w:val="left"/>
+      <w:pPr>
+        <w:tabs>
+          <w:tab w:val="num" w:pos="2160"/>
+        </w:tabs>
+        <w:ind w:left="2160" w:hanging="360"/>
+      </w:pPr>
+      <w:rPr>
+        <w:rFonts w:ascii="Wingdings" w:hAnsi="Wingdings" w:hint="default"/>
+        <w:sz w:val="20"/>
+      </w:rPr>
+    </w:lvl>
+    <w:lvl w:ilvl="3" w:tentative="1">
+      <w:start w:val="1"/>
+      <w:numFmt w:val="bullet"/>
+      <w:lvlText w:val=""/>
+      <w:lvlJc w:val="left"/>
+      <w:pPr>
+        <w:tabs>
+          <w:tab w:val="num" w:pos="2880"/>
+        </w:tabs>
+        <w:ind w:left="2880" w:hanging="360"/>
+      </w:pPr>
+      <w:rPr>
+        <w:rFonts w:ascii="Wingdings" w:hAnsi="Wingdings" w:hint="default"/>
+        <w:sz w:val="20"/>
+      </w:rPr>
+    </w:lvl>
+    <w:lvl w:ilvl="4" w:tentative="1">
+      <w:start w:val="1"/>
+      <w:numFmt w:val="bullet"/>
+      <w:lvlText w:val=""/>
+      <w:lvlJc w:val="left"/>
+      <w:pPr>
+        <w:tabs>
+          <w:tab w:val="num" w:pos="3600"/>
+        </w:tabs>
+        <w:ind w:left="3600" w:hanging="360"/>
+      </w:pPr>
+      <w:rPr>
+        <w:rFonts w:ascii="Wingdings" w:hAnsi="Wingdings" w:hint="default"/>
+        <w:sz w:val="20"/>
+      </w:rPr>
+    </w:lvl>
+    <w:lvl w:ilvl="5" w:tentative="1">
+      <w:start w:val="1"/>
+      <w:numFmt w:val="bullet"/>
+      <w:lvlText w:val=""/>
+      <w:lvlJc w:val="left"/>
+      <w:pPr>
+        <w:tabs>
+          <w:tab w:val="num" w:pos="4320"/>
+        </w:tabs>
+        <w:ind w:left="4320" w:hanging="360"/>
+      </w:pPr>
+      <w:rPr>
+        <w:rFonts w:ascii="Wingdings" w:hAnsi="Wingdings" w:hint="default"/>
+        <w:sz w:val="20"/>
+      </w:rPr>
+    </w:lvl>
+    <w:lvl w:ilvl="6" w:tentative="1">
+      <w:start w:val="1"/>
+      <w:numFmt w:val="bullet"/>
+      <w:lvlText w:val=""/>
+      <w:lvlJc w:val="left"/>
+      <w:pPr>
+        <w:tabs>
+          <w:tab w:val="num" w:pos="5040"/>
+        </w:tabs>
+        <w:ind w:left="5040" w:hanging="360"/>
+      </w:pPr>
+      <w:rPr>
+        <w:rFonts w:ascii="Wingdings" w:hAnsi="Wingdings" w:hint="default"/>
+        <w:sz w:val="20"/>
+      </w:rPr>
+    </w:lvl>
+    <w:lvl w:ilvl="7" w:tentative="1">
+      <w:start w:val="1"/>
+      <w:numFmt w:val="bullet"/>
+      <w:lvlText w:val=""/>
+      <w:lvlJc w:val="left"/>
+      <w:pPr>
+        <w:tabs>
+          <w:tab w:val="num" w:pos="5760"/>
+        </w:tabs>
+        <w:ind w:left="5760" w:hanging="360"/>
+      </w:pPr>
+      <w:rPr>
+        <w:rFonts w:ascii="Wingdings" w:hAnsi="Wingdings" w:hint="default"/>
+        <w:sz w:val="20"/>
+      </w:rPr>
+    </w:lvl>
+    <w:lvl w:ilvl="8" w:tentative="1">
+      <w:start w:val="1"/>
+      <w:numFmt w:val="bullet"/>
+      <w:lvlText w:val=""/>
+      <w:lvlJc w:val="left"/>
+      <w:pPr>
+        <w:tabs>
+          <w:tab w:val="num" w:pos="6480"/>
+        </w:tabs>
+        <w:ind w:left="6480" w:hanging="360"/>
+      </w:pPr>
+      <w:rPr>
+        <w:rFonts w:ascii="Wingdings" w:hAnsi="Wingdings" w:hint="default"/>
+        <w:sz w:val="20"/>
+      </w:rPr>
+    </w:lvl>
+  </w:abstractNum>
+  <w:abstractNum w:abstractNumId="3" w15:restartNumberingAfterBreak="0">
     <w:nsid w:val="052D4227"/>
     <w:multiLevelType w:val="hybridMultilevel"/>
     <w:tmpl w:val="4C0A9724"/>
@@ -7629,7 +8954,7 @@
       </w:rPr>
     </w:lvl>
   </w:abstractNum>
-  <w:abstractNum w:abstractNumId="3" w15:restartNumberingAfterBreak="0">
+  <w:abstractNum w:abstractNumId="4" w15:restartNumberingAfterBreak="0">
     <w:nsid w:val="0A4E029B"/>
     <w:multiLevelType w:val="hybridMultilevel"/>
     <w:tmpl w:val="5DD40DE2"/>
@@ -7742,7 +9067,7 @@
       </w:rPr>
     </w:lvl>
   </w:abstractNum>
-  <w:abstractNum w:abstractNumId="4" w15:restartNumberingAfterBreak="0">
+  <w:abstractNum w:abstractNumId="5" w15:restartNumberingAfterBreak="0">
     <w:nsid w:val="0BF55E6C"/>
     <w:multiLevelType w:val="multilevel"/>
     <w:tmpl w:val="4BE4EA28"/>
@@ -7891,7 +9216,7 @@
       </w:rPr>
     </w:lvl>
   </w:abstractNum>
-  <w:abstractNum w:abstractNumId="5" w15:restartNumberingAfterBreak="0">
+  <w:abstractNum w:abstractNumId="6" w15:restartNumberingAfterBreak="0">
     <w:nsid w:val="0E230B85"/>
     <w:multiLevelType w:val="multilevel"/>
     <w:tmpl w:val="D8781B3A"/>
@@ -8007,7 +9332,156 @@
       </w:pPr>
     </w:lvl>
   </w:abstractNum>
-  <w:abstractNum w:abstractNumId="6" w15:restartNumberingAfterBreak="0">
+  <w:abstractNum w:abstractNumId="7" w15:restartNumberingAfterBreak="0">
+    <w:nsid w:val="14275D83"/>
+    <w:multiLevelType w:val="multilevel"/>
+    <w:tmpl w:val="72242AEA"/>
+    <w:lvl w:ilvl="0">
+      <w:start w:val="1"/>
+      <w:numFmt w:val="bullet"/>
+      <w:lvlText w:val=""/>
+      <w:lvlJc w:val="left"/>
+      <w:pPr>
+        <w:tabs>
+          <w:tab w:val="num" w:pos="720"/>
+        </w:tabs>
+        <w:ind w:left="720" w:hanging="360"/>
+      </w:pPr>
+      <w:rPr>
+        <w:rFonts w:ascii="Symbol" w:hAnsi="Symbol" w:hint="default"/>
+        <w:sz w:val="20"/>
+      </w:rPr>
+    </w:lvl>
+    <w:lvl w:ilvl="1" w:tentative="1">
+      <w:start w:val="1"/>
+      <w:numFmt w:val="bullet"/>
+      <w:lvlText w:val="o"/>
+      <w:lvlJc w:val="left"/>
+      <w:pPr>
+        <w:tabs>
+          <w:tab w:val="num" w:pos="1440"/>
+        </w:tabs>
+        <w:ind w:left="1440" w:hanging="360"/>
+      </w:pPr>
+      <w:rPr>
+        <w:rFonts w:ascii="Courier New" w:hAnsi="Courier New" w:hint="default"/>
+        <w:sz w:val="20"/>
+      </w:rPr>
+    </w:lvl>
+    <w:lvl w:ilvl="2" w:tentative="1">
+      <w:start w:val="1"/>
+      <w:numFmt w:val="bullet"/>
+      <w:lvlText w:val=""/>
+      <w:lvlJc w:val="left"/>
+      <w:pPr>
+        <w:tabs>
+          <w:tab w:val="num" w:pos="2160"/>
+        </w:tabs>
+        <w:ind w:left="2160" w:hanging="360"/>
+      </w:pPr>
+      <w:rPr>
+        <w:rFonts w:ascii="Wingdings" w:hAnsi="Wingdings" w:hint="default"/>
+        <w:sz w:val="20"/>
+      </w:rPr>
+    </w:lvl>
+    <w:lvl w:ilvl="3" w:tentative="1">
+      <w:start w:val="1"/>
+      <w:numFmt w:val="bullet"/>
+      <w:lvlText w:val=""/>
+      <w:lvlJc w:val="left"/>
+      <w:pPr>
+        <w:tabs>
+          <w:tab w:val="num" w:pos="2880"/>
+        </w:tabs>
+        <w:ind w:left="2880" w:hanging="360"/>
+      </w:pPr>
+      <w:rPr>
+        <w:rFonts w:ascii="Wingdings" w:hAnsi="Wingdings" w:hint="default"/>
+        <w:sz w:val="20"/>
+      </w:rPr>
+    </w:lvl>
+    <w:lvl w:ilvl="4" w:tentative="1">
+      <w:start w:val="1"/>
+      <w:numFmt w:val="bullet"/>
+      <w:lvlText w:val=""/>
+      <w:lvlJc w:val="left"/>
+      <w:pPr>
+        <w:tabs>
+          <w:tab w:val="num" w:pos="3600"/>
+        </w:tabs>
+        <w:ind w:left="3600" w:hanging="360"/>
+      </w:pPr>
+      <w:rPr>
+        <w:rFonts w:ascii="Wingdings" w:hAnsi="Wingdings" w:hint="default"/>
+        <w:sz w:val="20"/>
+      </w:rPr>
+    </w:lvl>
+    <w:lvl w:ilvl="5" w:tentative="1">
+      <w:start w:val="1"/>
+      <w:numFmt w:val="bullet"/>
+      <w:lvlText w:val=""/>
+      <w:lvlJc w:val="left"/>
+      <w:pPr>
+        <w:tabs>
+          <w:tab w:val="num" w:pos="4320"/>
+        </w:tabs>
+        <w:ind w:left="4320" w:hanging="360"/>
+      </w:pPr>
+      <w:rPr>
+        <w:rFonts w:ascii="Wingdings" w:hAnsi="Wingdings" w:hint="default"/>
+        <w:sz w:val="20"/>
+      </w:rPr>
+    </w:lvl>
+    <w:lvl w:ilvl="6" w:tentative="1">
+      <w:start w:val="1"/>
+      <w:numFmt w:val="bullet"/>
+      <w:lvlText w:val=""/>
+      <w:lvlJc w:val="left"/>
+      <w:pPr>
+        <w:tabs>
+          <w:tab w:val="num" w:pos="5040"/>
+        </w:tabs>
+        <w:ind w:left="5040" w:hanging="360"/>
+      </w:pPr>
+      <w:rPr>
+        <w:rFonts w:ascii="Wingdings" w:hAnsi="Wingdings" w:hint="default"/>
+        <w:sz w:val="20"/>
+      </w:rPr>
+    </w:lvl>
+    <w:lvl w:ilvl="7" w:tentative="1">
+      <w:start w:val="1"/>
+      <w:numFmt w:val="bullet"/>
+      <w:lvlText w:val=""/>
+      <w:lvlJc w:val="left"/>
+      <w:pPr>
+        <w:tabs>
+          <w:tab w:val="num" w:pos="5760"/>
+        </w:tabs>
+        <w:ind w:left="5760" w:hanging="360"/>
+      </w:pPr>
+      <w:rPr>
+        <w:rFonts w:ascii="Wingdings" w:hAnsi="Wingdings" w:hint="default"/>
+        <w:sz w:val="20"/>
+      </w:rPr>
+    </w:lvl>
+    <w:lvl w:ilvl="8" w:tentative="1">
+      <w:start w:val="1"/>
+      <w:numFmt w:val="bullet"/>
+      <w:lvlText w:val=""/>
+      <w:lvlJc w:val="left"/>
+      <w:pPr>
+        <w:tabs>
+          <w:tab w:val="num" w:pos="6480"/>
+        </w:tabs>
+        <w:ind w:left="6480" w:hanging="360"/>
+      </w:pPr>
+      <w:rPr>
+        <w:rFonts w:ascii="Wingdings" w:hAnsi="Wingdings" w:hint="default"/>
+        <w:sz w:val="20"/>
+      </w:rPr>
+    </w:lvl>
+  </w:abstractNum>
+  <w:abstractNum w:abstractNumId="8" w15:restartNumberingAfterBreak="0">
     <w:nsid w:val="17234A86"/>
     <w:multiLevelType w:val="multilevel"/>
     <w:tmpl w:val="5B646C72"/>
@@ -8120,7 +9594,7 @@
       </w:pPr>
     </w:lvl>
   </w:abstractNum>
-  <w:abstractNum w:abstractNumId="7" w15:restartNumberingAfterBreak="0">
+  <w:abstractNum w:abstractNumId="9" w15:restartNumberingAfterBreak="0">
     <w:nsid w:val="193E1CAD"/>
     <w:multiLevelType w:val="hybridMultilevel"/>
     <w:tmpl w:val="C0E46778"/>
@@ -8233,7 +9707,7 @@
       </w:rPr>
     </w:lvl>
   </w:abstractNum>
-  <w:abstractNum w:abstractNumId="8" w15:restartNumberingAfterBreak="0">
+  <w:abstractNum w:abstractNumId="10" w15:restartNumberingAfterBreak="0">
     <w:nsid w:val="195916DD"/>
     <w:multiLevelType w:val="hybridMultilevel"/>
     <w:tmpl w:val="C8B6799C"/>
@@ -8346,7 +9820,7 @@
       </w:rPr>
     </w:lvl>
   </w:abstractNum>
-  <w:abstractNum w:abstractNumId="9" w15:restartNumberingAfterBreak="0">
+  <w:abstractNum w:abstractNumId="11" w15:restartNumberingAfterBreak="0">
     <w:nsid w:val="1C6C1B75"/>
     <w:multiLevelType w:val="hybridMultilevel"/>
     <w:tmpl w:val="1BF616D4"/>
@@ -8459,7 +9933,7 @@
       </w:rPr>
     </w:lvl>
   </w:abstractNum>
-  <w:abstractNum w:abstractNumId="10" w15:restartNumberingAfterBreak="0">
+  <w:abstractNum w:abstractNumId="12" w15:restartNumberingAfterBreak="0">
     <w:nsid w:val="1F9B33F4"/>
     <w:multiLevelType w:val="hybridMultilevel"/>
     <w:tmpl w:val="ACA6E528"/>
@@ -8572,7 +10046,7 @@
       </w:rPr>
     </w:lvl>
   </w:abstractNum>
-  <w:abstractNum w:abstractNumId="11" w15:restartNumberingAfterBreak="0">
+  <w:abstractNum w:abstractNumId="13" w15:restartNumberingAfterBreak="0">
     <w:nsid w:val="26BF3407"/>
     <w:multiLevelType w:val="hybridMultilevel"/>
     <w:tmpl w:val="A7B8F0CE"/>
@@ -8685,7 +10159,7 @@
       </w:rPr>
     </w:lvl>
   </w:abstractNum>
-  <w:abstractNum w:abstractNumId="12" w15:restartNumberingAfterBreak="0">
+  <w:abstractNum w:abstractNumId="14" w15:restartNumberingAfterBreak="0">
     <w:nsid w:val="2A20550C"/>
     <w:multiLevelType w:val="multilevel"/>
     <w:tmpl w:val="82AC9A32"/>
@@ -8798,7 +10272,7 @@
       </w:pPr>
     </w:lvl>
   </w:abstractNum>
-  <w:abstractNum w:abstractNumId="13" w15:restartNumberingAfterBreak="0">
+  <w:abstractNum w:abstractNumId="15" w15:restartNumberingAfterBreak="0">
     <w:nsid w:val="2B1A3707"/>
     <w:multiLevelType w:val="multilevel"/>
     <w:tmpl w:val="9CF2722E"/>
@@ -8943,7 +10417,7 @@
       </w:rPr>
     </w:lvl>
   </w:abstractNum>
-  <w:abstractNum w:abstractNumId="14" w15:restartNumberingAfterBreak="0">
+  <w:abstractNum w:abstractNumId="16" w15:restartNumberingAfterBreak="0">
     <w:nsid w:val="2BA74DE2"/>
     <w:multiLevelType w:val="multilevel"/>
     <w:tmpl w:val="410E3C84"/>
@@ -9092,7 +10566,7 @@
       </w:rPr>
     </w:lvl>
   </w:abstractNum>
-  <w:abstractNum w:abstractNumId="15" w15:restartNumberingAfterBreak="0">
+  <w:abstractNum w:abstractNumId="17" w15:restartNumberingAfterBreak="0">
     <w:nsid w:val="2CEC031E"/>
     <w:multiLevelType w:val="multilevel"/>
     <w:tmpl w:val="9CFE6DA0"/>
@@ -9237,7 +10711,156 @@
       </w:rPr>
     </w:lvl>
   </w:abstractNum>
-  <w:abstractNum w:abstractNumId="16" w15:restartNumberingAfterBreak="0">
+  <w:abstractNum w:abstractNumId="18" w15:restartNumberingAfterBreak="0">
+    <w:nsid w:val="32C86476"/>
+    <w:multiLevelType w:val="multilevel"/>
+    <w:tmpl w:val="8A6CB6EE"/>
+    <w:lvl w:ilvl="0">
+      <w:start w:val="1"/>
+      <w:numFmt w:val="bullet"/>
+      <w:lvlText w:val=""/>
+      <w:lvlJc w:val="left"/>
+      <w:pPr>
+        <w:tabs>
+          <w:tab w:val="num" w:pos="720"/>
+        </w:tabs>
+        <w:ind w:left="720" w:hanging="360"/>
+      </w:pPr>
+      <w:rPr>
+        <w:rFonts w:ascii="Symbol" w:hAnsi="Symbol" w:hint="default"/>
+        <w:sz w:val="20"/>
+      </w:rPr>
+    </w:lvl>
+    <w:lvl w:ilvl="1" w:tentative="1">
+      <w:start w:val="1"/>
+      <w:numFmt w:val="bullet"/>
+      <w:lvlText w:val="o"/>
+      <w:lvlJc w:val="left"/>
+      <w:pPr>
+        <w:tabs>
+          <w:tab w:val="num" w:pos="1440"/>
+        </w:tabs>
+        <w:ind w:left="1440" w:hanging="360"/>
+      </w:pPr>
+      <w:rPr>
+        <w:rFonts w:ascii="Courier New" w:hAnsi="Courier New" w:hint="default"/>
+        <w:sz w:val="20"/>
+      </w:rPr>
+    </w:lvl>
+    <w:lvl w:ilvl="2" w:tentative="1">
+      <w:start w:val="1"/>
+      <w:numFmt w:val="bullet"/>
+      <w:lvlText w:val=""/>
+      <w:lvlJc w:val="left"/>
+      <w:pPr>
+        <w:tabs>
+          <w:tab w:val="num" w:pos="2160"/>
+        </w:tabs>
+        <w:ind w:left="2160" w:hanging="360"/>
+      </w:pPr>
+      <w:rPr>
+        <w:rFonts w:ascii="Wingdings" w:hAnsi="Wingdings" w:hint="default"/>
+        <w:sz w:val="20"/>
+      </w:rPr>
+    </w:lvl>
+    <w:lvl w:ilvl="3" w:tentative="1">
+      <w:start w:val="1"/>
+      <w:numFmt w:val="bullet"/>
+      <w:lvlText w:val=""/>
+      <w:lvlJc w:val="left"/>
+      <w:pPr>
+        <w:tabs>
+          <w:tab w:val="num" w:pos="2880"/>
+        </w:tabs>
+        <w:ind w:left="2880" w:hanging="360"/>
+      </w:pPr>
+      <w:rPr>
+        <w:rFonts w:ascii="Wingdings" w:hAnsi="Wingdings" w:hint="default"/>
+        <w:sz w:val="20"/>
+      </w:rPr>
+    </w:lvl>
+    <w:lvl w:ilvl="4" w:tentative="1">
+      <w:start w:val="1"/>
+      <w:numFmt w:val="bullet"/>
+      <w:lvlText w:val=""/>
+      <w:lvlJc w:val="left"/>
+      <w:pPr>
+        <w:tabs>
+          <w:tab w:val="num" w:pos="3600"/>
+        </w:tabs>
+        <w:ind w:left="3600" w:hanging="360"/>
+      </w:pPr>
+      <w:rPr>
+        <w:rFonts w:ascii="Wingdings" w:hAnsi="Wingdings" w:hint="default"/>
+        <w:sz w:val="20"/>
+      </w:rPr>
+    </w:lvl>
+    <w:lvl w:ilvl="5" w:tentative="1">
+      <w:start w:val="1"/>
+      <w:numFmt w:val="bullet"/>
+      <w:lvlText w:val=""/>
+      <w:lvlJc w:val="left"/>
+      <w:pPr>
+        <w:tabs>
+          <w:tab w:val="num" w:pos="4320"/>
+        </w:tabs>
+        <w:ind w:left="4320" w:hanging="360"/>
+      </w:pPr>
+      <w:rPr>
+        <w:rFonts w:ascii="Wingdings" w:hAnsi="Wingdings" w:hint="default"/>
+        <w:sz w:val="20"/>
+      </w:rPr>
+    </w:lvl>
+    <w:lvl w:ilvl="6" w:tentative="1">
+      <w:start w:val="1"/>
+      <w:numFmt w:val="bullet"/>
+      <w:lvlText w:val=""/>
+      <w:lvlJc w:val="left"/>
+      <w:pPr>
+        <w:tabs>
+          <w:tab w:val="num" w:pos="5040"/>
+        </w:tabs>
+        <w:ind w:left="5040" w:hanging="360"/>
+      </w:pPr>
+      <w:rPr>
+        <w:rFonts w:ascii="Wingdings" w:hAnsi="Wingdings" w:hint="default"/>
+        <w:sz w:val="20"/>
+      </w:rPr>
+    </w:lvl>
+    <w:lvl w:ilvl="7" w:tentative="1">
+      <w:start w:val="1"/>
+      <w:numFmt w:val="bullet"/>
+      <w:lvlText w:val=""/>
+      <w:lvlJc w:val="left"/>
+      <w:pPr>
+        <w:tabs>
+          <w:tab w:val="num" w:pos="5760"/>
+        </w:tabs>
+        <w:ind w:left="5760" w:hanging="360"/>
+      </w:pPr>
+      <w:rPr>
+        <w:rFonts w:ascii="Wingdings" w:hAnsi="Wingdings" w:hint="default"/>
+        <w:sz w:val="20"/>
+      </w:rPr>
+    </w:lvl>
+    <w:lvl w:ilvl="8" w:tentative="1">
+      <w:start w:val="1"/>
+      <w:numFmt w:val="bullet"/>
+      <w:lvlText w:val=""/>
+      <w:lvlJc w:val="left"/>
+      <w:pPr>
+        <w:tabs>
+          <w:tab w:val="num" w:pos="6480"/>
+        </w:tabs>
+        <w:ind w:left="6480" w:hanging="360"/>
+      </w:pPr>
+      <w:rPr>
+        <w:rFonts w:ascii="Wingdings" w:hAnsi="Wingdings" w:hint="default"/>
+        <w:sz w:val="20"/>
+      </w:rPr>
+    </w:lvl>
+  </w:abstractNum>
+  <w:abstractNum w:abstractNumId="19" w15:restartNumberingAfterBreak="0">
     <w:nsid w:val="35F369BD"/>
     <w:multiLevelType w:val="hybridMultilevel"/>
     <w:tmpl w:val="93B63F36"/>
@@ -9350,7 +10973,7 @@
       </w:rPr>
     </w:lvl>
   </w:abstractNum>
-  <w:abstractNum w:abstractNumId="17" w15:restartNumberingAfterBreak="0">
+  <w:abstractNum w:abstractNumId="20" w15:restartNumberingAfterBreak="0">
     <w:nsid w:val="38F607C7"/>
     <w:multiLevelType w:val="hybridMultilevel"/>
     <w:tmpl w:val="339E94D0"/>
@@ -9463,7 +11086,7 @@
       </w:rPr>
     </w:lvl>
   </w:abstractNum>
-  <w:abstractNum w:abstractNumId="18" w15:restartNumberingAfterBreak="0">
+  <w:abstractNum w:abstractNumId="21" w15:restartNumberingAfterBreak="0">
     <w:nsid w:val="44F36DEC"/>
     <w:multiLevelType w:val="multilevel"/>
     <w:tmpl w:val="923EE678"/>
@@ -9576,7 +11199,7 @@
       </w:pPr>
     </w:lvl>
   </w:abstractNum>
-  <w:abstractNum w:abstractNumId="19" w15:restartNumberingAfterBreak="0">
+  <w:abstractNum w:abstractNumId="22" w15:restartNumberingAfterBreak="0">
     <w:nsid w:val="47415AED"/>
     <w:multiLevelType w:val="multilevel"/>
     <w:tmpl w:val="0EAEA3E4"/>
@@ -9689,7 +11312,156 @@
       </w:pPr>
     </w:lvl>
   </w:abstractNum>
-  <w:abstractNum w:abstractNumId="20" w15:restartNumberingAfterBreak="0">
+  <w:abstractNum w:abstractNumId="23" w15:restartNumberingAfterBreak="0">
+    <w:nsid w:val="49C01F61"/>
+    <w:multiLevelType w:val="multilevel"/>
+    <w:tmpl w:val="040EFBDE"/>
+    <w:lvl w:ilvl="0">
+      <w:start w:val="1"/>
+      <w:numFmt w:val="bullet"/>
+      <w:lvlText w:val=""/>
+      <w:lvlJc w:val="left"/>
+      <w:pPr>
+        <w:tabs>
+          <w:tab w:val="num" w:pos="720"/>
+        </w:tabs>
+        <w:ind w:left="720" w:hanging="360"/>
+      </w:pPr>
+      <w:rPr>
+        <w:rFonts w:ascii="Symbol" w:hAnsi="Symbol" w:hint="default"/>
+        <w:sz w:val="20"/>
+      </w:rPr>
+    </w:lvl>
+    <w:lvl w:ilvl="1" w:tentative="1">
+      <w:start w:val="1"/>
+      <w:numFmt w:val="bullet"/>
+      <w:lvlText w:val="o"/>
+      <w:lvlJc w:val="left"/>
+      <w:pPr>
+        <w:tabs>
+          <w:tab w:val="num" w:pos="1440"/>
+        </w:tabs>
+        <w:ind w:left="1440" w:hanging="360"/>
+      </w:pPr>
+      <w:rPr>
+        <w:rFonts w:ascii="Courier New" w:hAnsi="Courier New" w:hint="default"/>
+        <w:sz w:val="20"/>
+      </w:rPr>
+    </w:lvl>
+    <w:lvl w:ilvl="2" w:tentative="1">
+      <w:start w:val="1"/>
+      <w:numFmt w:val="bullet"/>
+      <w:lvlText w:val=""/>
+      <w:lvlJc w:val="left"/>
+      <w:pPr>
+        <w:tabs>
+          <w:tab w:val="num" w:pos="2160"/>
+        </w:tabs>
+        <w:ind w:left="2160" w:hanging="360"/>
+      </w:pPr>
+      <w:rPr>
+        <w:rFonts w:ascii="Wingdings" w:hAnsi="Wingdings" w:hint="default"/>
+        <w:sz w:val="20"/>
+      </w:rPr>
+    </w:lvl>
+    <w:lvl w:ilvl="3" w:tentative="1">
+      <w:start w:val="1"/>
+      <w:numFmt w:val="bullet"/>
+      <w:lvlText w:val=""/>
+      <w:lvlJc w:val="left"/>
+      <w:pPr>
+        <w:tabs>
+          <w:tab w:val="num" w:pos="2880"/>
+        </w:tabs>
+        <w:ind w:left="2880" w:hanging="360"/>
+      </w:pPr>
+      <w:rPr>
+        <w:rFonts w:ascii="Wingdings" w:hAnsi="Wingdings" w:hint="default"/>
+        <w:sz w:val="20"/>
+      </w:rPr>
+    </w:lvl>
+    <w:lvl w:ilvl="4" w:tentative="1">
+      <w:start w:val="1"/>
+      <w:numFmt w:val="bullet"/>
+      <w:lvlText w:val=""/>
+      <w:lvlJc w:val="left"/>
+      <w:pPr>
+        <w:tabs>
+          <w:tab w:val="num" w:pos="3600"/>
+        </w:tabs>
+        <w:ind w:left="3600" w:hanging="360"/>
+      </w:pPr>
+      <w:rPr>
+        <w:rFonts w:ascii="Wingdings" w:hAnsi="Wingdings" w:hint="default"/>
+        <w:sz w:val="20"/>
+      </w:rPr>
+    </w:lvl>
+    <w:lvl w:ilvl="5" w:tentative="1">
+      <w:start w:val="1"/>
+      <w:numFmt w:val="bullet"/>
+      <w:lvlText w:val=""/>
+      <w:lvlJc w:val="left"/>
+      <w:pPr>
+        <w:tabs>
+          <w:tab w:val="num" w:pos="4320"/>
+        </w:tabs>
+        <w:ind w:left="4320" w:hanging="360"/>
+      </w:pPr>
+      <w:rPr>
+        <w:rFonts w:ascii="Wingdings" w:hAnsi="Wingdings" w:hint="default"/>
+        <w:sz w:val="20"/>
+      </w:rPr>
+    </w:lvl>
+    <w:lvl w:ilvl="6" w:tentative="1">
+      <w:start w:val="1"/>
+      <w:numFmt w:val="bullet"/>
+      <w:lvlText w:val=""/>
+      <w:lvlJc w:val="left"/>
+      <w:pPr>
+        <w:tabs>
+          <w:tab w:val="num" w:pos="5040"/>
+        </w:tabs>
+        <w:ind w:left="5040" w:hanging="360"/>
+      </w:pPr>
+      <w:rPr>
+        <w:rFonts w:ascii="Wingdings" w:hAnsi="Wingdings" w:hint="default"/>
+        <w:sz w:val="20"/>
+      </w:rPr>
+    </w:lvl>
+    <w:lvl w:ilvl="7" w:tentative="1">
+      <w:start w:val="1"/>
+      <w:numFmt w:val="bullet"/>
+      <w:lvlText w:val=""/>
+      <w:lvlJc w:val="left"/>
+      <w:pPr>
+        <w:tabs>
+          <w:tab w:val="num" w:pos="5760"/>
+        </w:tabs>
+        <w:ind w:left="5760" w:hanging="360"/>
+      </w:pPr>
+      <w:rPr>
+        <w:rFonts w:ascii="Wingdings" w:hAnsi="Wingdings" w:hint="default"/>
+        <w:sz w:val="20"/>
+      </w:rPr>
+    </w:lvl>
+    <w:lvl w:ilvl="8" w:tentative="1">
+      <w:start w:val="1"/>
+      <w:numFmt w:val="bullet"/>
+      <w:lvlText w:val=""/>
+      <w:lvlJc w:val="left"/>
+      <w:pPr>
+        <w:tabs>
+          <w:tab w:val="num" w:pos="6480"/>
+        </w:tabs>
+        <w:ind w:left="6480" w:hanging="360"/>
+      </w:pPr>
+      <w:rPr>
+        <w:rFonts w:ascii="Wingdings" w:hAnsi="Wingdings" w:hint="default"/>
+        <w:sz w:val="20"/>
+      </w:rPr>
+    </w:lvl>
+  </w:abstractNum>
+  <w:abstractNum w:abstractNumId="24" w15:restartNumberingAfterBreak="0">
     <w:nsid w:val="4EED2B87"/>
     <w:multiLevelType w:val="hybridMultilevel"/>
     <w:tmpl w:val="5EEC0F3E"/>
@@ -9778,7 +11550,7 @@
       </w:pPr>
     </w:lvl>
   </w:abstractNum>
-  <w:abstractNum w:abstractNumId="21" w15:restartNumberingAfterBreak="0">
+  <w:abstractNum w:abstractNumId="25" w15:restartNumberingAfterBreak="0">
     <w:nsid w:val="50BB61B3"/>
     <w:multiLevelType w:val="multilevel"/>
     <w:tmpl w:val="C1FA40D0"/>
@@ -9891,7 +11663,7 @@
       </w:pPr>
     </w:lvl>
   </w:abstractNum>
-  <w:abstractNum w:abstractNumId="22" w15:restartNumberingAfterBreak="0">
+  <w:abstractNum w:abstractNumId="26" w15:restartNumberingAfterBreak="0">
     <w:nsid w:val="52925F10"/>
     <w:multiLevelType w:val="multilevel"/>
     <w:tmpl w:val="D8781B3A"/>
@@ -10007,7 +11779,120 @@
       </w:pPr>
     </w:lvl>
   </w:abstractNum>
-  <w:abstractNum w:abstractNumId="23" w15:restartNumberingAfterBreak="0">
+  <w:abstractNum w:abstractNumId="27" w15:restartNumberingAfterBreak="0">
+    <w:nsid w:val="620517BF"/>
+    <w:multiLevelType w:val="hybridMultilevel"/>
+    <w:tmpl w:val="978435A4"/>
+    <w:lvl w:ilvl="0" w:tplc="0415000F">
+      <w:start w:val="1"/>
+      <w:numFmt w:val="decimal"/>
+      <w:lvlText w:val="%1."/>
+      <w:lvlJc w:val="left"/>
+      <w:pPr>
+        <w:ind w:left="720" w:hanging="360"/>
+      </w:pPr>
+      <w:rPr>
+        <w:rFonts w:hint="default"/>
+      </w:rPr>
+    </w:lvl>
+    <w:lvl w:ilvl="1" w:tplc="04150003">
+      <w:start w:val="1"/>
+      <w:numFmt w:val="bullet"/>
+      <w:lvlText w:val="o"/>
+      <w:lvlJc w:val="left"/>
+      <w:pPr>
+        <w:ind w:left="1440" w:hanging="360"/>
+      </w:pPr>
+      <w:rPr>
+        <w:rFonts w:ascii="Courier New" w:hAnsi="Courier New" w:cs="Courier New" w:hint="default"/>
+      </w:rPr>
+    </w:lvl>
+    <w:lvl w:ilvl="2" w:tplc="04150005" w:tentative="1">
+      <w:start w:val="1"/>
+      <w:numFmt w:val="bullet"/>
+      <w:lvlText w:val=""/>
+      <w:lvlJc w:val="left"/>
+      <w:pPr>
+        <w:ind w:left="2160" w:hanging="360"/>
+      </w:pPr>
+      <w:rPr>
+        <w:rFonts w:ascii="Wingdings" w:hAnsi="Wingdings" w:hint="default"/>
+      </w:rPr>
+    </w:lvl>
+    <w:lvl w:ilvl="3" w:tplc="04150001" w:tentative="1">
+      <w:start w:val="1"/>
+      <w:numFmt w:val="bullet"/>
+      <w:lvlText w:val=""/>
+      <w:lvlJc w:val="left"/>
+      <w:pPr>
+        <w:ind w:left="2880" w:hanging="360"/>
+      </w:pPr>
+      <w:rPr>
+        <w:rFonts w:ascii="Symbol" w:hAnsi="Symbol" w:hint="default"/>
+      </w:rPr>
+    </w:lvl>
+    <w:lvl w:ilvl="4" w:tplc="04150003" w:tentative="1">
+      <w:start w:val="1"/>
+      <w:numFmt w:val="bullet"/>
+      <w:lvlText w:val="o"/>
+      <w:lvlJc w:val="left"/>
+      <w:pPr>
+        <w:ind w:left="3600" w:hanging="360"/>
+      </w:pPr>
+      <w:rPr>
+        <w:rFonts w:ascii="Courier New" w:hAnsi="Courier New" w:cs="Courier New" w:hint="default"/>
+      </w:rPr>
+    </w:lvl>
+    <w:lvl w:ilvl="5" w:tplc="04150005" w:tentative="1">
+      <w:start w:val="1"/>
+      <w:numFmt w:val="bullet"/>
+      <w:lvlText w:val=""/>
+      <w:lvlJc w:val="left"/>
+      <w:pPr>
+        <w:ind w:left="4320" w:hanging="360"/>
+      </w:pPr>
+      <w:rPr>
+        <w:rFonts w:ascii="Wingdings" w:hAnsi="Wingdings" w:hint="default"/>
+      </w:rPr>
+    </w:lvl>
+    <w:lvl w:ilvl="6" w:tplc="04150001" w:tentative="1">
+      <w:start w:val="1"/>
+      <w:numFmt w:val="bullet"/>
+      <w:lvlText w:val=""/>
+      <w:lvlJc w:val="left"/>
+      <w:pPr>
+        <w:ind w:left="5040" w:hanging="360"/>
+      </w:pPr>
+      <w:rPr>
+        <w:rFonts w:ascii="Symbol" w:hAnsi="Symbol" w:hint="default"/>
+      </w:rPr>
+    </w:lvl>
+    <w:lvl w:ilvl="7" w:tplc="04150003" w:tentative="1">
+      <w:start w:val="1"/>
+      <w:numFmt w:val="bullet"/>
+      <w:lvlText w:val="o"/>
+      <w:lvlJc w:val="left"/>
+      <w:pPr>
+        <w:ind w:left="5760" w:hanging="360"/>
+      </w:pPr>
+      <w:rPr>
+        <w:rFonts w:ascii="Courier New" w:hAnsi="Courier New" w:cs="Courier New" w:hint="default"/>
+      </w:rPr>
+    </w:lvl>
+    <w:lvl w:ilvl="8" w:tplc="04150005" w:tentative="1">
+      <w:start w:val="1"/>
+      <w:numFmt w:val="bullet"/>
+      <w:lvlText w:val=""/>
+      <w:lvlJc w:val="left"/>
+      <w:pPr>
+        <w:ind w:left="6480" w:hanging="360"/>
+      </w:pPr>
+      <w:rPr>
+        <w:rFonts w:ascii="Wingdings" w:hAnsi="Wingdings" w:hint="default"/>
+      </w:rPr>
+    </w:lvl>
+  </w:abstractNum>
+  <w:abstractNum w:abstractNumId="28" w15:restartNumberingAfterBreak="0">
     <w:nsid w:val="657212CB"/>
     <w:multiLevelType w:val="hybridMultilevel"/>
     <w:tmpl w:val="6DC6AD4C"/>
@@ -10120,7 +12005,7 @@
       </w:rPr>
     </w:lvl>
   </w:abstractNum>
-  <w:abstractNum w:abstractNumId="24" w15:restartNumberingAfterBreak="0">
+  <w:abstractNum w:abstractNumId="29" w15:restartNumberingAfterBreak="0">
     <w:nsid w:val="665929F8"/>
     <w:multiLevelType w:val="hybridMultilevel"/>
     <w:tmpl w:val="E9A87A78"/>
@@ -10233,7 +12118,7 @@
       </w:rPr>
     </w:lvl>
   </w:abstractNum>
-  <w:abstractNum w:abstractNumId="25" w15:restartNumberingAfterBreak="0">
+  <w:abstractNum w:abstractNumId="30" w15:restartNumberingAfterBreak="0">
     <w:nsid w:val="6BC06973"/>
     <w:multiLevelType w:val="multilevel"/>
     <w:tmpl w:val="82AC9A32"/>
@@ -10346,7 +12231,7 @@
       </w:pPr>
     </w:lvl>
   </w:abstractNum>
-  <w:abstractNum w:abstractNumId="26" w15:restartNumberingAfterBreak="0">
+  <w:abstractNum w:abstractNumId="31" w15:restartNumberingAfterBreak="0">
     <w:nsid w:val="70EC634F"/>
     <w:multiLevelType w:val="hybridMultilevel"/>
     <w:tmpl w:val="2636363C"/>
@@ -10459,7 +12344,156 @@
       </w:rPr>
     </w:lvl>
   </w:abstractNum>
-  <w:abstractNum w:abstractNumId="27" w15:restartNumberingAfterBreak="0">
+  <w:abstractNum w:abstractNumId="32" w15:restartNumberingAfterBreak="0">
+    <w:nsid w:val="70FC55A0"/>
+    <w:multiLevelType w:val="multilevel"/>
+    <w:tmpl w:val="2332C026"/>
+    <w:lvl w:ilvl="0">
+      <w:start w:val="1"/>
+      <w:numFmt w:val="bullet"/>
+      <w:lvlText w:val=""/>
+      <w:lvlJc w:val="left"/>
+      <w:pPr>
+        <w:tabs>
+          <w:tab w:val="num" w:pos="720"/>
+        </w:tabs>
+        <w:ind w:left="720" w:hanging="360"/>
+      </w:pPr>
+      <w:rPr>
+        <w:rFonts w:ascii="Symbol" w:hAnsi="Symbol" w:hint="default"/>
+        <w:sz w:val="20"/>
+      </w:rPr>
+    </w:lvl>
+    <w:lvl w:ilvl="1" w:tentative="1">
+      <w:start w:val="1"/>
+      <w:numFmt w:val="bullet"/>
+      <w:lvlText w:val="o"/>
+      <w:lvlJc w:val="left"/>
+      <w:pPr>
+        <w:tabs>
+          <w:tab w:val="num" w:pos="1440"/>
+        </w:tabs>
+        <w:ind w:left="1440" w:hanging="360"/>
+      </w:pPr>
+      <w:rPr>
+        <w:rFonts w:ascii="Courier New" w:hAnsi="Courier New" w:hint="default"/>
+        <w:sz w:val="20"/>
+      </w:rPr>
+    </w:lvl>
+    <w:lvl w:ilvl="2" w:tentative="1">
+      <w:start w:val="1"/>
+      <w:numFmt w:val="bullet"/>
+      <w:lvlText w:val=""/>
+      <w:lvlJc w:val="left"/>
+      <w:pPr>
+        <w:tabs>
+          <w:tab w:val="num" w:pos="2160"/>
+        </w:tabs>
+        <w:ind w:left="2160" w:hanging="360"/>
+      </w:pPr>
+      <w:rPr>
+        <w:rFonts w:ascii="Wingdings" w:hAnsi="Wingdings" w:hint="default"/>
+        <w:sz w:val="20"/>
+      </w:rPr>
+    </w:lvl>
+    <w:lvl w:ilvl="3" w:tentative="1">
+      <w:start w:val="1"/>
+      <w:numFmt w:val="bullet"/>
+      <w:lvlText w:val=""/>
+      <w:lvlJc w:val="left"/>
+      <w:pPr>
+        <w:tabs>
+          <w:tab w:val="num" w:pos="2880"/>
+        </w:tabs>
+        <w:ind w:left="2880" w:hanging="360"/>
+      </w:pPr>
+      <w:rPr>
+        <w:rFonts w:ascii="Wingdings" w:hAnsi="Wingdings" w:hint="default"/>
+        <w:sz w:val="20"/>
+      </w:rPr>
+    </w:lvl>
+    <w:lvl w:ilvl="4" w:tentative="1">
+      <w:start w:val="1"/>
+      <w:numFmt w:val="bullet"/>
+      <w:lvlText w:val=""/>
+      <w:lvlJc w:val="left"/>
+      <w:pPr>
+        <w:tabs>
+          <w:tab w:val="num" w:pos="3600"/>
+        </w:tabs>
+        <w:ind w:left="3600" w:hanging="360"/>
+      </w:pPr>
+      <w:rPr>
+        <w:rFonts w:ascii="Wingdings" w:hAnsi="Wingdings" w:hint="default"/>
+        <w:sz w:val="20"/>
+      </w:rPr>
+    </w:lvl>
+    <w:lvl w:ilvl="5" w:tentative="1">
+      <w:start w:val="1"/>
+      <w:numFmt w:val="bullet"/>
+      <w:lvlText w:val=""/>
+      <w:lvlJc w:val="left"/>
+      <w:pPr>
+        <w:tabs>
+          <w:tab w:val="num" w:pos="4320"/>
+        </w:tabs>
+        <w:ind w:left="4320" w:hanging="360"/>
+      </w:pPr>
+      <w:rPr>
+        <w:rFonts w:ascii="Wingdings" w:hAnsi="Wingdings" w:hint="default"/>
+        <w:sz w:val="20"/>
+      </w:rPr>
+    </w:lvl>
+    <w:lvl w:ilvl="6" w:tentative="1">
+      <w:start w:val="1"/>
+      <w:numFmt w:val="bullet"/>
+      <w:lvlText w:val=""/>
+      <w:lvlJc w:val="left"/>
+      <w:pPr>
+        <w:tabs>
+          <w:tab w:val="num" w:pos="5040"/>
+        </w:tabs>
+        <w:ind w:left="5040" w:hanging="360"/>
+      </w:pPr>
+      <w:rPr>
+        <w:rFonts w:ascii="Wingdings" w:hAnsi="Wingdings" w:hint="default"/>
+        <w:sz w:val="20"/>
+      </w:rPr>
+    </w:lvl>
+    <w:lvl w:ilvl="7" w:tentative="1">
+      <w:start w:val="1"/>
+      <w:numFmt w:val="bullet"/>
+      <w:lvlText w:val=""/>
+      <w:lvlJc w:val="left"/>
+      <w:pPr>
+        <w:tabs>
+          <w:tab w:val="num" w:pos="5760"/>
+        </w:tabs>
+        <w:ind w:left="5760" w:hanging="360"/>
+      </w:pPr>
+      <w:rPr>
+        <w:rFonts w:ascii="Wingdings" w:hAnsi="Wingdings" w:hint="default"/>
+        <w:sz w:val="20"/>
+      </w:rPr>
+    </w:lvl>
+    <w:lvl w:ilvl="8" w:tentative="1">
+      <w:start w:val="1"/>
+      <w:numFmt w:val="bullet"/>
+      <w:lvlText w:val=""/>
+      <w:lvlJc w:val="left"/>
+      <w:pPr>
+        <w:tabs>
+          <w:tab w:val="num" w:pos="6480"/>
+        </w:tabs>
+        <w:ind w:left="6480" w:hanging="360"/>
+      </w:pPr>
+      <w:rPr>
+        <w:rFonts w:ascii="Wingdings" w:hAnsi="Wingdings" w:hint="default"/>
+        <w:sz w:val="20"/>
+      </w:rPr>
+    </w:lvl>
+  </w:abstractNum>
+  <w:abstractNum w:abstractNumId="33" w15:restartNumberingAfterBreak="0">
     <w:nsid w:val="75080142"/>
     <w:multiLevelType w:val="hybridMultilevel"/>
     <w:tmpl w:val="03201D0A"/>
@@ -10572,7 +12606,7 @@
       </w:rPr>
     </w:lvl>
   </w:abstractNum>
-  <w:abstractNum w:abstractNumId="28" w15:restartNumberingAfterBreak="0">
+  <w:abstractNum w:abstractNumId="34" w15:restartNumberingAfterBreak="0">
     <w:nsid w:val="7707181B"/>
     <w:multiLevelType w:val="multilevel"/>
     <w:tmpl w:val="06F64F5A"/>
@@ -10721,7 +12755,7 @@
       </w:rPr>
     </w:lvl>
   </w:abstractNum>
-  <w:abstractNum w:abstractNumId="29" w15:restartNumberingAfterBreak="0">
+  <w:abstractNum w:abstractNumId="35" w15:restartNumberingAfterBreak="0">
     <w:nsid w:val="7893767E"/>
     <w:multiLevelType w:val="multilevel"/>
     <w:tmpl w:val="464079A8"/>
@@ -10838,7 +12872,7 @@
       </w:pPr>
     </w:lvl>
   </w:abstractNum>
-  <w:abstractNum w:abstractNumId="30" w15:restartNumberingAfterBreak="0">
+  <w:abstractNum w:abstractNumId="36" w15:restartNumberingAfterBreak="0">
     <w:nsid w:val="7D7F410D"/>
     <w:multiLevelType w:val="hybridMultilevel"/>
     <w:tmpl w:val="D032AE7E"/>
@@ -10928,97 +12962,115 @@
     </w:lvl>
   </w:abstractNum>
   <w:num w:numId="1" w16cid:durableId="1250192869">
+    <w:abstractNumId w:val="13"/>
+  </w:num>
+  <w:num w:numId="2" w16cid:durableId="1800950931">
+    <w:abstractNumId w:val="28"/>
+  </w:num>
+  <w:num w:numId="3" w16cid:durableId="2078354071">
     <w:abstractNumId w:val="11"/>
   </w:num>
-  <w:num w:numId="2" w16cid:durableId="1800950931">
-    <w:abstractNumId w:val="23"/>
+  <w:num w:numId="4" w16cid:durableId="2132360051">
+    <w:abstractNumId w:val="33"/>
   </w:num>
-  <w:num w:numId="3" w16cid:durableId="2078354071">
+  <w:num w:numId="5" w16cid:durableId="1771777657">
     <w:abstractNumId w:val="9"/>
   </w:num>
-  <w:num w:numId="4" w16cid:durableId="2132360051">
-    <w:abstractNumId w:val="27"/>
-  </w:num>
-  <w:num w:numId="5" w16cid:durableId="1771777657">
-    <w:abstractNumId w:val="7"/>
-  </w:num>
   <w:num w:numId="6" w16cid:durableId="1946379223">
-    <w:abstractNumId w:val="2"/>
+    <w:abstractNumId w:val="3"/>
   </w:num>
   <w:num w:numId="7" w16cid:durableId="1342275070">
+    <w:abstractNumId w:val="24"/>
+  </w:num>
+  <w:num w:numId="8" w16cid:durableId="657611001">
+    <w:abstractNumId w:val="4"/>
+  </w:num>
+  <w:num w:numId="9" w16cid:durableId="730152340">
+    <w:abstractNumId w:val="10"/>
+  </w:num>
+  <w:num w:numId="10" w16cid:durableId="67699396">
+    <w:abstractNumId w:val="19"/>
+  </w:num>
+  <w:num w:numId="11" w16cid:durableId="1496337358">
+    <w:abstractNumId w:val="29"/>
+  </w:num>
+  <w:num w:numId="12" w16cid:durableId="166792611">
+    <w:abstractNumId w:val="21"/>
+  </w:num>
+  <w:num w:numId="13" w16cid:durableId="2107995922">
     <w:abstractNumId w:val="20"/>
   </w:num>
-  <w:num w:numId="8" w16cid:durableId="657611001">
-    <w:abstractNumId w:val="3"/>
-  </w:num>
-  <w:num w:numId="9" w16cid:durableId="730152340">
-    <w:abstractNumId w:val="8"/>
-  </w:num>
-  <w:num w:numId="10" w16cid:durableId="67699396">
+  <w:num w:numId="14" w16cid:durableId="216362750">
     <w:abstractNumId w:val="16"/>
   </w:num>
-  <w:num w:numId="11" w16cid:durableId="1496337358">
-    <w:abstractNumId w:val="24"/>
-  </w:num>
-  <w:num w:numId="12" w16cid:durableId="166792611">
-    <w:abstractNumId w:val="18"/>
-  </w:num>
-  <w:num w:numId="13" w16cid:durableId="2107995922">
-    <w:abstractNumId w:val="17"/>
-  </w:num>
-  <w:num w:numId="14" w16cid:durableId="216362750">
-    <w:abstractNumId w:val="14"/>
-  </w:num>
   <w:num w:numId="15" w16cid:durableId="1582636275">
-    <w:abstractNumId w:val="21"/>
+    <w:abstractNumId w:val="25"/>
   </w:num>
   <w:num w:numId="16" w16cid:durableId="1227566640">
-    <w:abstractNumId w:val="4"/>
+    <w:abstractNumId w:val="5"/>
   </w:num>
   <w:num w:numId="17" w16cid:durableId="1552813241">
-    <w:abstractNumId w:val="29"/>
+    <w:abstractNumId w:val="35"/>
   </w:num>
   <w:num w:numId="18" w16cid:durableId="219904588">
-    <w:abstractNumId w:val="25"/>
+    <w:abstractNumId w:val="30"/>
   </w:num>
   <w:num w:numId="19" w16cid:durableId="1617567943">
     <w:abstractNumId w:val="0"/>
   </w:num>
   <w:num w:numId="20" w16cid:durableId="1866404704">
-    <w:abstractNumId w:val="13"/>
+    <w:abstractNumId w:val="15"/>
   </w:num>
   <w:num w:numId="21" w16cid:durableId="207687208">
-    <w:abstractNumId w:val="15"/>
+    <w:abstractNumId w:val="17"/>
   </w:num>
   <w:num w:numId="22" w16cid:durableId="1813136223">
-    <w:abstractNumId w:val="19"/>
+    <w:abstractNumId w:val="22"/>
   </w:num>
   <w:num w:numId="23" w16cid:durableId="547767323">
     <w:abstractNumId w:val="1"/>
   </w:num>
   <w:num w:numId="24" w16cid:durableId="2008896593">
-    <w:abstractNumId w:val="30"/>
+    <w:abstractNumId w:val="36"/>
   </w:num>
   <w:num w:numId="25" w16cid:durableId="1696423768">
+    <w:abstractNumId w:val="8"/>
+  </w:num>
+  <w:num w:numId="26" w16cid:durableId="1236470476">
+    <w:abstractNumId w:val="34"/>
+  </w:num>
+  <w:num w:numId="27" w16cid:durableId="1566255182">
+    <w:abstractNumId w:val="31"/>
+  </w:num>
+  <w:num w:numId="28" w16cid:durableId="998340106">
+    <w:abstractNumId w:val="12"/>
+  </w:num>
+  <w:num w:numId="29" w16cid:durableId="45683798">
+    <w:abstractNumId w:val="14"/>
+  </w:num>
+  <w:num w:numId="30" w16cid:durableId="436683933">
     <w:abstractNumId w:val="6"/>
   </w:num>
-  <w:num w:numId="26" w16cid:durableId="1236470476">
-    <w:abstractNumId w:val="28"/>
-  </w:num>
-  <w:num w:numId="27" w16cid:durableId="1566255182">
+  <w:num w:numId="31" w16cid:durableId="1170872106">
     <w:abstractNumId w:val="26"/>
   </w:num>
-  <w:num w:numId="28" w16cid:durableId="998340106">
-    <w:abstractNumId w:val="10"/>
+  <w:num w:numId="32" w16cid:durableId="622806843">
+    <w:abstractNumId w:val="27"/>
   </w:num>
-  <w:num w:numId="29" w16cid:durableId="45683798">
-    <w:abstractNumId w:val="12"/>
+  <w:num w:numId="33" w16cid:durableId="1510289887">
+    <w:abstractNumId w:val="7"/>
   </w:num>
-  <w:num w:numId="30" w16cid:durableId="436683933">
-    <w:abstractNumId w:val="5"/>
+  <w:num w:numId="34" w16cid:durableId="795756802">
+    <w:abstractNumId w:val="18"/>
   </w:num>
-  <w:num w:numId="31" w16cid:durableId="1170872106">
-    <w:abstractNumId w:val="22"/>
+  <w:num w:numId="35" w16cid:durableId="43718406">
+    <w:abstractNumId w:val="32"/>
+  </w:num>
+  <w:num w:numId="36" w16cid:durableId="18969510">
+    <w:abstractNumId w:val="2"/>
+  </w:num>
+  <w:num w:numId="37" w16cid:durableId="2083477610">
+    <w:abstractNumId w:val="23"/>
   </w:num>
 </w:numbering>
 </file>
@@ -11624,7 +13676,6 @@
   <w:style w:type="character" w:default="1" w:styleId="Domylnaczcionkaakapitu">
     <w:name w:val="Default Paragraph Font"/>
     <w:uiPriority w:val="1"/>
-    <w:semiHidden/>
     <w:unhideWhenUsed/>
   </w:style>
   <w:style w:type="table" w:default="1" w:styleId="Standardowy">
@@ -12138,6 +14189,60 @@
       <w:ind w:left="480"/>
     </w:pPr>
   </w:style>
+  <w:style w:type="paragraph" w:customStyle="1" w:styleId="z1qcye">
+    <w:name w:val="z1qcye"/>
+    <w:basedOn w:val="Normalny"/>
+    <w:rsid w:val="00212F38"/>
+    <w:pPr>
+      <w:spacing w:before="100" w:beforeAutospacing="1" w:after="100" w:afterAutospacing="1" w:line="240" w:lineRule="auto"/>
+    </w:pPr>
+    <w:rPr>
+      <w:rFonts w:ascii="Times New Roman" w:eastAsia="Times New Roman" w:hAnsi="Times New Roman" w:cs="Times New Roman"/>
+      <w:kern w:val="0"/>
+      <w:lang w:eastAsia="pl-PL"/>
+      <w14:ligatures w14:val="none"/>
+    </w:rPr>
+  </w:style>
+  <w:style w:type="character" w:customStyle="1" w:styleId="inqyif">
+    <w:name w:val="inqyif"/>
+    <w:basedOn w:val="Domylnaczcionkaakapitu"/>
+    <w:rsid w:val="00212F38"/>
+  </w:style>
+  <w:style w:type="character" w:styleId="Pogrubienie">
+    <w:name w:val="Strong"/>
+    <w:basedOn w:val="Domylnaczcionkaakapitu"/>
+    <w:uiPriority w:val="22"/>
+    <w:qFormat/>
+    <w:rsid w:val="00212F38"/>
+    <w:rPr>
+      <w:b/>
+      <w:bCs/>
+    </w:rPr>
+  </w:style>
+  <w:style w:type="character" w:styleId="Uwydatnienie">
+    <w:name w:val="Emphasis"/>
+    <w:basedOn w:val="Domylnaczcionkaakapitu"/>
+    <w:uiPriority w:val="20"/>
+    <w:qFormat/>
+    <w:rsid w:val="00212F38"/>
+    <w:rPr>
+      <w:i/>
+      <w:iCs/>
+    </w:rPr>
+  </w:style>
+  <w:style w:type="character" w:styleId="HTML-kod">
+    <w:name w:val="HTML Code"/>
+    <w:basedOn w:val="Domylnaczcionkaakapitu"/>
+    <w:uiPriority w:val="99"/>
+    <w:semiHidden/>
+    <w:unhideWhenUsed/>
+    <w:rsid w:val="00212F38"/>
+    <w:rPr>
+      <w:rFonts w:ascii="Courier New" w:eastAsia="Times New Roman" w:hAnsi="Courier New" w:cs="Courier New"/>
+      <w:sz w:val="20"/>
+      <w:szCs w:val="20"/>
+    </w:rPr>
+  </w:style>
 </w:styles>
 </file>
 

</xml_diff>